<commit_message>
MATH1201 exam prep: add the 15 real Graded Quiz 3 questions with explanations, standard-form trap
Co-Authored-By: Claude Opus 5.5 <noreply@anthropic.com>
</commit_message>
<xml_diff>
--- a/MATH1201_College_Algebra/Unit9_Final_Exam/Final_Exam_Study_Guide.docx
+++ b/MATH1201_College_Algebra/Unit9_Final_Exam/Final_Exam_Study_Guide.docx
@@ -557,6 +557,75 @@
           <w:sz w:val="24"/>
         </w:rPr>
         <w:t>Quadratic f(x) = ax² + bx + c: vertex x = -b/(2a); opens up if a &gt; 0 (minimum), down if a &lt; 0 (maximum). Vertex form a(x - h)² + k has vertex (h, k).</w:t>
+      </w:r>
+    </w:p>
+    <w:p>
+      <w:pPr>
+        <w:spacing w:line="360" w:lineRule="auto" w:after="0"/>
+        <w:ind w:left="720" w:hanging="360"/>
+      </w:pPr>
+      <w:r>
+        <w:rPr>
+          <w:rFonts w:ascii="Times New Roman" w:hAnsi="Times New Roman"/>
+          <w:b w:val="0"/>
+          <w:i w:val="0"/>
+          <w:sz w:val="24"/>
+        </w:rPr>
+        <w:t xml:space="preserve">•  </w:t>
+      </w:r>
+      <w:r>
+        <w:rPr>
+          <w:rFonts w:ascii="Times New Roman" w:hAnsi="Times New Roman"/>
+          <w:b/>
+          <w:i w:val="0"/>
+          <w:sz w:val="24"/>
+        </w:rPr>
+        <w:t>Names in our textbook:</w:t>
+      </w:r>
+      <w:r>
+        <w:rPr>
+          <w:rFonts w:ascii="Times New Roman" w:hAnsi="Times New Roman"/>
+          <w:b w:val="0"/>
+          <w:i w:val="0"/>
+          <w:sz w:val="24"/>
+        </w:rPr>
+        <w:t xml:space="preserve"> the </w:t>
+      </w:r>
+      <w:r>
+        <w:rPr>
+          <w:rFonts w:ascii="Times New Roman" w:hAnsi="Times New Roman"/>
+          <w:b/>
+          <w:i w:val="0"/>
+          <w:sz w:val="24"/>
+        </w:rPr>
+        <w:t>standard form</w:t>
+      </w:r>
+      <w:r>
+        <w:rPr>
+          <w:rFonts w:ascii="Times New Roman" w:hAnsi="Times New Roman"/>
+          <w:b w:val="0"/>
+          <w:i w:val="0"/>
+          <w:sz w:val="24"/>
+        </w:rPr>
+        <w:t xml:space="preserve"> of a quadratic function is a(x - h)² + k, and ax² + bx + c is the </w:t>
+      </w:r>
+      <w:r>
+        <w:rPr>
+          <w:rFonts w:ascii="Times New Roman" w:hAnsi="Times New Roman"/>
+          <w:b/>
+          <w:i w:val="0"/>
+          <w:sz w:val="24"/>
+        </w:rPr>
+        <w:t>general form</w:t>
+      </w:r>
+      <w:r>
+        <w:rPr>
+          <w:rFonts w:ascii="Times New Roman" w:hAnsi="Times New Roman"/>
+          <w:b w:val="0"/>
+          <w:i w:val="0"/>
+          <w:sz w:val="24"/>
+        </w:rPr>
+        <w:t xml:space="preserve"> (Abramson, Section 5.1). Graded Quiz 3 tested this.</w:t>
       </w:r>
     </w:p>
     <w:p>
@@ -3860,7 +3929,7 @@
           <w:color w:val="000000"/>
           <w:sz w:val="24"/>
         </w:rPr>
-        <w:t>Part 3: Practice Exam (48 Questions)</w:t>
+        <w:t>Part 3: Practice Exam (48 Questions) and Graded Quiz 3 Review</w:t>
       </w:r>
     </w:p>
     <w:p>
@@ -9711,6 +9780,1710 @@
     </w:p>
     <w:p>
       <w:pPr>
+        <w:pStyle w:val="Heading2"/>
+        <w:jc w:val="left"/>
+      </w:pPr>
+      <w:r>
+        <w:rPr>
+          <w:rFonts w:ascii="Times New Roman" w:hAnsi="Times New Roman"/>
+          <w:b/>
+          <w:color w:val="000000"/>
+          <w:sz w:val="24"/>
+        </w:rPr>
+        <w:t>Graded Quiz Unit 3 (real questions)</w:t>
+      </w:r>
+    </w:p>
+    <w:p>
+      <w:pPr>
+        <w:spacing w:line="360" w:lineRule="auto" w:after="200"/>
+      </w:pPr>
+      <w:r>
+        <w:rPr>
+          <w:rFonts w:ascii="Times New Roman" w:hAnsi="Times New Roman"/>
+          <w:b/>
+          <w:i w:val="0"/>
+          <w:sz w:val="24"/>
+        </w:rPr>
+        <w:t>49.</w:t>
+      </w:r>
+      <w:r>
+        <w:rPr>
+          <w:rFonts w:ascii="Times New Roman" w:hAnsi="Times New Roman"/>
+          <w:b w:val="0"/>
+          <w:i w:val="0"/>
+          <w:sz w:val="24"/>
+        </w:rPr>
+        <w:t xml:space="preserve"> If f(x) = 3x⁵ and g(x) = (x - 1)/x², what is g(f(x))?</w:t>
+      </w:r>
+    </w:p>
+    <w:p>
+      <w:pPr>
+        <w:spacing w:line="360" w:lineRule="auto" w:after="0"/>
+        <w:ind w:left="720" w:hanging="360"/>
+      </w:pPr>
+      <w:r>
+        <w:rPr>
+          <w:rFonts w:ascii="Times New Roman" w:hAnsi="Times New Roman"/>
+          <w:b w:val="0"/>
+          <w:i w:val="0"/>
+          <w:sz w:val="24"/>
+        </w:rPr>
+        <w:t xml:space="preserve">•  </w:t>
+      </w:r>
+      <w:r>
+        <w:rPr>
+          <w:rFonts w:ascii="Times New Roman" w:hAnsi="Times New Roman"/>
+          <w:b w:val="0"/>
+          <w:i w:val="0"/>
+          <w:sz w:val="24"/>
+        </w:rPr>
+        <w:t>A. (3x⁵ - 1)/(18x¹⁰)</w:t>
+      </w:r>
+    </w:p>
+    <w:p>
+      <w:pPr>
+        <w:spacing w:line="360" w:lineRule="auto" w:after="0"/>
+        <w:ind w:left="720" w:hanging="360"/>
+      </w:pPr>
+      <w:r>
+        <w:rPr>
+          <w:rFonts w:ascii="Times New Roman" w:hAnsi="Times New Roman"/>
+          <w:b w:val="0"/>
+          <w:i w:val="0"/>
+          <w:sz w:val="24"/>
+        </w:rPr>
+        <w:t xml:space="preserve">•  </w:t>
+      </w:r>
+      <w:r>
+        <w:rPr>
+          <w:rFonts w:ascii="Times New Roman" w:hAnsi="Times New Roman"/>
+          <w:b w:val="0"/>
+          <w:i w:val="0"/>
+          <w:sz w:val="24"/>
+        </w:rPr>
+        <w:t>B. (3x⁵ - 1)/(6x⁷)</w:t>
+      </w:r>
+    </w:p>
+    <w:p>
+      <w:pPr>
+        <w:spacing w:line="360" w:lineRule="auto" w:after="0"/>
+        <w:ind w:left="720" w:hanging="360"/>
+      </w:pPr>
+      <w:r>
+        <w:rPr>
+          <w:rFonts w:ascii="Times New Roman" w:hAnsi="Times New Roman"/>
+          <w:b w:val="0"/>
+          <w:i w:val="0"/>
+          <w:sz w:val="24"/>
+        </w:rPr>
+        <w:t xml:space="preserve">•  </w:t>
+      </w:r>
+      <w:r>
+        <w:rPr>
+          <w:rFonts w:ascii="Times New Roman" w:hAnsi="Times New Roman"/>
+          <w:b w:val="0"/>
+          <w:i w:val="0"/>
+          <w:sz w:val="24"/>
+        </w:rPr>
+        <w:t>C. (3x⁵ - 1)/(9x¹⁰)</w:t>
+      </w:r>
+    </w:p>
+    <w:p>
+      <w:pPr>
+        <w:spacing w:line="360" w:lineRule="auto" w:after="0"/>
+        <w:ind w:left="720" w:hanging="360"/>
+      </w:pPr>
+      <w:r>
+        <w:rPr>
+          <w:rFonts w:ascii="Times New Roman" w:hAnsi="Times New Roman"/>
+          <w:b w:val="0"/>
+          <w:i w:val="0"/>
+          <w:sz w:val="24"/>
+        </w:rPr>
+        <w:t xml:space="preserve">•  </w:t>
+      </w:r>
+      <w:r>
+        <w:rPr>
+          <w:rFonts w:ascii="Times New Roman" w:hAnsi="Times New Roman"/>
+          <w:b w:val="0"/>
+          <w:i w:val="0"/>
+          <w:sz w:val="24"/>
+        </w:rPr>
+        <w:t>D. (3x⁵ - 1)/(18x⁷)</w:t>
+      </w:r>
+    </w:p>
+    <w:p>
+      <w:pPr>
+        <w:spacing w:line="360" w:lineRule="auto" w:after="200"/>
+      </w:pPr>
+      <w:r>
+        <w:rPr>
+          <w:rFonts w:ascii="Times New Roman" w:hAnsi="Times New Roman"/>
+          <w:b/>
+          <w:i w:val="0"/>
+          <w:sz w:val="24"/>
+        </w:rPr>
+        <w:t>50.</w:t>
+      </w:r>
+      <w:r>
+        <w:rPr>
+          <w:rFonts w:ascii="Times New Roman" w:hAnsi="Times New Roman"/>
+          <w:b w:val="0"/>
+          <w:i w:val="0"/>
+          <w:sz w:val="24"/>
+        </w:rPr>
+        <w:t xml:space="preserve"> f(x) = √(x + 3). What is the range of the inverse function f⁻¹(x)?</w:t>
+      </w:r>
+    </w:p>
+    <w:p>
+      <w:pPr>
+        <w:spacing w:line="360" w:lineRule="auto" w:after="0"/>
+        <w:ind w:left="720" w:hanging="360"/>
+      </w:pPr>
+      <w:r>
+        <w:rPr>
+          <w:rFonts w:ascii="Times New Roman" w:hAnsi="Times New Roman"/>
+          <w:b w:val="0"/>
+          <w:i w:val="0"/>
+          <w:sz w:val="24"/>
+        </w:rPr>
+        <w:t xml:space="preserve">•  </w:t>
+      </w:r>
+      <w:r>
+        <w:rPr>
+          <w:rFonts w:ascii="Times New Roman" w:hAnsi="Times New Roman"/>
+          <w:b w:val="0"/>
+          <w:i w:val="0"/>
+          <w:sz w:val="24"/>
+        </w:rPr>
+        <w:t>A. (-∞, -3]</w:t>
+      </w:r>
+    </w:p>
+    <w:p>
+      <w:pPr>
+        <w:spacing w:line="360" w:lineRule="auto" w:after="0"/>
+        <w:ind w:left="720" w:hanging="360"/>
+      </w:pPr>
+      <w:r>
+        <w:rPr>
+          <w:rFonts w:ascii="Times New Roman" w:hAnsi="Times New Roman"/>
+          <w:b w:val="0"/>
+          <w:i w:val="0"/>
+          <w:sz w:val="24"/>
+        </w:rPr>
+        <w:t xml:space="preserve">•  </w:t>
+      </w:r>
+      <w:r>
+        <w:rPr>
+          <w:rFonts w:ascii="Times New Roman" w:hAnsi="Times New Roman"/>
+          <w:b w:val="0"/>
+          <w:i w:val="0"/>
+          <w:sz w:val="24"/>
+        </w:rPr>
+        <w:t>B. ℝ (all real numbers)</w:t>
+      </w:r>
+    </w:p>
+    <w:p>
+      <w:pPr>
+        <w:spacing w:line="360" w:lineRule="auto" w:after="0"/>
+        <w:ind w:left="720" w:hanging="360"/>
+      </w:pPr>
+      <w:r>
+        <w:rPr>
+          <w:rFonts w:ascii="Times New Roman" w:hAnsi="Times New Roman"/>
+          <w:b w:val="0"/>
+          <w:i w:val="0"/>
+          <w:sz w:val="24"/>
+        </w:rPr>
+        <w:t xml:space="preserve">•  </w:t>
+      </w:r>
+      <w:r>
+        <w:rPr>
+          <w:rFonts w:ascii="Times New Roman" w:hAnsi="Times New Roman"/>
+          <w:b w:val="0"/>
+          <w:i w:val="0"/>
+          <w:sz w:val="24"/>
+        </w:rPr>
+        <w:t>C. (-∞, -3) ∪ (-3, ∞)</w:t>
+      </w:r>
+    </w:p>
+    <w:p>
+      <w:pPr>
+        <w:spacing w:line="360" w:lineRule="auto" w:after="0"/>
+        <w:ind w:left="720" w:hanging="360"/>
+      </w:pPr>
+      <w:r>
+        <w:rPr>
+          <w:rFonts w:ascii="Times New Roman" w:hAnsi="Times New Roman"/>
+          <w:b w:val="0"/>
+          <w:i w:val="0"/>
+          <w:sz w:val="24"/>
+        </w:rPr>
+        <w:t xml:space="preserve">•  </w:t>
+      </w:r>
+      <w:r>
+        <w:rPr>
+          <w:rFonts w:ascii="Times New Roman" w:hAnsi="Times New Roman"/>
+          <w:b w:val="0"/>
+          <w:i w:val="0"/>
+          <w:sz w:val="24"/>
+        </w:rPr>
+        <w:t>D. [-3, ∞)</w:t>
+      </w:r>
+    </w:p>
+    <w:p>
+      <w:pPr>
+        <w:spacing w:line="360" w:lineRule="auto" w:after="200"/>
+      </w:pPr>
+      <w:r>
+        <w:rPr>
+          <w:rFonts w:ascii="Times New Roman" w:hAnsi="Times New Roman"/>
+          <w:b/>
+          <w:i w:val="0"/>
+          <w:sz w:val="24"/>
+        </w:rPr>
+        <w:t>51.</w:t>
+      </w:r>
+      <w:r>
+        <w:rPr>
+          <w:rFonts w:ascii="Times New Roman" w:hAnsi="Times New Roman"/>
+          <w:b w:val="0"/>
+          <w:i w:val="0"/>
+          <w:sz w:val="24"/>
+        </w:rPr>
+        <w:t xml:space="preserve"> The inverse of f(x) = x⁴ + 50 is:</w:t>
+      </w:r>
+    </w:p>
+    <w:p>
+      <w:pPr>
+        <w:spacing w:line="360" w:lineRule="auto" w:after="0"/>
+        <w:ind w:left="720" w:hanging="360"/>
+      </w:pPr>
+      <w:r>
+        <w:rPr>
+          <w:rFonts w:ascii="Times New Roman" w:hAnsi="Times New Roman"/>
+          <w:b w:val="0"/>
+          <w:i w:val="0"/>
+          <w:sz w:val="24"/>
+        </w:rPr>
+        <w:t xml:space="preserve">•  </w:t>
+      </w:r>
+      <w:r>
+        <w:rPr>
+          <w:rFonts w:ascii="Times New Roman" w:hAnsi="Times New Roman"/>
+          <w:b w:val="0"/>
+          <w:i w:val="0"/>
+          <w:sz w:val="24"/>
+        </w:rPr>
+        <w:t>A. (x - 50)^(1/4)</w:t>
+      </w:r>
+    </w:p>
+    <w:p>
+      <w:pPr>
+        <w:spacing w:line="360" w:lineRule="auto" w:after="0"/>
+        <w:ind w:left="720" w:hanging="360"/>
+      </w:pPr>
+      <w:r>
+        <w:rPr>
+          <w:rFonts w:ascii="Times New Roman" w:hAnsi="Times New Roman"/>
+          <w:b w:val="0"/>
+          <w:i w:val="0"/>
+          <w:sz w:val="24"/>
+        </w:rPr>
+        <w:t xml:space="preserve">•  </w:t>
+      </w:r>
+      <w:r>
+        <w:rPr>
+          <w:rFonts w:ascii="Times New Roman" w:hAnsi="Times New Roman"/>
+          <w:b w:val="0"/>
+          <w:i w:val="0"/>
+          <w:sz w:val="24"/>
+        </w:rPr>
+        <w:t>B. (50 + x)^(1/4)</w:t>
+      </w:r>
+    </w:p>
+    <w:p>
+      <w:pPr>
+        <w:spacing w:line="360" w:lineRule="auto" w:after="0"/>
+        <w:ind w:left="720" w:hanging="360"/>
+      </w:pPr>
+      <w:r>
+        <w:rPr>
+          <w:rFonts w:ascii="Times New Roman" w:hAnsi="Times New Roman"/>
+          <w:b w:val="0"/>
+          <w:i w:val="0"/>
+          <w:sz w:val="24"/>
+        </w:rPr>
+        <w:t xml:space="preserve">•  </w:t>
+      </w:r>
+      <w:r>
+        <w:rPr>
+          <w:rFonts w:ascii="Times New Roman" w:hAnsi="Times New Roman"/>
+          <w:b w:val="0"/>
+          <w:i w:val="0"/>
+          <w:sz w:val="24"/>
+        </w:rPr>
+        <w:t>C. (x + 50)^(1/4)</w:t>
+      </w:r>
+    </w:p>
+    <w:p>
+      <w:pPr>
+        <w:spacing w:line="360" w:lineRule="auto" w:after="0"/>
+        <w:ind w:left="720" w:hanging="360"/>
+      </w:pPr>
+      <w:r>
+        <w:rPr>
+          <w:rFonts w:ascii="Times New Roman" w:hAnsi="Times New Roman"/>
+          <w:b w:val="0"/>
+          <w:i w:val="0"/>
+          <w:sz w:val="24"/>
+        </w:rPr>
+        <w:t xml:space="preserve">•  </w:t>
+      </w:r>
+      <w:r>
+        <w:rPr>
+          <w:rFonts w:ascii="Times New Roman" w:hAnsi="Times New Roman"/>
+          <w:b w:val="0"/>
+          <w:i w:val="0"/>
+          <w:sz w:val="24"/>
+        </w:rPr>
+        <w:t>D. (50 - x)^(1/4)</w:t>
+      </w:r>
+    </w:p>
+    <w:p>
+      <w:pPr>
+        <w:spacing w:line="360" w:lineRule="auto" w:after="200"/>
+      </w:pPr>
+      <w:r>
+        <w:rPr>
+          <w:rFonts w:ascii="Times New Roman" w:hAnsi="Times New Roman"/>
+          <w:b/>
+          <w:i w:val="0"/>
+          <w:sz w:val="24"/>
+        </w:rPr>
+        <w:t>52.</w:t>
+      </w:r>
+      <w:r>
+        <w:rPr>
+          <w:rFonts w:ascii="Times New Roman" w:hAnsi="Times New Roman"/>
+          <w:b w:val="0"/>
+          <w:i w:val="0"/>
+          <w:sz w:val="24"/>
+        </w:rPr>
+        <w:t xml:space="preserve"> y = √(x + 2) with domain (-∞, ∞) and codomain [0, ∞). This relation is a function.</w:t>
+      </w:r>
+    </w:p>
+    <w:p>
+      <w:pPr>
+        <w:spacing w:line="360" w:lineRule="auto" w:after="0"/>
+        <w:ind w:left="720" w:hanging="360"/>
+      </w:pPr>
+      <w:r>
+        <w:rPr>
+          <w:rFonts w:ascii="Times New Roman" w:hAnsi="Times New Roman"/>
+          <w:b w:val="0"/>
+          <w:i w:val="0"/>
+          <w:sz w:val="24"/>
+        </w:rPr>
+        <w:t xml:space="preserve">•  </w:t>
+      </w:r>
+      <w:r>
+        <w:rPr>
+          <w:rFonts w:ascii="Times New Roman" w:hAnsi="Times New Roman"/>
+          <w:b w:val="0"/>
+          <w:i w:val="0"/>
+          <w:sz w:val="24"/>
+        </w:rPr>
+        <w:t>A. True</w:t>
+      </w:r>
+    </w:p>
+    <w:p>
+      <w:pPr>
+        <w:spacing w:line="360" w:lineRule="auto" w:after="0"/>
+        <w:ind w:left="720" w:hanging="360"/>
+      </w:pPr>
+      <w:r>
+        <w:rPr>
+          <w:rFonts w:ascii="Times New Roman" w:hAnsi="Times New Roman"/>
+          <w:b w:val="0"/>
+          <w:i w:val="0"/>
+          <w:sz w:val="24"/>
+        </w:rPr>
+        <w:t xml:space="preserve">•  </w:t>
+      </w:r>
+      <w:r>
+        <w:rPr>
+          <w:rFonts w:ascii="Times New Roman" w:hAnsi="Times New Roman"/>
+          <w:b w:val="0"/>
+          <w:i w:val="0"/>
+          <w:sz w:val="24"/>
+        </w:rPr>
+        <w:t>B. False</w:t>
+      </w:r>
+    </w:p>
+    <w:p>
+      <w:pPr>
+        <w:spacing w:line="360" w:lineRule="auto" w:after="200"/>
+      </w:pPr>
+      <w:r>
+        <w:rPr>
+          <w:rFonts w:ascii="Times New Roman" w:hAnsi="Times New Roman"/>
+          <w:b/>
+          <w:i w:val="0"/>
+          <w:sz w:val="24"/>
+        </w:rPr>
+        <w:t>53.</w:t>
+      </w:r>
+      <w:r>
+        <w:rPr>
+          <w:rFonts w:ascii="Times New Roman" w:hAnsi="Times New Roman"/>
+          <w:b w:val="0"/>
+          <w:i w:val="0"/>
+          <w:sz w:val="24"/>
+        </w:rPr>
+        <w:t xml:space="preserve"> f(x) = √(3x - 2). Which gives the domain and range?</w:t>
+      </w:r>
+    </w:p>
+    <w:p>
+      <w:pPr>
+        <w:spacing w:line="360" w:lineRule="auto" w:after="0"/>
+        <w:ind w:left="720" w:hanging="360"/>
+      </w:pPr>
+      <w:r>
+        <w:rPr>
+          <w:rFonts w:ascii="Times New Roman" w:hAnsi="Times New Roman"/>
+          <w:b w:val="0"/>
+          <w:i w:val="0"/>
+          <w:sz w:val="24"/>
+        </w:rPr>
+        <w:t xml:space="preserve">•  </w:t>
+      </w:r>
+      <w:r>
+        <w:rPr>
+          <w:rFonts w:ascii="Times New Roman" w:hAnsi="Times New Roman"/>
+          <w:b w:val="0"/>
+          <w:i w:val="0"/>
+          <w:sz w:val="24"/>
+        </w:rPr>
+        <w:t>A. Domain (-∞, ∞); Range [0, ∞)</w:t>
+      </w:r>
+    </w:p>
+    <w:p>
+      <w:pPr>
+        <w:spacing w:line="360" w:lineRule="auto" w:after="0"/>
+        <w:ind w:left="720" w:hanging="360"/>
+      </w:pPr>
+      <w:r>
+        <w:rPr>
+          <w:rFonts w:ascii="Times New Roman" w:hAnsi="Times New Roman"/>
+          <w:b w:val="0"/>
+          <w:i w:val="0"/>
+          <w:sz w:val="24"/>
+        </w:rPr>
+        <w:t xml:space="preserve">•  </w:t>
+      </w:r>
+      <w:r>
+        <w:rPr>
+          <w:rFonts w:ascii="Times New Roman" w:hAnsi="Times New Roman"/>
+          <w:b w:val="0"/>
+          <w:i w:val="0"/>
+          <w:sz w:val="24"/>
+        </w:rPr>
+        <w:t>B. Domain [2/3, ∞); Range (-∞, ∞)</w:t>
+      </w:r>
+    </w:p>
+    <w:p>
+      <w:pPr>
+        <w:spacing w:line="360" w:lineRule="auto" w:after="0"/>
+        <w:ind w:left="720" w:hanging="360"/>
+      </w:pPr>
+      <w:r>
+        <w:rPr>
+          <w:rFonts w:ascii="Times New Roman" w:hAnsi="Times New Roman"/>
+          <w:b w:val="0"/>
+          <w:i w:val="0"/>
+          <w:sz w:val="24"/>
+        </w:rPr>
+        <w:t xml:space="preserve">•  </w:t>
+      </w:r>
+      <w:r>
+        <w:rPr>
+          <w:rFonts w:ascii="Times New Roman" w:hAnsi="Times New Roman"/>
+          <w:b w:val="0"/>
+          <w:i w:val="0"/>
+          <w:sz w:val="24"/>
+        </w:rPr>
+        <w:t>C. Domain (-∞, ∞); Range (-∞, ∞)</w:t>
+      </w:r>
+    </w:p>
+    <w:p>
+      <w:pPr>
+        <w:spacing w:line="360" w:lineRule="auto" w:after="0"/>
+        <w:ind w:left="720" w:hanging="360"/>
+      </w:pPr>
+      <w:r>
+        <w:rPr>
+          <w:rFonts w:ascii="Times New Roman" w:hAnsi="Times New Roman"/>
+          <w:b w:val="0"/>
+          <w:i w:val="0"/>
+          <w:sz w:val="24"/>
+        </w:rPr>
+        <w:t xml:space="preserve">•  </w:t>
+      </w:r>
+      <w:r>
+        <w:rPr>
+          <w:rFonts w:ascii="Times New Roman" w:hAnsi="Times New Roman"/>
+          <w:b w:val="0"/>
+          <w:i w:val="0"/>
+          <w:sz w:val="24"/>
+        </w:rPr>
+        <w:t>D. Domain [2/3, ∞); Range [0, ∞)</w:t>
+      </w:r>
+    </w:p>
+    <w:p>
+      <w:pPr>
+        <w:spacing w:line="360" w:lineRule="auto" w:after="200"/>
+      </w:pPr>
+      <w:r>
+        <w:rPr>
+          <w:rFonts w:ascii="Times New Roman" w:hAnsi="Times New Roman"/>
+          <w:b/>
+          <w:i w:val="0"/>
+          <w:sz w:val="24"/>
+        </w:rPr>
+        <w:t>54.</w:t>
+      </w:r>
+      <w:r>
+        <w:rPr>
+          <w:rFonts w:ascii="Times New Roman" w:hAnsi="Times New Roman"/>
+          <w:b w:val="0"/>
+          <w:i w:val="0"/>
+          <w:sz w:val="24"/>
+        </w:rPr>
+        <w:t xml:space="preserve"> {(1, 3), (2, 4), (3, 6), (4, 8), (5, 10)} with domain {1, 2, 3, 4, 5} and codomain {3, 4, 5, 6, 7, 8, 9, 10} is a function.</w:t>
+      </w:r>
+    </w:p>
+    <w:p>
+      <w:pPr>
+        <w:spacing w:line="360" w:lineRule="auto" w:after="0"/>
+        <w:ind w:left="720" w:hanging="360"/>
+      </w:pPr>
+      <w:r>
+        <w:rPr>
+          <w:rFonts w:ascii="Times New Roman" w:hAnsi="Times New Roman"/>
+          <w:b w:val="0"/>
+          <w:i w:val="0"/>
+          <w:sz w:val="24"/>
+        </w:rPr>
+        <w:t xml:space="preserve">•  </w:t>
+      </w:r>
+      <w:r>
+        <w:rPr>
+          <w:rFonts w:ascii="Times New Roman" w:hAnsi="Times New Roman"/>
+          <w:b w:val="0"/>
+          <w:i w:val="0"/>
+          <w:sz w:val="24"/>
+        </w:rPr>
+        <w:t>A. True</w:t>
+      </w:r>
+    </w:p>
+    <w:p>
+      <w:pPr>
+        <w:spacing w:line="360" w:lineRule="auto" w:after="0"/>
+        <w:ind w:left="720" w:hanging="360"/>
+      </w:pPr>
+      <w:r>
+        <w:rPr>
+          <w:rFonts w:ascii="Times New Roman" w:hAnsi="Times New Roman"/>
+          <w:b w:val="0"/>
+          <w:i w:val="0"/>
+          <w:sz w:val="24"/>
+        </w:rPr>
+        <w:t xml:space="preserve">•  </w:t>
+      </w:r>
+      <w:r>
+        <w:rPr>
+          <w:rFonts w:ascii="Times New Roman" w:hAnsi="Times New Roman"/>
+          <w:b w:val="0"/>
+          <w:i w:val="0"/>
+          <w:sz w:val="24"/>
+        </w:rPr>
+        <w:t>B. False</w:t>
+      </w:r>
+    </w:p>
+    <w:p>
+      <w:pPr>
+        <w:spacing w:line="360" w:lineRule="auto" w:after="200"/>
+      </w:pPr>
+      <w:r>
+        <w:rPr>
+          <w:rFonts w:ascii="Times New Roman" w:hAnsi="Times New Roman"/>
+          <w:b/>
+          <w:i w:val="0"/>
+          <w:sz w:val="24"/>
+        </w:rPr>
+        <w:t>55.</w:t>
+      </w:r>
+      <w:r>
+        <w:rPr>
+          <w:rFonts w:ascii="Times New Roman" w:hAnsi="Times New Roman"/>
+          <w:b w:val="0"/>
+          <w:i w:val="0"/>
+          <w:sz w:val="24"/>
+        </w:rPr>
+        <w:t xml:space="preserve"> A city of 100,000 grows by 2,000 people per year. Which equation gives the population P after t years?</w:t>
+      </w:r>
+    </w:p>
+    <w:p>
+      <w:pPr>
+        <w:spacing w:line="360" w:lineRule="auto" w:after="0"/>
+        <w:ind w:left="720" w:hanging="360"/>
+      </w:pPr>
+      <w:r>
+        <w:rPr>
+          <w:rFonts w:ascii="Times New Roman" w:hAnsi="Times New Roman"/>
+          <w:b w:val="0"/>
+          <w:i w:val="0"/>
+          <w:sz w:val="24"/>
+        </w:rPr>
+        <w:t xml:space="preserve">•  </w:t>
+      </w:r>
+      <w:r>
+        <w:rPr>
+          <w:rFonts w:ascii="Times New Roman" w:hAnsi="Times New Roman"/>
+          <w:b w:val="0"/>
+          <w:i w:val="0"/>
+          <w:sz w:val="24"/>
+        </w:rPr>
+        <w:t>A. P = 100,000t + 2,000</w:t>
+      </w:r>
+    </w:p>
+    <w:p>
+      <w:pPr>
+        <w:spacing w:line="360" w:lineRule="auto" w:after="0"/>
+        <w:ind w:left="720" w:hanging="360"/>
+      </w:pPr>
+      <w:r>
+        <w:rPr>
+          <w:rFonts w:ascii="Times New Roman" w:hAnsi="Times New Roman"/>
+          <w:b w:val="0"/>
+          <w:i w:val="0"/>
+          <w:sz w:val="24"/>
+        </w:rPr>
+        <w:t xml:space="preserve">•  </w:t>
+      </w:r>
+      <w:r>
+        <w:rPr>
+          <w:rFonts w:ascii="Times New Roman" w:hAnsi="Times New Roman"/>
+          <w:b w:val="0"/>
+          <w:i w:val="0"/>
+          <w:sz w:val="24"/>
+        </w:rPr>
+        <w:t>B. P = 2,000t + 100,000</w:t>
+      </w:r>
+    </w:p>
+    <w:p>
+      <w:pPr>
+        <w:spacing w:line="360" w:lineRule="auto" w:after="0"/>
+        <w:ind w:left="720" w:hanging="360"/>
+      </w:pPr>
+      <w:r>
+        <w:rPr>
+          <w:rFonts w:ascii="Times New Roman" w:hAnsi="Times New Roman"/>
+          <w:b w:val="0"/>
+          <w:i w:val="0"/>
+          <w:sz w:val="24"/>
+        </w:rPr>
+        <w:t xml:space="preserve">•  </w:t>
+      </w:r>
+      <w:r>
+        <w:rPr>
+          <w:rFonts w:ascii="Times New Roman" w:hAnsi="Times New Roman"/>
+          <w:b w:val="0"/>
+          <w:i w:val="0"/>
+          <w:sz w:val="24"/>
+        </w:rPr>
+        <w:t>C. P = 2,000t - 100,000</w:t>
+      </w:r>
+    </w:p>
+    <w:p>
+      <w:pPr>
+        <w:spacing w:line="360" w:lineRule="auto" w:after="0"/>
+        <w:ind w:left="720" w:hanging="360"/>
+      </w:pPr>
+      <w:r>
+        <w:rPr>
+          <w:rFonts w:ascii="Times New Roman" w:hAnsi="Times New Roman"/>
+          <w:b w:val="0"/>
+          <w:i w:val="0"/>
+          <w:sz w:val="24"/>
+        </w:rPr>
+        <w:t xml:space="preserve">•  </w:t>
+      </w:r>
+      <w:r>
+        <w:rPr>
+          <w:rFonts w:ascii="Times New Roman" w:hAnsi="Times New Roman"/>
+          <w:b w:val="0"/>
+          <w:i w:val="0"/>
+          <w:sz w:val="24"/>
+        </w:rPr>
+        <w:t>D. P = 100,000 - 2,000</w:t>
+      </w:r>
+    </w:p>
+    <w:p>
+      <w:pPr>
+        <w:spacing w:line="360" w:lineRule="auto" w:after="200"/>
+      </w:pPr>
+      <w:r>
+        <w:rPr>
+          <w:rFonts w:ascii="Times New Roman" w:hAnsi="Times New Roman"/>
+          <w:b/>
+          <w:i w:val="0"/>
+          <w:sz w:val="24"/>
+        </w:rPr>
+        <w:t>56.</w:t>
+      </w:r>
+      <w:r>
+        <w:rPr>
+          <w:rFonts w:ascii="Times New Roman" w:hAnsi="Times New Roman"/>
+          <w:b w:val="0"/>
+          <w:i w:val="0"/>
+          <w:sz w:val="24"/>
+        </w:rPr>
+        <w:t xml:space="preserve"> g(x) = 3x - 10. What is the domain of g⁻¹(x)?</w:t>
+      </w:r>
+    </w:p>
+    <w:p>
+      <w:pPr>
+        <w:spacing w:line="360" w:lineRule="auto" w:after="0"/>
+        <w:ind w:left="720" w:hanging="360"/>
+      </w:pPr>
+      <w:r>
+        <w:rPr>
+          <w:rFonts w:ascii="Times New Roman" w:hAnsi="Times New Roman"/>
+          <w:b w:val="0"/>
+          <w:i w:val="0"/>
+          <w:sz w:val="24"/>
+        </w:rPr>
+        <w:t xml:space="preserve">•  </w:t>
+      </w:r>
+      <w:r>
+        <w:rPr>
+          <w:rFonts w:ascii="Times New Roman" w:hAnsi="Times New Roman"/>
+          <w:b w:val="0"/>
+          <w:i w:val="0"/>
+          <w:sz w:val="24"/>
+        </w:rPr>
+        <w:t>A. (-∞, 10/3] ∪ [10/3, ∞)</w:t>
+      </w:r>
+    </w:p>
+    <w:p>
+      <w:pPr>
+        <w:spacing w:line="360" w:lineRule="auto" w:after="0"/>
+        <w:ind w:left="720" w:hanging="360"/>
+      </w:pPr>
+      <w:r>
+        <w:rPr>
+          <w:rFonts w:ascii="Times New Roman" w:hAnsi="Times New Roman"/>
+          <w:b w:val="0"/>
+          <w:i w:val="0"/>
+          <w:sz w:val="24"/>
+        </w:rPr>
+        <w:t xml:space="preserve">•  </w:t>
+      </w:r>
+      <w:r>
+        <w:rPr>
+          <w:rFonts w:ascii="Times New Roman" w:hAnsi="Times New Roman"/>
+          <w:b w:val="0"/>
+          <w:i w:val="0"/>
+          <w:sz w:val="24"/>
+        </w:rPr>
+        <w:t>B. (-∞, 10/3) ∪ (10/3, ∞)</w:t>
+      </w:r>
+    </w:p>
+    <w:p>
+      <w:pPr>
+        <w:spacing w:line="360" w:lineRule="auto" w:after="0"/>
+        <w:ind w:left="720" w:hanging="360"/>
+      </w:pPr>
+      <w:r>
+        <w:rPr>
+          <w:rFonts w:ascii="Times New Roman" w:hAnsi="Times New Roman"/>
+          <w:b w:val="0"/>
+          <w:i w:val="0"/>
+          <w:sz w:val="24"/>
+        </w:rPr>
+        <w:t xml:space="preserve">•  </w:t>
+      </w:r>
+      <w:r>
+        <w:rPr>
+          <w:rFonts w:ascii="Times New Roman" w:hAnsi="Times New Roman"/>
+          <w:b w:val="0"/>
+          <w:i w:val="0"/>
+          <w:sz w:val="24"/>
+        </w:rPr>
+        <w:t>C. (10/3, ∞)</w:t>
+      </w:r>
+    </w:p>
+    <w:p>
+      <w:pPr>
+        <w:spacing w:line="360" w:lineRule="auto" w:after="0"/>
+        <w:ind w:left="720" w:hanging="360"/>
+      </w:pPr>
+      <w:r>
+        <w:rPr>
+          <w:rFonts w:ascii="Times New Roman" w:hAnsi="Times New Roman"/>
+          <w:b w:val="0"/>
+          <w:i w:val="0"/>
+          <w:sz w:val="24"/>
+        </w:rPr>
+        <w:t xml:space="preserve">•  </w:t>
+      </w:r>
+      <w:r>
+        <w:rPr>
+          <w:rFonts w:ascii="Times New Roman" w:hAnsi="Times New Roman"/>
+          <w:b w:val="0"/>
+          <w:i w:val="0"/>
+          <w:sz w:val="24"/>
+        </w:rPr>
+        <w:t>D. [-10/3, ∞)</w:t>
+      </w:r>
+    </w:p>
+    <w:p>
+      <w:pPr>
+        <w:spacing w:line="360" w:lineRule="auto" w:after="200"/>
+      </w:pPr>
+      <w:r>
+        <w:rPr>
+          <w:rFonts w:ascii="Times New Roman" w:hAnsi="Times New Roman"/>
+          <w:b/>
+          <w:i w:val="0"/>
+          <w:sz w:val="24"/>
+        </w:rPr>
+        <w:t>57.</w:t>
+      </w:r>
+      <w:r>
+        <w:rPr>
+          <w:rFonts w:ascii="Times New Roman" w:hAnsi="Times New Roman"/>
+          <w:b w:val="0"/>
+          <w:i w:val="0"/>
+          <w:sz w:val="24"/>
+        </w:rPr>
+        <w:t xml:space="preserve"> What is the standard form of a quadratic equation (course key)?</w:t>
+      </w:r>
+    </w:p>
+    <w:p>
+      <w:pPr>
+        <w:spacing w:line="360" w:lineRule="auto" w:after="0"/>
+        <w:ind w:left="720" w:hanging="360"/>
+      </w:pPr>
+      <w:r>
+        <w:rPr>
+          <w:rFonts w:ascii="Times New Roman" w:hAnsi="Times New Roman"/>
+          <w:b w:val="0"/>
+          <w:i w:val="0"/>
+          <w:sz w:val="24"/>
+        </w:rPr>
+        <w:t xml:space="preserve">•  </w:t>
+      </w:r>
+      <w:r>
+        <w:rPr>
+          <w:rFonts w:ascii="Times New Roman" w:hAnsi="Times New Roman"/>
+          <w:b w:val="0"/>
+          <w:i w:val="0"/>
+          <w:sz w:val="24"/>
+        </w:rPr>
+        <w:t>A. y = eˣ</w:t>
+      </w:r>
+    </w:p>
+    <w:p>
+      <w:pPr>
+        <w:spacing w:line="360" w:lineRule="auto" w:after="0"/>
+        <w:ind w:left="720" w:hanging="360"/>
+      </w:pPr>
+      <w:r>
+        <w:rPr>
+          <w:rFonts w:ascii="Times New Roman" w:hAnsi="Times New Roman"/>
+          <w:b w:val="0"/>
+          <w:i w:val="0"/>
+          <w:sz w:val="24"/>
+        </w:rPr>
+        <w:t xml:space="preserve">•  </w:t>
+      </w:r>
+      <w:r>
+        <w:rPr>
+          <w:rFonts w:ascii="Times New Roman" w:hAnsi="Times New Roman"/>
+          <w:b w:val="0"/>
+          <w:i w:val="0"/>
+          <w:sz w:val="24"/>
+        </w:rPr>
+        <w:t>B. y = a(x - h)² + k</w:t>
+      </w:r>
+    </w:p>
+    <w:p>
+      <w:pPr>
+        <w:spacing w:line="360" w:lineRule="auto" w:after="0"/>
+        <w:ind w:left="720" w:hanging="360"/>
+      </w:pPr>
+      <w:r>
+        <w:rPr>
+          <w:rFonts w:ascii="Times New Roman" w:hAnsi="Times New Roman"/>
+          <w:b w:val="0"/>
+          <w:i w:val="0"/>
+          <w:sz w:val="24"/>
+        </w:rPr>
+        <w:t xml:space="preserve">•  </w:t>
+      </w:r>
+      <w:r>
+        <w:rPr>
+          <w:rFonts w:ascii="Times New Roman" w:hAnsi="Times New Roman"/>
+          <w:b w:val="0"/>
+          <w:i w:val="0"/>
+          <w:sz w:val="24"/>
+        </w:rPr>
+        <w:t>C. y = mx + b</w:t>
+      </w:r>
+    </w:p>
+    <w:p>
+      <w:pPr>
+        <w:spacing w:line="360" w:lineRule="auto" w:after="0"/>
+        <w:ind w:left="720" w:hanging="360"/>
+      </w:pPr>
+      <w:r>
+        <w:rPr>
+          <w:rFonts w:ascii="Times New Roman" w:hAnsi="Times New Roman"/>
+          <w:b w:val="0"/>
+          <w:i w:val="0"/>
+          <w:sz w:val="24"/>
+        </w:rPr>
+        <w:t xml:space="preserve">•  </w:t>
+      </w:r>
+      <w:r>
+        <w:rPr>
+          <w:rFonts w:ascii="Times New Roman" w:hAnsi="Times New Roman"/>
+          <w:b w:val="0"/>
+          <w:i w:val="0"/>
+          <w:sz w:val="24"/>
+        </w:rPr>
+        <w:t>D. ax² + bx + c = 0</w:t>
+      </w:r>
+    </w:p>
+    <w:p>
+      <w:pPr>
+        <w:spacing w:line="360" w:lineRule="auto" w:after="200"/>
+      </w:pPr>
+      <w:r>
+        <w:rPr>
+          <w:rFonts w:ascii="Times New Roman" w:hAnsi="Times New Roman"/>
+          <w:b/>
+          <w:i w:val="0"/>
+          <w:sz w:val="24"/>
+        </w:rPr>
+        <w:t>58.</w:t>
+      </w:r>
+      <w:r>
+        <w:rPr>
+          <w:rFonts w:ascii="Times New Roman" w:hAnsi="Times New Roman"/>
+          <w:b w:val="0"/>
+          <w:i w:val="0"/>
+          <w:sz w:val="24"/>
+        </w:rPr>
+        <w:t xml:space="preserve"> f(x) = √(10 - x)/(x + 11). What is the domain of f?</w:t>
+      </w:r>
+    </w:p>
+    <w:p>
+      <w:pPr>
+        <w:spacing w:line="360" w:lineRule="auto" w:after="0"/>
+        <w:ind w:left="720" w:hanging="360"/>
+      </w:pPr>
+      <w:r>
+        <w:rPr>
+          <w:rFonts w:ascii="Times New Roman" w:hAnsi="Times New Roman"/>
+          <w:b w:val="0"/>
+          <w:i w:val="0"/>
+          <w:sz w:val="24"/>
+        </w:rPr>
+        <w:t xml:space="preserve">•  </w:t>
+      </w:r>
+      <w:r>
+        <w:rPr>
+          <w:rFonts w:ascii="Times New Roman" w:hAnsi="Times New Roman"/>
+          <w:b w:val="0"/>
+          <w:i w:val="0"/>
+          <w:sz w:val="24"/>
+        </w:rPr>
+        <w:t>A. (-11, 10]</w:t>
+      </w:r>
+    </w:p>
+    <w:p>
+      <w:pPr>
+        <w:spacing w:line="360" w:lineRule="auto" w:after="0"/>
+        <w:ind w:left="720" w:hanging="360"/>
+      </w:pPr>
+      <w:r>
+        <w:rPr>
+          <w:rFonts w:ascii="Times New Roman" w:hAnsi="Times New Roman"/>
+          <w:b w:val="0"/>
+          <w:i w:val="0"/>
+          <w:sz w:val="24"/>
+        </w:rPr>
+        <w:t xml:space="preserve">•  </w:t>
+      </w:r>
+      <w:r>
+        <w:rPr>
+          <w:rFonts w:ascii="Times New Roman" w:hAnsi="Times New Roman"/>
+          <w:b w:val="0"/>
+          <w:i w:val="0"/>
+          <w:sz w:val="24"/>
+        </w:rPr>
+        <w:t>B. (-∞, 10) ∪ (10, 11)</w:t>
+      </w:r>
+    </w:p>
+    <w:p>
+      <w:pPr>
+        <w:spacing w:line="360" w:lineRule="auto" w:after="0"/>
+        <w:ind w:left="720" w:hanging="360"/>
+      </w:pPr>
+      <w:r>
+        <w:rPr>
+          <w:rFonts w:ascii="Times New Roman" w:hAnsi="Times New Roman"/>
+          <w:b w:val="0"/>
+          <w:i w:val="0"/>
+          <w:sz w:val="24"/>
+        </w:rPr>
+        <w:t xml:space="preserve">•  </w:t>
+      </w:r>
+      <w:r>
+        <w:rPr>
+          <w:rFonts w:ascii="Times New Roman" w:hAnsi="Times New Roman"/>
+          <w:b w:val="0"/>
+          <w:i w:val="0"/>
+          <w:sz w:val="24"/>
+        </w:rPr>
+        <w:t>C. (-∞, -11) ∪ (-11, 10]</w:t>
+      </w:r>
+    </w:p>
+    <w:p>
+      <w:pPr>
+        <w:spacing w:line="360" w:lineRule="auto" w:after="0"/>
+        <w:ind w:left="720" w:hanging="360"/>
+      </w:pPr>
+      <w:r>
+        <w:rPr>
+          <w:rFonts w:ascii="Times New Roman" w:hAnsi="Times New Roman"/>
+          <w:b w:val="0"/>
+          <w:i w:val="0"/>
+          <w:sz w:val="24"/>
+        </w:rPr>
+        <w:t xml:space="preserve">•  </w:t>
+      </w:r>
+      <w:r>
+        <w:rPr>
+          <w:rFonts w:ascii="Times New Roman" w:hAnsi="Times New Roman"/>
+          <w:b w:val="0"/>
+          <w:i w:val="0"/>
+          <w:sz w:val="24"/>
+        </w:rPr>
+        <w:t>D. [-11, 10) ∪ (10, ∞)</w:t>
+      </w:r>
+    </w:p>
+    <w:p>
+      <w:pPr>
+        <w:spacing w:line="360" w:lineRule="auto" w:after="200"/>
+      </w:pPr>
+      <w:r>
+        <w:rPr>
+          <w:rFonts w:ascii="Times New Roman" w:hAnsi="Times New Roman"/>
+          <w:b/>
+          <w:i w:val="0"/>
+          <w:sz w:val="24"/>
+        </w:rPr>
+        <w:t>59.</w:t>
+      </w:r>
+      <w:r>
+        <w:rPr>
+          <w:rFonts w:ascii="Times New Roman" w:hAnsi="Times New Roman"/>
+          <w:b w:val="0"/>
+          <w:i w:val="0"/>
+          <w:sz w:val="24"/>
+        </w:rPr>
+        <w:t xml:space="preserve"> Which quadratic equation has exactly one real solution?</w:t>
+      </w:r>
+    </w:p>
+    <w:p>
+      <w:pPr>
+        <w:spacing w:line="360" w:lineRule="auto" w:after="0"/>
+        <w:ind w:left="720" w:hanging="360"/>
+      </w:pPr>
+      <w:r>
+        <w:rPr>
+          <w:rFonts w:ascii="Times New Roman" w:hAnsi="Times New Roman"/>
+          <w:b w:val="0"/>
+          <w:i w:val="0"/>
+          <w:sz w:val="24"/>
+        </w:rPr>
+        <w:t xml:space="preserve">•  </w:t>
+      </w:r>
+      <w:r>
+        <w:rPr>
+          <w:rFonts w:ascii="Times New Roman" w:hAnsi="Times New Roman"/>
+          <w:b w:val="0"/>
+          <w:i w:val="0"/>
+          <w:sz w:val="24"/>
+        </w:rPr>
+        <w:t>A. x² + 32x + 256 = 0</w:t>
+      </w:r>
+    </w:p>
+    <w:p>
+      <w:pPr>
+        <w:spacing w:line="360" w:lineRule="auto" w:after="0"/>
+        <w:ind w:left="720" w:hanging="360"/>
+      </w:pPr>
+      <w:r>
+        <w:rPr>
+          <w:rFonts w:ascii="Times New Roman" w:hAnsi="Times New Roman"/>
+          <w:b w:val="0"/>
+          <w:i w:val="0"/>
+          <w:sz w:val="24"/>
+        </w:rPr>
+        <w:t xml:space="preserve">•  </w:t>
+      </w:r>
+      <w:r>
+        <w:rPr>
+          <w:rFonts w:ascii="Times New Roman" w:hAnsi="Times New Roman"/>
+          <w:b w:val="0"/>
+          <w:i w:val="0"/>
+          <w:sz w:val="24"/>
+        </w:rPr>
+        <w:t>B. x² - 5x - 14 = 0</w:t>
+      </w:r>
+    </w:p>
+    <w:p>
+      <w:pPr>
+        <w:spacing w:line="360" w:lineRule="auto" w:after="0"/>
+        <w:ind w:left="720" w:hanging="360"/>
+      </w:pPr>
+      <w:r>
+        <w:rPr>
+          <w:rFonts w:ascii="Times New Roman" w:hAnsi="Times New Roman"/>
+          <w:b w:val="0"/>
+          <w:i w:val="0"/>
+          <w:sz w:val="24"/>
+        </w:rPr>
+        <w:t xml:space="preserve">•  </w:t>
+      </w:r>
+      <w:r>
+        <w:rPr>
+          <w:rFonts w:ascii="Times New Roman" w:hAnsi="Times New Roman"/>
+          <w:b w:val="0"/>
+          <w:i w:val="0"/>
+          <w:sz w:val="24"/>
+        </w:rPr>
+        <w:t>C. x² - 2x - 10 = 0</w:t>
+      </w:r>
+    </w:p>
+    <w:p>
+      <w:pPr>
+        <w:spacing w:line="360" w:lineRule="auto" w:after="0"/>
+        <w:ind w:left="720" w:hanging="360"/>
+      </w:pPr>
+      <w:r>
+        <w:rPr>
+          <w:rFonts w:ascii="Times New Roman" w:hAnsi="Times New Roman"/>
+          <w:b w:val="0"/>
+          <w:i w:val="0"/>
+          <w:sz w:val="24"/>
+        </w:rPr>
+        <w:t xml:space="preserve">•  </w:t>
+      </w:r>
+      <w:r>
+        <w:rPr>
+          <w:rFonts w:ascii="Times New Roman" w:hAnsi="Times New Roman"/>
+          <w:b w:val="0"/>
+          <w:i w:val="0"/>
+          <w:sz w:val="24"/>
+        </w:rPr>
+        <w:t>D. x² + 4x - 12 = 0</w:t>
+      </w:r>
+    </w:p>
+    <w:p>
+      <w:pPr>
+        <w:spacing w:line="360" w:lineRule="auto" w:after="200"/>
+      </w:pPr>
+      <w:r>
+        <w:rPr>
+          <w:rFonts w:ascii="Times New Roman" w:hAnsi="Times New Roman"/>
+          <w:b/>
+          <w:i w:val="0"/>
+          <w:sz w:val="24"/>
+        </w:rPr>
+        <w:t>60.</w:t>
+      </w:r>
+      <w:r>
+        <w:rPr>
+          <w:rFonts w:ascii="Times New Roman" w:hAnsi="Times New Roman"/>
+          <w:b w:val="0"/>
+          <w:i w:val="0"/>
+          <w:sz w:val="24"/>
+        </w:rPr>
+        <w:t xml:space="preserve"> Which polynomial function can model the height of a ball thrown into the air?</w:t>
+      </w:r>
+    </w:p>
+    <w:p>
+      <w:pPr>
+        <w:spacing w:line="360" w:lineRule="auto" w:after="0"/>
+        <w:ind w:left="720" w:hanging="360"/>
+      </w:pPr>
+      <w:r>
+        <w:rPr>
+          <w:rFonts w:ascii="Times New Roman" w:hAnsi="Times New Roman"/>
+          <w:b w:val="0"/>
+          <w:i w:val="0"/>
+          <w:sz w:val="24"/>
+        </w:rPr>
+        <w:t xml:space="preserve">•  </w:t>
+      </w:r>
+      <w:r>
+        <w:rPr>
+          <w:rFonts w:ascii="Times New Roman" w:hAnsi="Times New Roman"/>
+          <w:b w:val="0"/>
+          <w:i w:val="0"/>
+          <w:sz w:val="24"/>
+        </w:rPr>
+        <w:t>A. y = x⁵</w:t>
+      </w:r>
+    </w:p>
+    <w:p>
+      <w:pPr>
+        <w:spacing w:line="360" w:lineRule="auto" w:after="0"/>
+        <w:ind w:left="720" w:hanging="360"/>
+      </w:pPr>
+      <w:r>
+        <w:rPr>
+          <w:rFonts w:ascii="Times New Roman" w:hAnsi="Times New Roman"/>
+          <w:b w:val="0"/>
+          <w:i w:val="0"/>
+          <w:sz w:val="24"/>
+        </w:rPr>
+        <w:t xml:space="preserve">•  </w:t>
+      </w:r>
+      <w:r>
+        <w:rPr>
+          <w:rFonts w:ascii="Times New Roman" w:hAnsi="Times New Roman"/>
+          <w:b w:val="0"/>
+          <w:i w:val="0"/>
+          <w:sz w:val="24"/>
+        </w:rPr>
+        <w:t>B. y = x²</w:t>
+      </w:r>
+    </w:p>
+    <w:p>
+      <w:pPr>
+        <w:spacing w:line="360" w:lineRule="auto" w:after="0"/>
+        <w:ind w:left="720" w:hanging="360"/>
+      </w:pPr>
+      <w:r>
+        <w:rPr>
+          <w:rFonts w:ascii="Times New Roman" w:hAnsi="Times New Roman"/>
+          <w:b w:val="0"/>
+          <w:i w:val="0"/>
+          <w:sz w:val="24"/>
+        </w:rPr>
+        <w:t xml:space="preserve">•  </w:t>
+      </w:r>
+      <w:r>
+        <w:rPr>
+          <w:rFonts w:ascii="Times New Roman" w:hAnsi="Times New Roman"/>
+          <w:b w:val="0"/>
+          <w:i w:val="0"/>
+          <w:sz w:val="24"/>
+        </w:rPr>
+        <w:t>C. y = x⁴</w:t>
+      </w:r>
+    </w:p>
+    <w:p>
+      <w:pPr>
+        <w:spacing w:line="360" w:lineRule="auto" w:after="0"/>
+        <w:ind w:left="720" w:hanging="360"/>
+      </w:pPr>
+      <w:r>
+        <w:rPr>
+          <w:rFonts w:ascii="Times New Roman" w:hAnsi="Times New Roman"/>
+          <w:b w:val="0"/>
+          <w:i w:val="0"/>
+          <w:sz w:val="24"/>
+        </w:rPr>
+        <w:t xml:space="preserve">•  </w:t>
+      </w:r>
+      <w:r>
+        <w:rPr>
+          <w:rFonts w:ascii="Times New Roman" w:hAnsi="Times New Roman"/>
+          <w:b w:val="0"/>
+          <w:i w:val="0"/>
+          <w:sz w:val="24"/>
+        </w:rPr>
+        <w:t>D. y = x³</w:t>
+      </w:r>
+    </w:p>
+    <w:p>
+      <w:pPr>
+        <w:spacing w:line="360" w:lineRule="auto" w:after="200"/>
+      </w:pPr>
+      <w:r>
+        <w:rPr>
+          <w:rFonts w:ascii="Times New Roman" w:hAnsi="Times New Roman"/>
+          <w:b/>
+          <w:i w:val="0"/>
+          <w:sz w:val="24"/>
+        </w:rPr>
+        <w:t>61.</w:t>
+      </w:r>
+      <w:r>
+        <w:rPr>
+          <w:rFonts w:ascii="Times New Roman" w:hAnsi="Times New Roman"/>
+          <w:b w:val="0"/>
+          <w:i w:val="0"/>
+          <w:sz w:val="24"/>
+        </w:rPr>
+        <w:t xml:space="preserve"> f(x) = 10x, g(x) = x², h(x) = x³. Simplify (f ∘ g ∘ h)(x).</w:t>
+      </w:r>
+    </w:p>
+    <w:p>
+      <w:pPr>
+        <w:spacing w:line="360" w:lineRule="auto" w:after="0"/>
+        <w:ind w:left="720" w:hanging="360"/>
+      </w:pPr>
+      <w:r>
+        <w:rPr>
+          <w:rFonts w:ascii="Times New Roman" w:hAnsi="Times New Roman"/>
+          <w:b w:val="0"/>
+          <w:i w:val="0"/>
+          <w:sz w:val="24"/>
+        </w:rPr>
+        <w:t xml:space="preserve">•  </w:t>
+      </w:r>
+      <w:r>
+        <w:rPr>
+          <w:rFonts w:ascii="Times New Roman" w:hAnsi="Times New Roman"/>
+          <w:b w:val="0"/>
+          <w:i w:val="0"/>
+          <w:sz w:val="24"/>
+        </w:rPr>
+        <w:t>A. 10x⁶</w:t>
+      </w:r>
+    </w:p>
+    <w:p>
+      <w:pPr>
+        <w:spacing w:line="360" w:lineRule="auto" w:after="0"/>
+        <w:ind w:left="720" w:hanging="360"/>
+      </w:pPr>
+      <w:r>
+        <w:rPr>
+          <w:rFonts w:ascii="Times New Roman" w:hAnsi="Times New Roman"/>
+          <w:b w:val="0"/>
+          <w:i w:val="0"/>
+          <w:sz w:val="24"/>
+        </w:rPr>
+        <w:t xml:space="preserve">•  </w:t>
+      </w:r>
+      <w:r>
+        <w:rPr>
+          <w:rFonts w:ascii="Times New Roman" w:hAnsi="Times New Roman"/>
+          <w:b w:val="0"/>
+          <w:i w:val="0"/>
+          <w:sz w:val="24"/>
+        </w:rPr>
+        <w:t>B. 100x⁵</w:t>
+      </w:r>
+    </w:p>
+    <w:p>
+      <w:pPr>
+        <w:spacing w:line="360" w:lineRule="auto" w:after="0"/>
+        <w:ind w:left="720" w:hanging="360"/>
+      </w:pPr>
+      <w:r>
+        <w:rPr>
+          <w:rFonts w:ascii="Times New Roman" w:hAnsi="Times New Roman"/>
+          <w:b w:val="0"/>
+          <w:i w:val="0"/>
+          <w:sz w:val="24"/>
+        </w:rPr>
+        <w:t xml:space="preserve">•  </w:t>
+      </w:r>
+      <w:r>
+        <w:rPr>
+          <w:rFonts w:ascii="Times New Roman" w:hAnsi="Times New Roman"/>
+          <w:b w:val="0"/>
+          <w:i w:val="0"/>
+          <w:sz w:val="24"/>
+        </w:rPr>
+        <w:t>C. 10x⁵</w:t>
+      </w:r>
+    </w:p>
+    <w:p>
+      <w:pPr>
+        <w:spacing w:line="360" w:lineRule="auto" w:after="0"/>
+        <w:ind w:left="720" w:hanging="360"/>
+      </w:pPr>
+      <w:r>
+        <w:rPr>
+          <w:rFonts w:ascii="Times New Roman" w:hAnsi="Times New Roman"/>
+          <w:b w:val="0"/>
+          <w:i w:val="0"/>
+          <w:sz w:val="24"/>
+        </w:rPr>
+        <w:t xml:space="preserve">•  </w:t>
+      </w:r>
+      <w:r>
+        <w:rPr>
+          <w:rFonts w:ascii="Times New Roman" w:hAnsi="Times New Roman"/>
+          <w:b w:val="0"/>
+          <w:i w:val="0"/>
+          <w:sz w:val="24"/>
+        </w:rPr>
+        <w:t>D. 100x⁶</w:t>
+      </w:r>
+    </w:p>
+    <w:p>
+      <w:pPr>
+        <w:spacing w:line="360" w:lineRule="auto" w:after="200"/>
+      </w:pPr>
+      <w:r>
+        <w:rPr>
+          <w:rFonts w:ascii="Times New Roman" w:hAnsi="Times New Roman"/>
+          <w:b/>
+          <w:i w:val="0"/>
+          <w:sz w:val="24"/>
+        </w:rPr>
+        <w:t>62.</w:t>
+      </w:r>
+      <w:r>
+        <w:rPr>
+          <w:rFonts w:ascii="Times New Roman" w:hAnsi="Times New Roman"/>
+          <w:b w:val="0"/>
+          <w:i w:val="0"/>
+          <w:sz w:val="24"/>
+        </w:rPr>
+        <w:t xml:space="preserve"> f(x) = log₂(x - 2). Which gives the domain and range?</w:t>
+      </w:r>
+    </w:p>
+    <w:p>
+      <w:pPr>
+        <w:spacing w:line="360" w:lineRule="auto" w:after="0"/>
+        <w:ind w:left="720" w:hanging="360"/>
+      </w:pPr>
+      <w:r>
+        <w:rPr>
+          <w:rFonts w:ascii="Times New Roman" w:hAnsi="Times New Roman"/>
+          <w:b w:val="0"/>
+          <w:i w:val="0"/>
+          <w:sz w:val="24"/>
+        </w:rPr>
+        <w:t xml:space="preserve">•  </w:t>
+      </w:r>
+      <w:r>
+        <w:rPr>
+          <w:rFonts w:ascii="Times New Roman" w:hAnsi="Times New Roman"/>
+          <w:b w:val="0"/>
+          <w:i w:val="0"/>
+          <w:sz w:val="24"/>
+        </w:rPr>
+        <w:t>A. Domain [2, ∞); Range (-∞, 0)</w:t>
+      </w:r>
+    </w:p>
+    <w:p>
+      <w:pPr>
+        <w:spacing w:line="360" w:lineRule="auto" w:after="0"/>
+        <w:ind w:left="720" w:hanging="360"/>
+      </w:pPr>
+      <w:r>
+        <w:rPr>
+          <w:rFonts w:ascii="Times New Roman" w:hAnsi="Times New Roman"/>
+          <w:b w:val="0"/>
+          <w:i w:val="0"/>
+          <w:sz w:val="24"/>
+        </w:rPr>
+        <w:t xml:space="preserve">•  </w:t>
+      </w:r>
+      <w:r>
+        <w:rPr>
+          <w:rFonts w:ascii="Times New Roman" w:hAnsi="Times New Roman"/>
+          <w:b w:val="0"/>
+          <w:i w:val="0"/>
+          <w:sz w:val="24"/>
+        </w:rPr>
+        <w:t>B. Domain (2, ∞); Range (-∞, ∞)</w:t>
+      </w:r>
+    </w:p>
+    <w:p>
+      <w:pPr>
+        <w:spacing w:line="360" w:lineRule="auto" w:after="0"/>
+        <w:ind w:left="720" w:hanging="360"/>
+      </w:pPr>
+      <w:r>
+        <w:rPr>
+          <w:rFonts w:ascii="Times New Roman" w:hAnsi="Times New Roman"/>
+          <w:b w:val="0"/>
+          <w:i w:val="0"/>
+          <w:sz w:val="24"/>
+        </w:rPr>
+        <w:t xml:space="preserve">•  </w:t>
+      </w:r>
+      <w:r>
+        <w:rPr>
+          <w:rFonts w:ascii="Times New Roman" w:hAnsi="Times New Roman"/>
+          <w:b w:val="0"/>
+          <w:i w:val="0"/>
+          <w:sz w:val="24"/>
+        </w:rPr>
+        <w:t>C. Domain (2, ∞); Range (-∞, 0)</w:t>
+      </w:r>
+    </w:p>
+    <w:p>
+      <w:pPr>
+        <w:spacing w:line="360" w:lineRule="auto" w:after="0"/>
+        <w:ind w:left="720" w:hanging="360"/>
+      </w:pPr>
+      <w:r>
+        <w:rPr>
+          <w:rFonts w:ascii="Times New Roman" w:hAnsi="Times New Roman"/>
+          <w:b w:val="0"/>
+          <w:i w:val="0"/>
+          <w:sz w:val="24"/>
+        </w:rPr>
+        <w:t xml:space="preserve">•  </w:t>
+      </w:r>
+      <w:r>
+        <w:rPr>
+          <w:rFonts w:ascii="Times New Roman" w:hAnsi="Times New Roman"/>
+          <w:b w:val="0"/>
+          <w:i w:val="0"/>
+          <w:sz w:val="24"/>
+        </w:rPr>
+        <w:t>D. Domain (-∞, 2); Range (-∞, ∞)</w:t>
+      </w:r>
+    </w:p>
+    <w:p>
+      <w:pPr>
+        <w:spacing w:line="360" w:lineRule="auto" w:after="200"/>
+      </w:pPr>
+      <w:r>
+        <w:rPr>
+          <w:rFonts w:ascii="Times New Roman" w:hAnsi="Times New Roman"/>
+          <w:b/>
+          <w:i w:val="0"/>
+          <w:sz w:val="24"/>
+        </w:rPr>
+        <w:t>63.</w:t>
+      </w:r>
+      <w:r>
+        <w:rPr>
+          <w:rFonts w:ascii="Times New Roman" w:hAnsi="Times New Roman"/>
+          <w:b w:val="0"/>
+          <w:i w:val="0"/>
+          <w:sz w:val="24"/>
+        </w:rPr>
+        <w:t xml:space="preserve"> Which is a quadratic equation in the variable x?</w:t>
+      </w:r>
+    </w:p>
+    <w:p>
+      <w:pPr>
+        <w:spacing w:line="360" w:lineRule="auto" w:after="0"/>
+        <w:ind w:left="720" w:hanging="360"/>
+      </w:pPr>
+      <w:r>
+        <w:rPr>
+          <w:rFonts w:ascii="Times New Roman" w:hAnsi="Times New Roman"/>
+          <w:b w:val="0"/>
+          <w:i w:val="0"/>
+          <w:sz w:val="24"/>
+        </w:rPr>
+        <w:t xml:space="preserve">•  </w:t>
+      </w:r>
+      <w:r>
+        <w:rPr>
+          <w:rFonts w:ascii="Times New Roman" w:hAnsi="Times New Roman"/>
+          <w:b w:val="0"/>
+          <w:i w:val="0"/>
+          <w:sz w:val="24"/>
+        </w:rPr>
+        <w:t>A. y = x² + 2x + 1</w:t>
+      </w:r>
+    </w:p>
+    <w:p>
+      <w:pPr>
+        <w:spacing w:line="360" w:lineRule="auto" w:after="0"/>
+        <w:ind w:left="720" w:hanging="360"/>
+      </w:pPr>
+      <w:r>
+        <w:rPr>
+          <w:rFonts w:ascii="Times New Roman" w:hAnsi="Times New Roman"/>
+          <w:b w:val="0"/>
+          <w:i w:val="0"/>
+          <w:sz w:val="24"/>
+        </w:rPr>
+        <w:t xml:space="preserve">•  </w:t>
+      </w:r>
+      <w:r>
+        <w:rPr>
+          <w:rFonts w:ascii="Times New Roman" w:hAnsi="Times New Roman"/>
+          <w:b w:val="0"/>
+          <w:i w:val="0"/>
+          <w:sz w:val="24"/>
+        </w:rPr>
+        <w:t>B. y² = x²</w:t>
+      </w:r>
+    </w:p>
+    <w:p>
+      <w:pPr>
+        <w:spacing w:line="360" w:lineRule="auto" w:after="0"/>
+        <w:ind w:left="720" w:hanging="360"/>
+      </w:pPr>
+      <w:r>
+        <w:rPr>
+          <w:rFonts w:ascii="Times New Roman" w:hAnsi="Times New Roman"/>
+          <w:b w:val="0"/>
+          <w:i w:val="0"/>
+          <w:sz w:val="24"/>
+        </w:rPr>
+        <w:t xml:space="preserve">•  </w:t>
+      </w:r>
+      <w:r>
+        <w:rPr>
+          <w:rFonts w:ascii="Times New Roman" w:hAnsi="Times New Roman"/>
+          <w:b w:val="0"/>
+          <w:i w:val="0"/>
+          <w:sz w:val="24"/>
+        </w:rPr>
+        <w:t>C. y = y² + 2x + 1</w:t>
+      </w:r>
+    </w:p>
+    <w:p>
+      <w:pPr>
+        <w:spacing w:line="360" w:lineRule="auto" w:after="0"/>
+        <w:ind w:left="720" w:hanging="360"/>
+      </w:pPr>
+      <w:r>
+        <w:rPr>
+          <w:rFonts w:ascii="Times New Roman" w:hAnsi="Times New Roman"/>
+          <w:b w:val="0"/>
+          <w:i w:val="0"/>
+          <w:sz w:val="24"/>
+        </w:rPr>
+        <w:t xml:space="preserve">•  </w:t>
+      </w:r>
+      <w:r>
+        <w:rPr>
+          <w:rFonts w:ascii="Times New Roman" w:hAnsi="Times New Roman"/>
+          <w:b w:val="0"/>
+          <w:i w:val="0"/>
+          <w:sz w:val="24"/>
+        </w:rPr>
+        <w:t>D. x³ + 2x + 1 = 0</w:t>
+      </w:r>
+    </w:p>
+    <w:p>
+      <w:pPr>
         <w:pStyle w:val="Heading1"/>
         <w:jc w:val="left"/>
       </w:pPr>
@@ -10830,6 +12603,351 @@
     </w:p>
     <w:p>
       <w:pPr>
+        <w:spacing w:line="360" w:lineRule="auto" w:after="200"/>
+      </w:pPr>
+      <w:r>
+        <w:rPr>
+          <w:rFonts w:ascii="Times New Roman" w:hAnsi="Times New Roman"/>
+          <w:b/>
+          <w:i w:val="0"/>
+          <w:sz w:val="24"/>
+        </w:rPr>
+        <w:t>49. C</w:t>
+      </w:r>
+      <w:r>
+        <w:rPr>
+          <w:rFonts w:ascii="Times New Roman" w:hAnsi="Times New Roman"/>
+          <w:b w:val="0"/>
+          <w:i w:val="0"/>
+          <w:sz w:val="24"/>
+        </w:rPr>
+        <w:t xml:space="preserve"> ((3x⁵ - 1)/(9x¹⁰)). Put f(x) = 3x⁵ in place of x in g: (3x⁵ - 1)/(3x⁵)². The denominator is 3² · (x⁵)² = 9x¹⁰.</w:t>
+      </w:r>
+    </w:p>
+    <w:p>
+      <w:pPr>
+        <w:spacing w:line="360" w:lineRule="auto" w:after="200"/>
+      </w:pPr>
+      <w:r>
+        <w:rPr>
+          <w:rFonts w:ascii="Times New Roman" w:hAnsi="Times New Roman"/>
+          <w:b/>
+          <w:i w:val="0"/>
+          <w:sz w:val="24"/>
+        </w:rPr>
+        <w:t>50. D</w:t>
+      </w:r>
+      <w:r>
+        <w:rPr>
+          <w:rFonts w:ascii="Times New Roman" w:hAnsi="Times New Roman"/>
+          <w:b w:val="0"/>
+          <w:i w:val="0"/>
+          <w:sz w:val="24"/>
+        </w:rPr>
+        <w:t xml:space="preserve"> ([-3, ∞)). The range of f⁻¹ equals the domain of f. For √(x + 3) we need x + 3 ≥ 0, so x ≥ -3: [-3, ∞).</w:t>
+      </w:r>
+    </w:p>
+    <w:p>
+      <w:pPr>
+        <w:spacing w:line="360" w:lineRule="auto" w:after="200"/>
+      </w:pPr>
+      <w:r>
+        <w:rPr>
+          <w:rFonts w:ascii="Times New Roman" w:hAnsi="Times New Roman"/>
+          <w:b/>
+          <w:i w:val="0"/>
+          <w:sz w:val="24"/>
+        </w:rPr>
+        <w:t>51. A</w:t>
+      </w:r>
+      <w:r>
+        <w:rPr>
+          <w:rFonts w:ascii="Times New Roman" w:hAnsi="Times New Roman"/>
+          <w:b w:val="0"/>
+          <w:i w:val="0"/>
+          <w:sz w:val="24"/>
+        </w:rPr>
+        <w:t xml:space="preserve"> ((x - 50)^(1/4)). YOU MISSED THIS ONE. Swap x and y: x = y⁴ + 50. Undo the + 50 first by SUBTRACTING: y⁴ = x - 50. Then take the fourth root: y = (x - 50)^(1/4). The inverse undoes each step in reverse order with the opposite operation, so + 50 becomes - 50.</w:t>
+      </w:r>
+    </w:p>
+    <w:p>
+      <w:pPr>
+        <w:spacing w:line="360" w:lineRule="auto" w:after="200"/>
+      </w:pPr>
+      <w:r>
+        <w:rPr>
+          <w:rFonts w:ascii="Times New Roman" w:hAnsi="Times New Roman"/>
+          <w:b/>
+          <w:i w:val="0"/>
+          <w:sz w:val="24"/>
+        </w:rPr>
+        <w:t>52. B</w:t>
+      </w:r>
+      <w:r>
+        <w:rPr>
+          <w:rFonts w:ascii="Times New Roman" w:hAnsi="Times New Roman"/>
+          <w:b w:val="0"/>
+          <w:i w:val="0"/>
+          <w:sz w:val="24"/>
+        </w:rPr>
+        <w:t xml:space="preserve"> (False). False. A function must give an output for EVERY input in its domain, but √(x + 2) has no real value for x &lt; -2 (e.g. x = -3). With domain [-2, ∞) it would be a function.</w:t>
+      </w:r>
+    </w:p>
+    <w:p>
+      <w:pPr>
+        <w:spacing w:line="360" w:lineRule="auto" w:after="200"/>
+      </w:pPr>
+      <w:r>
+        <w:rPr>
+          <w:rFonts w:ascii="Times New Roman" w:hAnsi="Times New Roman"/>
+          <w:b/>
+          <w:i w:val="0"/>
+          <w:sz w:val="24"/>
+        </w:rPr>
+        <w:t>53. D</w:t>
+      </w:r>
+      <w:r>
+        <w:rPr>
+          <w:rFonts w:ascii="Times New Roman" w:hAnsi="Times New Roman"/>
+          <w:b w:val="0"/>
+          <w:i w:val="0"/>
+          <w:sz w:val="24"/>
+        </w:rPr>
+        <w:t xml:space="preserve"> (Domain [2/3, ∞); Range [0, ∞)). 3x - 2 ≥ 0 gives x ≥ 2/3. A square root is never negative, so the range is [0, ∞).</w:t>
+      </w:r>
+    </w:p>
+    <w:p>
+      <w:pPr>
+        <w:spacing w:line="360" w:lineRule="auto" w:after="200"/>
+      </w:pPr>
+      <w:r>
+        <w:rPr>
+          <w:rFonts w:ascii="Times New Roman" w:hAnsi="Times New Roman"/>
+          <w:b/>
+          <w:i w:val="0"/>
+          <w:sz w:val="24"/>
+        </w:rPr>
+        <w:t>54. A</w:t>
+      </w:r>
+      <w:r>
+        <w:rPr>
+          <w:rFonts w:ascii="Times New Roman" w:hAnsi="Times New Roman"/>
+          <w:b w:val="0"/>
+          <w:i w:val="0"/>
+          <w:sz w:val="24"/>
+        </w:rPr>
+        <w:t xml:space="preserve"> (True). True. Every domain value has exactly one output, and every output is in the codomain. The codomain may contain extra values (5, 7, 9) that are never used.</w:t>
+      </w:r>
+    </w:p>
+    <w:p>
+      <w:pPr>
+        <w:spacing w:line="360" w:lineRule="auto" w:after="200"/>
+      </w:pPr>
+      <w:r>
+        <w:rPr>
+          <w:rFonts w:ascii="Times New Roman" w:hAnsi="Times New Roman"/>
+          <w:b/>
+          <w:i w:val="0"/>
+          <w:sz w:val="24"/>
+        </w:rPr>
+        <w:t>55. B</w:t>
+      </w:r>
+      <w:r>
+        <w:rPr>
+          <w:rFonts w:ascii="Times New Roman" w:hAnsi="Times New Roman"/>
+          <w:b w:val="0"/>
+          <w:i w:val="0"/>
+          <w:sz w:val="24"/>
+        </w:rPr>
+        <w:t xml:space="preserve"> (P = 2,000t + 100,000). Linear model P = (rate)t + (starting value): the slope is 2,000 per year, the intercept is 100,000.</w:t>
+      </w:r>
+    </w:p>
+    <w:p>
+      <w:pPr>
+        <w:spacing w:line="360" w:lineRule="auto" w:after="200"/>
+      </w:pPr>
+      <w:r>
+        <w:rPr>
+          <w:rFonts w:ascii="Times New Roman" w:hAnsi="Times New Roman"/>
+          <w:b/>
+          <w:i w:val="0"/>
+          <w:sz w:val="24"/>
+        </w:rPr>
+        <w:t>56. A</w:t>
+      </w:r>
+      <w:r>
+        <w:rPr>
+          <w:rFonts w:ascii="Times New Roman" w:hAnsi="Times New Roman"/>
+          <w:b w:val="0"/>
+          <w:i w:val="0"/>
+          <w:sz w:val="24"/>
+        </w:rPr>
+        <w:t xml:space="preserve"> ((-∞, 10/3] ∪ [10/3, ∞)). YOU MISSED THIS ONE. g is a line, so its inverse g⁻¹(x) = (x + 10)/3 is also a line, defined for ALL real numbers. The marked answer (-∞, 10/3] ∪ [10/3, ∞) is just an unusual way of writing all real numbers, because 10/3 is included in both pieces. The option you picked leaves out 10/3, which only happens when a denominator is zero, and there is no denominator here. Rule: domain of g⁻¹ = range of g.</w:t>
+      </w:r>
+    </w:p>
+    <w:p>
+      <w:pPr>
+        <w:spacing w:line="360" w:lineRule="auto" w:after="200"/>
+      </w:pPr>
+      <w:r>
+        <w:rPr>
+          <w:rFonts w:ascii="Times New Roman" w:hAnsi="Times New Roman"/>
+          <w:b/>
+          <w:i w:val="0"/>
+          <w:sz w:val="24"/>
+        </w:rPr>
+        <w:t>57. B</w:t>
+      </w:r>
+      <w:r>
+        <w:rPr>
+          <w:rFonts w:ascii="Times New Roman" w:hAnsi="Times New Roman"/>
+          <w:b w:val="0"/>
+          <w:i w:val="0"/>
+          <w:sz w:val="24"/>
+        </w:rPr>
+        <w:t xml:space="preserve"> (y = a(x - h)² + k). TRAP: in our textbook (Abramson, Section 5.1), the STANDARD form of a quadratic function is f(x) = a(x - h)² + k (the vertex form), and ax² + bx + c is called the GENERAL form. Many other books call ax² + bx + c the standard form, which is why the instructor accepted both answers here. On this course's exam, read 'standard form' as a(x - h)² + k.</w:t>
+      </w:r>
+    </w:p>
+    <w:p>
+      <w:pPr>
+        <w:spacing w:line="360" w:lineRule="auto" w:after="200"/>
+      </w:pPr>
+      <w:r>
+        <w:rPr>
+          <w:rFonts w:ascii="Times New Roman" w:hAnsi="Times New Roman"/>
+          <w:b/>
+          <w:i w:val="0"/>
+          <w:sz w:val="24"/>
+        </w:rPr>
+        <w:t>58. C</w:t>
+      </w:r>
+      <w:r>
+        <w:rPr>
+          <w:rFonts w:ascii="Times New Roman" w:hAnsi="Times New Roman"/>
+          <w:b w:val="0"/>
+          <w:i w:val="0"/>
+          <w:sz w:val="24"/>
+        </w:rPr>
+        <w:t xml:space="preserve"> ((-∞, -11) ∪ (-11, 10]). Two rules: under the root 10 - x ≥ 0, so x ≤ 10 (10 included); the denominator x + 11 ≠ 0, so x ≠ -11. Together: (-∞, -11) ∪ (-11, 10].</w:t>
+      </w:r>
+    </w:p>
+    <w:p>
+      <w:pPr>
+        <w:spacing w:line="360" w:lineRule="auto" w:after="200"/>
+      </w:pPr>
+      <w:r>
+        <w:rPr>
+          <w:rFonts w:ascii="Times New Roman" w:hAnsi="Times New Roman"/>
+          <w:b/>
+          <w:i w:val="0"/>
+          <w:sz w:val="24"/>
+        </w:rPr>
+        <w:t>59. A</w:t>
+      </w:r>
+      <w:r>
+        <w:rPr>
+          <w:rFonts w:ascii="Times New Roman" w:hAnsi="Times New Roman"/>
+          <w:b w:val="0"/>
+          <w:i w:val="0"/>
+          <w:sz w:val="24"/>
+        </w:rPr>
+        <w:t xml:space="preserve"> (x² + 32x + 256 = 0). One real solution means the discriminant b² - 4ac = 0: 32² - 4(256) = 1024 - 1024 = 0. It is a perfect square, (x + 16)² = 0.</w:t>
+      </w:r>
+    </w:p>
+    <w:p>
+      <w:pPr>
+        <w:spacing w:line="360" w:lineRule="auto" w:after="200"/>
+      </w:pPr>
+      <w:r>
+        <w:rPr>
+          <w:rFonts w:ascii="Times New Roman" w:hAnsi="Times New Roman"/>
+          <w:b/>
+          <w:i w:val="0"/>
+          <w:sz w:val="24"/>
+        </w:rPr>
+        <w:t>60. B</w:t>
+      </w:r>
+      <w:r>
+        <w:rPr>
+          <w:rFonts w:ascii="Times New Roman" w:hAnsi="Times New Roman"/>
+          <w:b w:val="0"/>
+          <w:i w:val="0"/>
+          <w:sz w:val="24"/>
+        </w:rPr>
+        <w:t xml:space="preserve"> (y = x²). A thrown ball follows a parabola, which is a quadratic (degree 2) function.</w:t>
+      </w:r>
+    </w:p>
+    <w:p>
+      <w:pPr>
+        <w:spacing w:line="360" w:lineRule="auto" w:after="200"/>
+      </w:pPr>
+      <w:r>
+        <w:rPr>
+          <w:rFonts w:ascii="Times New Roman" w:hAnsi="Times New Roman"/>
+          <w:b/>
+          <w:i w:val="0"/>
+          <w:sz w:val="24"/>
+        </w:rPr>
+        <w:t>61. A</w:t>
+      </w:r>
+      <w:r>
+        <w:rPr>
+          <w:rFonts w:ascii="Times New Roman" w:hAnsi="Times New Roman"/>
+          <w:b w:val="0"/>
+          <w:i w:val="0"/>
+          <w:sz w:val="24"/>
+        </w:rPr>
+        <w:t xml:space="preserve"> (10x⁶). Work from the inside out: h(x) = x³, then g(x³) = (x³)² = x⁶, then f(x⁶) = 10x⁶.</w:t>
+      </w:r>
+    </w:p>
+    <w:p>
+      <w:pPr>
+        <w:spacing w:line="360" w:lineRule="auto" w:after="200"/>
+      </w:pPr>
+      <w:r>
+        <w:rPr>
+          <w:rFonts w:ascii="Times New Roman" w:hAnsi="Times New Roman"/>
+          <w:b/>
+          <w:i w:val="0"/>
+          <w:sz w:val="24"/>
+        </w:rPr>
+        <w:t>62. B</w:t>
+      </w:r>
+      <w:r>
+        <w:rPr>
+          <w:rFonts w:ascii="Times New Roman" w:hAnsi="Times New Roman"/>
+          <w:b w:val="0"/>
+          <w:i w:val="0"/>
+          <w:sz w:val="24"/>
+        </w:rPr>
+        <w:t xml:space="preserve"> (Domain (2, ∞); Range (-∞, ∞)). The inside of a log must be &gt; 0: x - 2 &gt; 0, so x &gt; 2 with a ROUND bracket. A log takes every real value.</w:t>
+      </w:r>
+    </w:p>
+    <w:p>
+      <w:pPr>
+        <w:spacing w:line="360" w:lineRule="auto" w:after="200"/>
+      </w:pPr>
+      <w:r>
+        <w:rPr>
+          <w:rFonts w:ascii="Times New Roman" w:hAnsi="Times New Roman"/>
+          <w:b/>
+          <w:i w:val="0"/>
+          <w:sz w:val="24"/>
+        </w:rPr>
+        <w:t>63. A</w:t>
+      </w:r>
+      <w:r>
+        <w:rPr>
+          <w:rFonts w:ascii="Times New Roman" w:hAnsi="Times New Roman"/>
+          <w:b w:val="0"/>
+          <w:i w:val="0"/>
+          <w:sz w:val="24"/>
+        </w:rPr>
+        <w:t xml:space="preserve"> (y = x² + 2x + 1). Quadratic in x means the highest power of x is 2, with y as the output: y = x² + 2x + 1.</w:t>
+      </w:r>
+    </w:p>
+    <w:p>
+      <w:pPr>
         <w:pStyle w:val="Heading1"/>
         <w:jc w:val="left"/>
       </w:pPr>
@@ -10973,6 +13091,72 @@
           <w:sz w:val="24"/>
         </w:rPr>
         <w:t xml:space="preserve"> with multiple choice, you can test each option in the equation when solving directly is slow.</w:t>
+      </w:r>
+    </w:p>
+    <w:p>
+      <w:pPr>
+        <w:spacing w:line="360" w:lineRule="auto" w:after="0"/>
+        <w:ind w:left="720" w:hanging="360"/>
+      </w:pPr>
+      <w:r>
+        <w:rPr>
+          <w:rFonts w:ascii="Times New Roman" w:hAnsi="Times New Roman"/>
+          <w:b w:val="0"/>
+          <w:i w:val="0"/>
+          <w:sz w:val="24"/>
+        </w:rPr>
+        <w:t xml:space="preserve">•  </w:t>
+      </w:r>
+      <w:r>
+        <w:rPr>
+          <w:rFonts w:ascii="Times New Roman" w:hAnsi="Times New Roman"/>
+          <w:b/>
+          <w:i w:val="0"/>
+          <w:sz w:val="24"/>
+        </w:rPr>
+        <w:t>Standard vs general form:</w:t>
+      </w:r>
+      <w:r>
+        <w:rPr>
+          <w:rFonts w:ascii="Times New Roman" w:hAnsi="Times New Roman"/>
+          <w:b w:val="0"/>
+          <w:i w:val="0"/>
+          <w:sz w:val="24"/>
+        </w:rPr>
+        <w:t xml:space="preserve"> in this course "standard form" of a quadratic is a(x - h)² + k.</w:t>
+      </w:r>
+    </w:p>
+    <w:p>
+      <w:pPr>
+        <w:spacing w:line="360" w:lineRule="auto" w:after="0"/>
+        <w:ind w:left="720" w:hanging="360"/>
+      </w:pPr>
+      <w:r>
+        <w:rPr>
+          <w:rFonts w:ascii="Times New Roman" w:hAnsi="Times New Roman"/>
+          <w:b w:val="0"/>
+          <w:i w:val="0"/>
+          <w:sz w:val="24"/>
+        </w:rPr>
+        <w:t xml:space="preserve">•  </w:t>
+      </w:r>
+      <w:r>
+        <w:rPr>
+          <w:rFonts w:ascii="Times New Roman" w:hAnsi="Times New Roman"/>
+          <w:b/>
+          <w:i w:val="0"/>
+          <w:sz w:val="24"/>
+        </w:rPr>
+        <w:t>Inverses:</w:t>
+      </w:r>
+      <w:r>
+        <w:rPr>
+          <w:rFonts w:ascii="Times New Roman" w:hAnsi="Times New Roman"/>
+          <w:b w:val="0"/>
+          <w:i w:val="0"/>
+          <w:sz w:val="24"/>
+        </w:rPr>
+        <w:t xml:space="preserve"> undo each step in reverse with the opposite operation (x⁴ + 50 becomes (x - 50)^(1/4)); the domain of f⁻¹ is the range of f, so a linear function's inverse takes all real numbers.</w:t>
       </w:r>
     </w:p>
     <w:p>

</xml_diff>

<commit_message>
MATH1201 exam prep: add the 15 real Graded Quiz 6 questions with explanations (78 total)
Co-Authored-By: Claude Opus 5.5 <noreply@anthropic.com>
</commit_message>
<xml_diff>
--- a/MATH1201_College_Algebra/Unit9_Final_Exam/Final_Exam_Study_Guide.docx
+++ b/MATH1201_College_Algebra/Unit9_Final_Exam/Final_Exam_Study_Guide.docx
@@ -3929,7 +3929,7 @@
           <w:color w:val="000000"/>
           <w:sz w:val="24"/>
         </w:rPr>
-        <w:t>Part 3: Practice Exam (48 Questions) and Graded Quiz 3 Review</w:t>
+        <w:t>Part 3: Practice Exam (48 Questions) and Graded Quiz Review</w:t>
       </w:r>
     </w:p>
     <w:p>
@@ -11484,6 +11484,1710 @@
     </w:p>
     <w:p>
       <w:pPr>
+        <w:pStyle w:val="Heading2"/>
+        <w:jc w:val="left"/>
+      </w:pPr>
+      <w:r>
+        <w:rPr>
+          <w:rFonts w:ascii="Times New Roman" w:hAnsi="Times New Roman"/>
+          <w:b/>
+          <w:color w:val="000000"/>
+          <w:sz w:val="24"/>
+        </w:rPr>
+        <w:t>Graded Quiz Unit 6 (real questions)</w:t>
+      </w:r>
+    </w:p>
+    <w:p>
+      <w:pPr>
+        <w:spacing w:line="360" w:lineRule="auto" w:after="200"/>
+      </w:pPr>
+      <w:r>
+        <w:rPr>
+          <w:rFonts w:ascii="Times New Roman" w:hAnsi="Times New Roman"/>
+          <w:b/>
+          <w:i w:val="0"/>
+          <w:sz w:val="24"/>
+        </w:rPr>
+        <w:t>64.</w:t>
+      </w:r>
+      <w:r>
+        <w:rPr>
+          <w:rFonts w:ascii="Times New Roman" w:hAnsi="Times New Roman"/>
+          <w:b w:val="0"/>
+          <w:i w:val="0"/>
+          <w:sz w:val="24"/>
+        </w:rPr>
+        <w:t xml:space="preserve"> Which is an example of a polynomial function used to model a real-world situation?</w:t>
+      </w:r>
+    </w:p>
+    <w:p>
+      <w:pPr>
+        <w:spacing w:line="360" w:lineRule="auto" w:after="0"/>
+        <w:ind w:left="720" w:hanging="360"/>
+      </w:pPr>
+      <w:r>
+        <w:rPr>
+          <w:rFonts w:ascii="Times New Roman" w:hAnsi="Times New Roman"/>
+          <w:b w:val="0"/>
+          <w:i w:val="0"/>
+          <w:sz w:val="24"/>
+        </w:rPr>
+        <w:t xml:space="preserve">•  </w:t>
+      </w:r>
+      <w:r>
+        <w:rPr>
+          <w:rFonts w:ascii="Times New Roman" w:hAnsi="Times New Roman"/>
+          <w:b w:val="0"/>
+          <w:i w:val="0"/>
+          <w:sz w:val="24"/>
+        </w:rPr>
+        <w:t>A. f(x) = 1/x</w:t>
+      </w:r>
+    </w:p>
+    <w:p>
+      <w:pPr>
+        <w:spacing w:line="360" w:lineRule="auto" w:after="0"/>
+        <w:ind w:left="720" w:hanging="360"/>
+      </w:pPr>
+      <w:r>
+        <w:rPr>
+          <w:rFonts w:ascii="Times New Roman" w:hAnsi="Times New Roman"/>
+          <w:b w:val="0"/>
+          <w:i w:val="0"/>
+          <w:sz w:val="24"/>
+        </w:rPr>
+        <w:t xml:space="preserve">•  </w:t>
+      </w:r>
+      <w:r>
+        <w:rPr>
+          <w:rFonts w:ascii="Times New Roman" w:hAnsi="Times New Roman"/>
+          <w:b w:val="0"/>
+          <w:i w:val="0"/>
+          <w:sz w:val="24"/>
+        </w:rPr>
+        <w:t>B. f(x) = 3x² - 5x + 2</w:t>
+      </w:r>
+    </w:p>
+    <w:p>
+      <w:pPr>
+        <w:spacing w:line="360" w:lineRule="auto" w:after="0"/>
+        <w:ind w:left="720" w:hanging="360"/>
+      </w:pPr>
+      <w:r>
+        <w:rPr>
+          <w:rFonts w:ascii="Times New Roman" w:hAnsi="Times New Roman"/>
+          <w:b w:val="0"/>
+          <w:i w:val="0"/>
+          <w:sz w:val="24"/>
+        </w:rPr>
+        <w:t xml:space="preserve">•  </w:t>
+      </w:r>
+      <w:r>
+        <w:rPr>
+          <w:rFonts w:ascii="Times New Roman" w:hAnsi="Times New Roman"/>
+          <w:b w:val="0"/>
+          <w:i w:val="0"/>
+          <w:sz w:val="24"/>
+        </w:rPr>
+        <w:t>C. f(x) = √x</w:t>
+      </w:r>
+    </w:p>
+    <w:p>
+      <w:pPr>
+        <w:spacing w:line="360" w:lineRule="auto" w:after="0"/>
+        <w:ind w:left="720" w:hanging="360"/>
+      </w:pPr>
+      <w:r>
+        <w:rPr>
+          <w:rFonts w:ascii="Times New Roman" w:hAnsi="Times New Roman"/>
+          <w:b w:val="0"/>
+          <w:i w:val="0"/>
+          <w:sz w:val="24"/>
+        </w:rPr>
+        <w:t xml:space="preserve">•  </w:t>
+      </w:r>
+      <w:r>
+        <w:rPr>
+          <w:rFonts w:ascii="Times New Roman" w:hAnsi="Times New Roman"/>
+          <w:b w:val="0"/>
+          <w:i w:val="0"/>
+          <w:sz w:val="24"/>
+        </w:rPr>
+        <w:t>D. f(x) = eˣ</w:t>
+      </w:r>
+    </w:p>
+    <w:p>
+      <w:pPr>
+        <w:spacing w:line="360" w:lineRule="auto" w:after="200"/>
+      </w:pPr>
+      <w:r>
+        <w:rPr>
+          <w:rFonts w:ascii="Times New Roman" w:hAnsi="Times New Roman"/>
+          <w:b/>
+          <w:i w:val="0"/>
+          <w:sz w:val="24"/>
+        </w:rPr>
+        <w:t>65.</w:t>
+      </w:r>
+      <w:r>
+        <w:rPr>
+          <w:rFonts w:ascii="Times New Roman" w:hAnsi="Times New Roman"/>
+          <w:b w:val="0"/>
+          <w:i w:val="0"/>
+          <w:sz w:val="24"/>
+        </w:rPr>
+        <w:t xml:space="preserve"> What is the phase shift of 23 sin(7x + 3) - 7?</w:t>
+      </w:r>
+    </w:p>
+    <w:p>
+      <w:pPr>
+        <w:spacing w:line="360" w:lineRule="auto" w:after="0"/>
+        <w:ind w:left="720" w:hanging="360"/>
+      </w:pPr>
+      <w:r>
+        <w:rPr>
+          <w:rFonts w:ascii="Times New Roman" w:hAnsi="Times New Roman"/>
+          <w:b w:val="0"/>
+          <w:i w:val="0"/>
+          <w:sz w:val="24"/>
+        </w:rPr>
+        <w:t xml:space="preserve">•  </w:t>
+      </w:r>
+      <w:r>
+        <w:rPr>
+          <w:rFonts w:ascii="Times New Roman" w:hAnsi="Times New Roman"/>
+          <w:b w:val="0"/>
+          <w:i w:val="0"/>
+          <w:sz w:val="24"/>
+        </w:rPr>
+        <w:t>A. -3/7</w:t>
+      </w:r>
+    </w:p>
+    <w:p>
+      <w:pPr>
+        <w:spacing w:line="360" w:lineRule="auto" w:after="0"/>
+        <w:ind w:left="720" w:hanging="360"/>
+      </w:pPr>
+      <w:r>
+        <w:rPr>
+          <w:rFonts w:ascii="Times New Roman" w:hAnsi="Times New Roman"/>
+          <w:b w:val="0"/>
+          <w:i w:val="0"/>
+          <w:sz w:val="24"/>
+        </w:rPr>
+        <w:t xml:space="preserve">•  </w:t>
+      </w:r>
+      <w:r>
+        <w:rPr>
+          <w:rFonts w:ascii="Times New Roman" w:hAnsi="Times New Roman"/>
+          <w:b w:val="0"/>
+          <w:i w:val="0"/>
+          <w:sz w:val="24"/>
+        </w:rPr>
+        <w:t>B. -7/3</w:t>
+      </w:r>
+    </w:p>
+    <w:p>
+      <w:pPr>
+        <w:spacing w:line="360" w:lineRule="auto" w:after="0"/>
+        <w:ind w:left="720" w:hanging="360"/>
+      </w:pPr>
+      <w:r>
+        <w:rPr>
+          <w:rFonts w:ascii="Times New Roman" w:hAnsi="Times New Roman"/>
+          <w:b w:val="0"/>
+          <w:i w:val="0"/>
+          <w:sz w:val="24"/>
+        </w:rPr>
+        <w:t xml:space="preserve">•  </w:t>
+      </w:r>
+      <w:r>
+        <w:rPr>
+          <w:rFonts w:ascii="Times New Roman" w:hAnsi="Times New Roman"/>
+          <w:b w:val="0"/>
+          <w:i w:val="0"/>
+          <w:sz w:val="24"/>
+        </w:rPr>
+        <w:t>C. 7/3</w:t>
+      </w:r>
+    </w:p>
+    <w:p>
+      <w:pPr>
+        <w:spacing w:line="360" w:lineRule="auto" w:after="0"/>
+        <w:ind w:left="720" w:hanging="360"/>
+      </w:pPr>
+      <w:r>
+        <w:rPr>
+          <w:rFonts w:ascii="Times New Roman" w:hAnsi="Times New Roman"/>
+          <w:b w:val="0"/>
+          <w:i w:val="0"/>
+          <w:sz w:val="24"/>
+        </w:rPr>
+        <w:t xml:space="preserve">•  </w:t>
+      </w:r>
+      <w:r>
+        <w:rPr>
+          <w:rFonts w:ascii="Times New Roman" w:hAnsi="Times New Roman"/>
+          <w:b w:val="0"/>
+          <w:i w:val="0"/>
+          <w:sz w:val="24"/>
+        </w:rPr>
+        <w:t>D. 3/7</w:t>
+      </w:r>
+    </w:p>
+    <w:p>
+      <w:pPr>
+        <w:spacing w:line="360" w:lineRule="auto" w:after="200"/>
+      </w:pPr>
+      <w:r>
+        <w:rPr>
+          <w:rFonts w:ascii="Times New Roman" w:hAnsi="Times New Roman"/>
+          <w:b/>
+          <w:i w:val="0"/>
+          <w:sz w:val="24"/>
+        </w:rPr>
+        <w:t>66.</w:t>
+      </w:r>
+      <w:r>
+        <w:rPr>
+          <w:rFonts w:ascii="Times New Roman" w:hAnsi="Times New Roman"/>
+          <w:b w:val="0"/>
+          <w:i w:val="0"/>
+          <w:sz w:val="24"/>
+        </w:rPr>
+        <w:t xml:space="preserve"> Convert 7 radians to degrees.</w:t>
+      </w:r>
+    </w:p>
+    <w:p>
+      <w:pPr>
+        <w:spacing w:line="360" w:lineRule="auto" w:after="0"/>
+        <w:ind w:left="720" w:hanging="360"/>
+      </w:pPr>
+      <w:r>
+        <w:rPr>
+          <w:rFonts w:ascii="Times New Roman" w:hAnsi="Times New Roman"/>
+          <w:b w:val="0"/>
+          <w:i w:val="0"/>
+          <w:sz w:val="24"/>
+        </w:rPr>
+        <w:t xml:space="preserve">•  </w:t>
+      </w:r>
+      <w:r>
+        <w:rPr>
+          <w:rFonts w:ascii="Times New Roman" w:hAnsi="Times New Roman"/>
+          <w:b w:val="0"/>
+          <w:i w:val="0"/>
+          <w:sz w:val="24"/>
+        </w:rPr>
+        <w:t>A. 401°</w:t>
+      </w:r>
+    </w:p>
+    <w:p>
+      <w:pPr>
+        <w:spacing w:line="360" w:lineRule="auto" w:after="0"/>
+        <w:ind w:left="720" w:hanging="360"/>
+      </w:pPr>
+      <w:r>
+        <w:rPr>
+          <w:rFonts w:ascii="Times New Roman" w:hAnsi="Times New Roman"/>
+          <w:b w:val="0"/>
+          <w:i w:val="0"/>
+          <w:sz w:val="24"/>
+        </w:rPr>
+        <w:t xml:space="preserve">•  </w:t>
+      </w:r>
+      <w:r>
+        <w:rPr>
+          <w:rFonts w:ascii="Times New Roman" w:hAnsi="Times New Roman"/>
+          <w:b w:val="0"/>
+          <w:i w:val="0"/>
+          <w:sz w:val="24"/>
+        </w:rPr>
+        <w:t>B. 2520°</w:t>
+      </w:r>
+    </w:p>
+    <w:p>
+      <w:pPr>
+        <w:spacing w:line="360" w:lineRule="auto" w:after="0"/>
+        <w:ind w:left="720" w:hanging="360"/>
+      </w:pPr>
+      <w:r>
+        <w:rPr>
+          <w:rFonts w:ascii="Times New Roman" w:hAnsi="Times New Roman"/>
+          <w:b w:val="0"/>
+          <w:i w:val="0"/>
+          <w:sz w:val="24"/>
+        </w:rPr>
+        <w:t xml:space="preserve">•  </w:t>
+      </w:r>
+      <w:r>
+        <w:rPr>
+          <w:rFonts w:ascii="Times New Roman" w:hAnsi="Times New Roman"/>
+          <w:b w:val="0"/>
+          <w:i w:val="0"/>
+          <w:sz w:val="24"/>
+        </w:rPr>
+        <w:t>C. 14°</w:t>
+      </w:r>
+    </w:p>
+    <w:p>
+      <w:pPr>
+        <w:spacing w:line="360" w:lineRule="auto" w:after="0"/>
+        <w:ind w:left="720" w:hanging="360"/>
+      </w:pPr>
+      <w:r>
+        <w:rPr>
+          <w:rFonts w:ascii="Times New Roman" w:hAnsi="Times New Roman"/>
+          <w:b w:val="0"/>
+          <w:i w:val="0"/>
+          <w:sz w:val="24"/>
+        </w:rPr>
+        <w:t xml:space="preserve">•  </w:t>
+      </w:r>
+      <w:r>
+        <w:rPr>
+          <w:rFonts w:ascii="Times New Roman" w:hAnsi="Times New Roman"/>
+          <w:b w:val="0"/>
+          <w:i w:val="0"/>
+          <w:sz w:val="24"/>
+        </w:rPr>
+        <w:t>D. 808°</w:t>
+      </w:r>
+    </w:p>
+    <w:p>
+      <w:pPr>
+        <w:spacing w:line="360" w:lineRule="auto" w:after="200"/>
+      </w:pPr>
+      <w:r>
+        <w:rPr>
+          <w:rFonts w:ascii="Times New Roman" w:hAnsi="Times New Roman"/>
+          <w:b/>
+          <w:i w:val="0"/>
+          <w:sz w:val="24"/>
+        </w:rPr>
+        <w:t>67.</w:t>
+      </w:r>
+      <w:r>
+        <w:rPr>
+          <w:rFonts w:ascii="Times New Roman" w:hAnsi="Times New Roman"/>
+          <w:b w:val="0"/>
+          <w:i w:val="0"/>
+          <w:sz w:val="24"/>
+        </w:rPr>
+        <w:t xml:space="preserve"> $25,000 earns 8% compounded annually. How much is there after 3 years?</w:t>
+      </w:r>
+    </w:p>
+    <w:p>
+      <w:pPr>
+        <w:spacing w:line="360" w:lineRule="auto" w:after="0"/>
+        <w:ind w:left="720" w:hanging="360"/>
+      </w:pPr>
+      <w:r>
+        <w:rPr>
+          <w:rFonts w:ascii="Times New Roman" w:hAnsi="Times New Roman"/>
+          <w:b w:val="0"/>
+          <w:i w:val="0"/>
+          <w:sz w:val="24"/>
+        </w:rPr>
+        <w:t xml:space="preserve">•  </w:t>
+      </w:r>
+      <w:r>
+        <w:rPr>
+          <w:rFonts w:ascii="Times New Roman" w:hAnsi="Times New Roman"/>
+          <w:b w:val="0"/>
+          <w:i w:val="0"/>
+          <w:sz w:val="24"/>
+        </w:rPr>
+        <w:t>A. $31492.8</w:t>
+      </w:r>
+    </w:p>
+    <w:p>
+      <w:pPr>
+        <w:spacing w:line="360" w:lineRule="auto" w:after="0"/>
+        <w:ind w:left="720" w:hanging="360"/>
+      </w:pPr>
+      <w:r>
+        <w:rPr>
+          <w:rFonts w:ascii="Times New Roman" w:hAnsi="Times New Roman"/>
+          <w:b w:val="0"/>
+          <w:i w:val="0"/>
+          <w:sz w:val="24"/>
+        </w:rPr>
+        <w:t xml:space="preserve">•  </w:t>
+      </w:r>
+      <w:r>
+        <w:rPr>
+          <w:rFonts w:ascii="Times New Roman" w:hAnsi="Times New Roman"/>
+          <w:b w:val="0"/>
+          <w:i w:val="0"/>
+          <w:sz w:val="24"/>
+        </w:rPr>
+        <w:t>B. $31692.8</w:t>
+      </w:r>
+    </w:p>
+    <w:p>
+      <w:pPr>
+        <w:spacing w:line="360" w:lineRule="auto" w:after="0"/>
+        <w:ind w:left="720" w:hanging="360"/>
+      </w:pPr>
+      <w:r>
+        <w:rPr>
+          <w:rFonts w:ascii="Times New Roman" w:hAnsi="Times New Roman"/>
+          <w:b w:val="0"/>
+          <w:i w:val="0"/>
+          <w:sz w:val="24"/>
+        </w:rPr>
+        <w:t xml:space="preserve">•  </w:t>
+      </w:r>
+      <w:r>
+        <w:rPr>
+          <w:rFonts w:ascii="Times New Roman" w:hAnsi="Times New Roman"/>
+          <w:b w:val="0"/>
+          <w:i w:val="0"/>
+          <w:sz w:val="24"/>
+        </w:rPr>
+        <w:t>C. $31392.8</w:t>
+      </w:r>
+    </w:p>
+    <w:p>
+      <w:pPr>
+        <w:spacing w:line="360" w:lineRule="auto" w:after="0"/>
+        <w:ind w:left="720" w:hanging="360"/>
+      </w:pPr>
+      <w:r>
+        <w:rPr>
+          <w:rFonts w:ascii="Times New Roman" w:hAnsi="Times New Roman"/>
+          <w:b w:val="0"/>
+          <w:i w:val="0"/>
+          <w:sz w:val="24"/>
+        </w:rPr>
+        <w:t xml:space="preserve">•  </w:t>
+      </w:r>
+      <w:r>
+        <w:rPr>
+          <w:rFonts w:ascii="Times New Roman" w:hAnsi="Times New Roman"/>
+          <w:b w:val="0"/>
+          <w:i w:val="0"/>
+          <w:sz w:val="24"/>
+        </w:rPr>
+        <w:t>D. $31592.8</w:t>
+      </w:r>
+    </w:p>
+    <w:p>
+      <w:pPr>
+        <w:spacing w:line="360" w:lineRule="auto" w:after="200"/>
+      </w:pPr>
+      <w:r>
+        <w:rPr>
+          <w:rFonts w:ascii="Times New Roman" w:hAnsi="Times New Roman"/>
+          <w:b/>
+          <w:i w:val="0"/>
+          <w:sz w:val="24"/>
+        </w:rPr>
+        <w:t>68.</w:t>
+      </w:r>
+      <w:r>
+        <w:rPr>
+          <w:rFonts w:ascii="Times New Roman" w:hAnsi="Times New Roman"/>
+          <w:b w:val="0"/>
+          <w:i w:val="0"/>
+          <w:sz w:val="24"/>
+        </w:rPr>
+        <w:t xml:space="preserve"> How many intercepts and turning points can 20x¹⁰ + 6x⁹ - 3x⁵ - 10x⁴ have (at most)?</w:t>
+      </w:r>
+    </w:p>
+    <w:p>
+      <w:pPr>
+        <w:spacing w:line="360" w:lineRule="auto" w:after="0"/>
+        <w:ind w:left="720" w:hanging="360"/>
+      </w:pPr>
+      <w:r>
+        <w:rPr>
+          <w:rFonts w:ascii="Times New Roman" w:hAnsi="Times New Roman"/>
+          <w:b w:val="0"/>
+          <w:i w:val="0"/>
+          <w:sz w:val="24"/>
+        </w:rPr>
+        <w:t xml:space="preserve">•  </w:t>
+      </w:r>
+      <w:r>
+        <w:rPr>
+          <w:rFonts w:ascii="Times New Roman" w:hAnsi="Times New Roman"/>
+          <w:b w:val="0"/>
+          <w:i w:val="0"/>
+          <w:sz w:val="24"/>
+        </w:rPr>
+        <w:t>A. 6, 5</w:t>
+      </w:r>
+    </w:p>
+    <w:p>
+      <w:pPr>
+        <w:spacing w:line="360" w:lineRule="auto" w:after="0"/>
+        <w:ind w:left="720" w:hanging="360"/>
+      </w:pPr>
+      <w:r>
+        <w:rPr>
+          <w:rFonts w:ascii="Times New Roman" w:hAnsi="Times New Roman"/>
+          <w:b w:val="0"/>
+          <w:i w:val="0"/>
+          <w:sz w:val="24"/>
+        </w:rPr>
+        <w:t xml:space="preserve">•  </w:t>
+      </w:r>
+      <w:r>
+        <w:rPr>
+          <w:rFonts w:ascii="Times New Roman" w:hAnsi="Times New Roman"/>
+          <w:b w:val="0"/>
+          <w:i w:val="0"/>
+          <w:sz w:val="24"/>
+        </w:rPr>
+        <w:t>B. 5, 6</w:t>
+      </w:r>
+    </w:p>
+    <w:p>
+      <w:pPr>
+        <w:spacing w:line="360" w:lineRule="auto" w:after="0"/>
+        <w:ind w:left="720" w:hanging="360"/>
+      </w:pPr>
+      <w:r>
+        <w:rPr>
+          <w:rFonts w:ascii="Times New Roman" w:hAnsi="Times New Roman"/>
+          <w:b w:val="0"/>
+          <w:i w:val="0"/>
+          <w:sz w:val="24"/>
+        </w:rPr>
+        <w:t xml:space="preserve">•  </w:t>
+      </w:r>
+      <w:r>
+        <w:rPr>
+          <w:rFonts w:ascii="Times New Roman" w:hAnsi="Times New Roman"/>
+          <w:b w:val="0"/>
+          <w:i w:val="0"/>
+          <w:sz w:val="24"/>
+        </w:rPr>
+        <w:t>C. 9, 10</w:t>
+      </w:r>
+    </w:p>
+    <w:p>
+      <w:pPr>
+        <w:spacing w:line="360" w:lineRule="auto" w:after="0"/>
+        <w:ind w:left="720" w:hanging="360"/>
+      </w:pPr>
+      <w:r>
+        <w:rPr>
+          <w:rFonts w:ascii="Times New Roman" w:hAnsi="Times New Roman"/>
+          <w:b w:val="0"/>
+          <w:i w:val="0"/>
+          <w:sz w:val="24"/>
+        </w:rPr>
+        <w:t xml:space="preserve">•  </w:t>
+      </w:r>
+      <w:r>
+        <w:rPr>
+          <w:rFonts w:ascii="Times New Roman" w:hAnsi="Times New Roman"/>
+          <w:b w:val="0"/>
+          <w:i w:val="0"/>
+          <w:sz w:val="24"/>
+        </w:rPr>
+        <w:t>D. 10, 9</w:t>
+      </w:r>
+    </w:p>
+    <w:p>
+      <w:pPr>
+        <w:spacing w:line="360" w:lineRule="auto" w:after="200"/>
+      </w:pPr>
+      <w:r>
+        <w:rPr>
+          <w:rFonts w:ascii="Times New Roman" w:hAnsi="Times New Roman"/>
+          <w:b/>
+          <w:i w:val="0"/>
+          <w:sz w:val="24"/>
+        </w:rPr>
+        <w:t>69.</w:t>
+      </w:r>
+      <w:r>
+        <w:rPr>
+          <w:rFonts w:ascii="Times New Roman" w:hAnsi="Times New Roman"/>
+          <w:b w:val="0"/>
+          <w:i w:val="0"/>
+          <w:sz w:val="24"/>
+        </w:rPr>
+        <w:t xml:space="preserve"> What are the domain and range of log(4x + 5)?</w:t>
+      </w:r>
+    </w:p>
+    <w:p>
+      <w:pPr>
+        <w:spacing w:line="360" w:lineRule="auto" w:after="0"/>
+        <w:ind w:left="720" w:hanging="360"/>
+      </w:pPr>
+      <w:r>
+        <w:rPr>
+          <w:rFonts w:ascii="Times New Roman" w:hAnsi="Times New Roman"/>
+          <w:b w:val="0"/>
+          <w:i w:val="0"/>
+          <w:sz w:val="24"/>
+        </w:rPr>
+        <w:t xml:space="preserve">•  </w:t>
+      </w:r>
+      <w:r>
+        <w:rPr>
+          <w:rFonts w:ascii="Times New Roman" w:hAnsi="Times New Roman"/>
+          <w:b w:val="0"/>
+          <w:i w:val="0"/>
+          <w:sz w:val="24"/>
+        </w:rPr>
+        <w:t>A. (-∞, ∞), (-∞, ∞)</w:t>
+      </w:r>
+    </w:p>
+    <w:p>
+      <w:pPr>
+        <w:spacing w:line="360" w:lineRule="auto" w:after="0"/>
+        <w:ind w:left="720" w:hanging="360"/>
+      </w:pPr>
+      <w:r>
+        <w:rPr>
+          <w:rFonts w:ascii="Times New Roman" w:hAnsi="Times New Roman"/>
+          <w:b w:val="0"/>
+          <w:i w:val="0"/>
+          <w:sz w:val="24"/>
+        </w:rPr>
+        <w:t xml:space="preserve">•  </w:t>
+      </w:r>
+      <w:r>
+        <w:rPr>
+          <w:rFonts w:ascii="Times New Roman" w:hAnsi="Times New Roman"/>
+          <w:b w:val="0"/>
+          <w:i w:val="0"/>
+          <w:sz w:val="24"/>
+        </w:rPr>
+        <w:t>B. (0, ∞), (-∞, ∞)</w:t>
+      </w:r>
+    </w:p>
+    <w:p>
+      <w:pPr>
+        <w:spacing w:line="360" w:lineRule="auto" w:after="0"/>
+        <w:ind w:left="720" w:hanging="360"/>
+      </w:pPr>
+      <w:r>
+        <w:rPr>
+          <w:rFonts w:ascii="Times New Roman" w:hAnsi="Times New Roman"/>
+          <w:b w:val="0"/>
+          <w:i w:val="0"/>
+          <w:sz w:val="24"/>
+        </w:rPr>
+        <w:t xml:space="preserve">•  </w:t>
+      </w:r>
+      <w:r>
+        <w:rPr>
+          <w:rFonts w:ascii="Times New Roman" w:hAnsi="Times New Roman"/>
+          <w:b w:val="0"/>
+          <w:i w:val="0"/>
+          <w:sz w:val="24"/>
+        </w:rPr>
+        <w:t>C. (-5/4, ∞), (-∞, ∞)</w:t>
+      </w:r>
+    </w:p>
+    <w:p>
+      <w:pPr>
+        <w:spacing w:line="360" w:lineRule="auto" w:after="0"/>
+        <w:ind w:left="720" w:hanging="360"/>
+      </w:pPr>
+      <w:r>
+        <w:rPr>
+          <w:rFonts w:ascii="Times New Roman" w:hAnsi="Times New Roman"/>
+          <w:b w:val="0"/>
+          <w:i w:val="0"/>
+          <w:sz w:val="24"/>
+        </w:rPr>
+        <w:t xml:space="preserve">•  </w:t>
+      </w:r>
+      <w:r>
+        <w:rPr>
+          <w:rFonts w:ascii="Times New Roman" w:hAnsi="Times New Roman"/>
+          <w:b w:val="0"/>
+          <w:i w:val="0"/>
+          <w:sz w:val="24"/>
+        </w:rPr>
+        <w:t>D. (5/4, ∞), (0, ∞)</w:t>
+      </w:r>
+    </w:p>
+    <w:p>
+      <w:pPr>
+        <w:spacing w:line="360" w:lineRule="auto" w:after="200"/>
+      </w:pPr>
+      <w:r>
+        <w:rPr>
+          <w:rFonts w:ascii="Times New Roman" w:hAnsi="Times New Roman"/>
+          <w:b/>
+          <w:i w:val="0"/>
+          <w:sz w:val="24"/>
+        </w:rPr>
+        <w:t>70.</w:t>
+      </w:r>
+      <w:r>
+        <w:rPr>
+          <w:rFonts w:ascii="Times New Roman" w:hAnsi="Times New Roman"/>
+          <w:b w:val="0"/>
+          <w:i w:val="0"/>
+          <w:sz w:val="24"/>
+        </w:rPr>
+        <w:t xml:space="preserve"> A picture shows a straight line and a U-shaped curve drawn together on the same axes; the U-shaped curve stops at the top instead of continuing. True or false: this graph can be a polynomial of degree 2 or more.</w:t>
+      </w:r>
+    </w:p>
+    <w:p>
+      <w:pPr>
+        <w:spacing w:line="360" w:lineRule="auto" w:after="0"/>
+        <w:ind w:left="720" w:hanging="360"/>
+      </w:pPr>
+      <w:r>
+        <w:rPr>
+          <w:rFonts w:ascii="Times New Roman" w:hAnsi="Times New Roman"/>
+          <w:b w:val="0"/>
+          <w:i w:val="0"/>
+          <w:sz w:val="24"/>
+        </w:rPr>
+        <w:t xml:space="preserve">•  </w:t>
+      </w:r>
+      <w:r>
+        <w:rPr>
+          <w:rFonts w:ascii="Times New Roman" w:hAnsi="Times New Roman"/>
+          <w:b w:val="0"/>
+          <w:i w:val="0"/>
+          <w:sz w:val="24"/>
+        </w:rPr>
+        <w:t>A. True</w:t>
+      </w:r>
+    </w:p>
+    <w:p>
+      <w:pPr>
+        <w:spacing w:line="360" w:lineRule="auto" w:after="0"/>
+        <w:ind w:left="720" w:hanging="360"/>
+      </w:pPr>
+      <w:r>
+        <w:rPr>
+          <w:rFonts w:ascii="Times New Roman" w:hAnsi="Times New Roman"/>
+          <w:b w:val="0"/>
+          <w:i w:val="0"/>
+          <w:sz w:val="24"/>
+        </w:rPr>
+        <w:t xml:space="preserve">•  </w:t>
+      </w:r>
+      <w:r>
+        <w:rPr>
+          <w:rFonts w:ascii="Times New Roman" w:hAnsi="Times New Roman"/>
+          <w:b w:val="0"/>
+          <w:i w:val="0"/>
+          <w:sz w:val="24"/>
+        </w:rPr>
+        <w:t>B. False</w:t>
+      </w:r>
+    </w:p>
+    <w:p>
+      <w:pPr>
+        <w:spacing w:line="360" w:lineRule="auto" w:after="200"/>
+      </w:pPr>
+      <w:r>
+        <w:rPr>
+          <w:rFonts w:ascii="Times New Roman" w:hAnsi="Times New Roman"/>
+          <w:b/>
+          <w:i w:val="0"/>
+          <w:sz w:val="24"/>
+        </w:rPr>
+        <w:t>71.</w:t>
+      </w:r>
+      <w:r>
+        <w:rPr>
+          <w:rFonts w:ascii="Times New Roman" w:hAnsi="Times New Roman"/>
+          <w:b w:val="0"/>
+          <w:i w:val="0"/>
+          <w:sz w:val="24"/>
+        </w:rPr>
+        <w:t xml:space="preserve"> What does the 10 in 20(10ˣ) determine?</w:t>
+      </w:r>
+    </w:p>
+    <w:p>
+      <w:pPr>
+        <w:spacing w:line="360" w:lineRule="auto" w:after="0"/>
+        <w:ind w:left="720" w:hanging="360"/>
+      </w:pPr>
+      <w:r>
+        <w:rPr>
+          <w:rFonts w:ascii="Times New Roman" w:hAnsi="Times New Roman"/>
+          <w:b w:val="0"/>
+          <w:i w:val="0"/>
+          <w:sz w:val="24"/>
+        </w:rPr>
+        <w:t xml:space="preserve">•  </w:t>
+      </w:r>
+      <w:r>
+        <w:rPr>
+          <w:rFonts w:ascii="Times New Roman" w:hAnsi="Times New Roman"/>
+          <w:b w:val="0"/>
+          <w:i w:val="0"/>
+          <w:sz w:val="24"/>
+        </w:rPr>
+        <w:t>A. x-intercept</w:t>
+      </w:r>
+    </w:p>
+    <w:p>
+      <w:pPr>
+        <w:spacing w:line="360" w:lineRule="auto" w:after="0"/>
+        <w:ind w:left="720" w:hanging="360"/>
+      </w:pPr>
+      <w:r>
+        <w:rPr>
+          <w:rFonts w:ascii="Times New Roman" w:hAnsi="Times New Roman"/>
+          <w:b w:val="0"/>
+          <w:i w:val="0"/>
+          <w:sz w:val="24"/>
+        </w:rPr>
+        <w:t xml:space="preserve">•  </w:t>
+      </w:r>
+      <w:r>
+        <w:rPr>
+          <w:rFonts w:ascii="Times New Roman" w:hAnsi="Times New Roman"/>
+          <w:b w:val="0"/>
+          <w:i w:val="0"/>
+          <w:sz w:val="24"/>
+        </w:rPr>
+        <w:t>B. y-intercept</w:t>
+      </w:r>
+    </w:p>
+    <w:p>
+      <w:pPr>
+        <w:spacing w:line="360" w:lineRule="auto" w:after="0"/>
+        <w:ind w:left="720" w:hanging="360"/>
+      </w:pPr>
+      <w:r>
+        <w:rPr>
+          <w:rFonts w:ascii="Times New Roman" w:hAnsi="Times New Roman"/>
+          <w:b w:val="0"/>
+          <w:i w:val="0"/>
+          <w:sz w:val="24"/>
+        </w:rPr>
+        <w:t xml:space="preserve">•  </w:t>
+      </w:r>
+      <w:r>
+        <w:rPr>
+          <w:rFonts w:ascii="Times New Roman" w:hAnsi="Times New Roman"/>
+          <w:b w:val="0"/>
+          <w:i w:val="0"/>
+          <w:sz w:val="24"/>
+        </w:rPr>
+        <w:t>C. rate of growth or decay</w:t>
+      </w:r>
+    </w:p>
+    <w:p>
+      <w:pPr>
+        <w:spacing w:line="360" w:lineRule="auto" w:after="0"/>
+        <w:ind w:left="720" w:hanging="360"/>
+      </w:pPr>
+      <w:r>
+        <w:rPr>
+          <w:rFonts w:ascii="Times New Roman" w:hAnsi="Times New Roman"/>
+          <w:b w:val="0"/>
+          <w:i w:val="0"/>
+          <w:sz w:val="24"/>
+        </w:rPr>
+        <w:t xml:space="preserve">•  </w:t>
+      </w:r>
+      <w:r>
+        <w:rPr>
+          <w:rFonts w:ascii="Times New Roman" w:hAnsi="Times New Roman"/>
+          <w:b w:val="0"/>
+          <w:i w:val="0"/>
+          <w:sz w:val="24"/>
+        </w:rPr>
+        <w:t>D. slope of the tangent line</w:t>
+      </w:r>
+    </w:p>
+    <w:p>
+      <w:pPr>
+        <w:spacing w:line="360" w:lineRule="auto" w:after="200"/>
+      </w:pPr>
+      <w:r>
+        <w:rPr>
+          <w:rFonts w:ascii="Times New Roman" w:hAnsi="Times New Roman"/>
+          <w:b/>
+          <w:i w:val="0"/>
+          <w:sz w:val="24"/>
+        </w:rPr>
+        <w:t>72.</w:t>
+      </w:r>
+      <w:r>
+        <w:rPr>
+          <w:rFonts w:ascii="Times New Roman" w:hAnsi="Times New Roman"/>
+          <w:b w:val="0"/>
+          <w:i w:val="0"/>
+          <w:sz w:val="24"/>
+        </w:rPr>
+        <w:t xml:space="preserve"> After 3 years at 6% compounded annually, an account holds $8,000. What was the principal?</w:t>
+      </w:r>
+    </w:p>
+    <w:p>
+      <w:pPr>
+        <w:spacing w:line="360" w:lineRule="auto" w:after="0"/>
+        <w:ind w:left="720" w:hanging="360"/>
+      </w:pPr>
+      <w:r>
+        <w:rPr>
+          <w:rFonts w:ascii="Times New Roman" w:hAnsi="Times New Roman"/>
+          <w:b w:val="0"/>
+          <w:i w:val="0"/>
+          <w:sz w:val="24"/>
+        </w:rPr>
+        <w:t xml:space="preserve">•  </w:t>
+      </w:r>
+      <w:r>
+        <w:rPr>
+          <w:rFonts w:ascii="Times New Roman" w:hAnsi="Times New Roman"/>
+          <w:b w:val="0"/>
+          <w:i w:val="0"/>
+          <w:sz w:val="24"/>
+        </w:rPr>
+        <w:t>A. $6000</w:t>
+      </w:r>
+    </w:p>
+    <w:p>
+      <w:pPr>
+        <w:spacing w:line="360" w:lineRule="auto" w:after="0"/>
+        <w:ind w:left="720" w:hanging="360"/>
+      </w:pPr>
+      <w:r>
+        <w:rPr>
+          <w:rFonts w:ascii="Times New Roman" w:hAnsi="Times New Roman"/>
+          <w:b w:val="0"/>
+          <w:i w:val="0"/>
+          <w:sz w:val="24"/>
+        </w:rPr>
+        <w:t xml:space="preserve">•  </w:t>
+      </w:r>
+      <w:r>
+        <w:rPr>
+          <w:rFonts w:ascii="Times New Roman" w:hAnsi="Times New Roman"/>
+          <w:b w:val="0"/>
+          <w:i w:val="0"/>
+          <w:sz w:val="24"/>
+        </w:rPr>
+        <w:t>B. $6800</w:t>
+      </w:r>
+    </w:p>
+    <w:p>
+      <w:pPr>
+        <w:spacing w:line="360" w:lineRule="auto" w:after="0"/>
+        <w:ind w:left="720" w:hanging="360"/>
+      </w:pPr>
+      <w:r>
+        <w:rPr>
+          <w:rFonts w:ascii="Times New Roman" w:hAnsi="Times New Roman"/>
+          <w:b w:val="0"/>
+          <w:i w:val="0"/>
+          <w:sz w:val="24"/>
+        </w:rPr>
+        <w:t xml:space="preserve">•  </w:t>
+      </w:r>
+      <w:r>
+        <w:rPr>
+          <w:rFonts w:ascii="Times New Roman" w:hAnsi="Times New Roman"/>
+          <w:b w:val="0"/>
+          <w:i w:val="0"/>
+          <w:sz w:val="24"/>
+        </w:rPr>
+        <w:t>C. $6,720</w:t>
+      </w:r>
+    </w:p>
+    <w:p>
+      <w:pPr>
+        <w:spacing w:line="360" w:lineRule="auto" w:after="0"/>
+        <w:ind w:left="720" w:hanging="360"/>
+      </w:pPr>
+      <w:r>
+        <w:rPr>
+          <w:rFonts w:ascii="Times New Roman" w:hAnsi="Times New Roman"/>
+          <w:b w:val="0"/>
+          <w:i w:val="0"/>
+          <w:sz w:val="24"/>
+        </w:rPr>
+        <w:t xml:space="preserve">•  </w:t>
+      </w:r>
+      <w:r>
+        <w:rPr>
+          <w:rFonts w:ascii="Times New Roman" w:hAnsi="Times New Roman"/>
+          <w:b w:val="0"/>
+          <w:i w:val="0"/>
+          <w:sz w:val="24"/>
+        </w:rPr>
+        <w:t>D. $5550</w:t>
+      </w:r>
+    </w:p>
+    <w:p>
+      <w:pPr>
+        <w:spacing w:line="360" w:lineRule="auto" w:after="200"/>
+      </w:pPr>
+      <w:r>
+        <w:rPr>
+          <w:rFonts w:ascii="Times New Roman" w:hAnsi="Times New Roman"/>
+          <w:b/>
+          <w:i w:val="0"/>
+          <w:sz w:val="24"/>
+        </w:rPr>
+        <w:t>73.</w:t>
+      </w:r>
+      <w:r>
+        <w:rPr>
+          <w:rFonts w:ascii="Times New Roman" w:hAnsi="Times New Roman"/>
+          <w:b w:val="0"/>
+          <w:i w:val="0"/>
+          <w:sz w:val="24"/>
+        </w:rPr>
+        <w:t xml:space="preserve"> Solve 5 = 6(2ˣ) + 4.</w:t>
+      </w:r>
+    </w:p>
+    <w:p>
+      <w:pPr>
+        <w:spacing w:line="360" w:lineRule="auto" w:after="0"/>
+        <w:ind w:left="720" w:hanging="360"/>
+      </w:pPr>
+      <w:r>
+        <w:rPr>
+          <w:rFonts w:ascii="Times New Roman" w:hAnsi="Times New Roman"/>
+          <w:b w:val="0"/>
+          <w:i w:val="0"/>
+          <w:sz w:val="24"/>
+        </w:rPr>
+        <w:t xml:space="preserve">•  </w:t>
+      </w:r>
+      <w:r>
+        <w:rPr>
+          <w:rFonts w:ascii="Times New Roman" w:hAnsi="Times New Roman"/>
+          <w:b w:val="0"/>
+          <w:i w:val="0"/>
+          <w:sz w:val="24"/>
+        </w:rPr>
+        <w:t>A. -2.5849</w:t>
+      </w:r>
+    </w:p>
+    <w:p>
+      <w:pPr>
+        <w:spacing w:line="360" w:lineRule="auto" w:after="0"/>
+        <w:ind w:left="720" w:hanging="360"/>
+      </w:pPr>
+      <w:r>
+        <w:rPr>
+          <w:rFonts w:ascii="Times New Roman" w:hAnsi="Times New Roman"/>
+          <w:b w:val="0"/>
+          <w:i w:val="0"/>
+          <w:sz w:val="24"/>
+        </w:rPr>
+        <w:t xml:space="preserve">•  </w:t>
+      </w:r>
+      <w:r>
+        <w:rPr>
+          <w:rFonts w:ascii="Times New Roman" w:hAnsi="Times New Roman"/>
+          <w:b w:val="0"/>
+          <w:i w:val="0"/>
+          <w:sz w:val="24"/>
+        </w:rPr>
+        <w:t>B. 2.5849</w:t>
+      </w:r>
+    </w:p>
+    <w:p>
+      <w:pPr>
+        <w:spacing w:line="360" w:lineRule="auto" w:after="0"/>
+        <w:ind w:left="720" w:hanging="360"/>
+      </w:pPr>
+      <w:r>
+        <w:rPr>
+          <w:rFonts w:ascii="Times New Roman" w:hAnsi="Times New Roman"/>
+          <w:b w:val="0"/>
+          <w:i w:val="0"/>
+          <w:sz w:val="24"/>
+        </w:rPr>
+        <w:t xml:space="preserve">•  </w:t>
+      </w:r>
+      <w:r>
+        <w:rPr>
+          <w:rFonts w:ascii="Times New Roman" w:hAnsi="Times New Roman"/>
+          <w:b w:val="0"/>
+          <w:i w:val="0"/>
+          <w:sz w:val="24"/>
+        </w:rPr>
+        <w:t>C. 0.3868</w:t>
+      </w:r>
+    </w:p>
+    <w:p>
+      <w:pPr>
+        <w:spacing w:line="360" w:lineRule="auto" w:after="0"/>
+        <w:ind w:left="720" w:hanging="360"/>
+      </w:pPr>
+      <w:r>
+        <w:rPr>
+          <w:rFonts w:ascii="Times New Roman" w:hAnsi="Times New Roman"/>
+          <w:b w:val="0"/>
+          <w:i w:val="0"/>
+          <w:sz w:val="24"/>
+        </w:rPr>
+        <w:t xml:space="preserve">•  </w:t>
+      </w:r>
+      <w:r>
+        <w:rPr>
+          <w:rFonts w:ascii="Times New Roman" w:hAnsi="Times New Roman"/>
+          <w:b w:val="0"/>
+          <w:i w:val="0"/>
+          <w:sz w:val="24"/>
+        </w:rPr>
+        <w:t>D. -0.3868</w:t>
+      </w:r>
+    </w:p>
+    <w:p>
+      <w:pPr>
+        <w:spacing w:line="360" w:lineRule="auto" w:after="200"/>
+      </w:pPr>
+      <w:r>
+        <w:rPr>
+          <w:rFonts w:ascii="Times New Roman" w:hAnsi="Times New Roman"/>
+          <w:b/>
+          <w:i w:val="0"/>
+          <w:sz w:val="24"/>
+        </w:rPr>
+        <w:t>74.</w:t>
+      </w:r>
+      <w:r>
+        <w:rPr>
+          <w:rFonts w:ascii="Times New Roman" w:hAnsi="Times New Roman"/>
+          <w:b w:val="0"/>
+          <w:i w:val="0"/>
+          <w:sz w:val="24"/>
+        </w:rPr>
+        <w:t xml:space="preserve"> 25 log₁₀₀ x + 25 compared with log₁₀₀ x is a vertical compression by 25.</w:t>
+      </w:r>
+    </w:p>
+    <w:p>
+      <w:pPr>
+        <w:spacing w:line="360" w:lineRule="auto" w:after="0"/>
+        <w:ind w:left="720" w:hanging="360"/>
+      </w:pPr>
+      <w:r>
+        <w:rPr>
+          <w:rFonts w:ascii="Times New Roman" w:hAnsi="Times New Roman"/>
+          <w:b w:val="0"/>
+          <w:i w:val="0"/>
+          <w:sz w:val="24"/>
+        </w:rPr>
+        <w:t xml:space="preserve">•  </w:t>
+      </w:r>
+      <w:r>
+        <w:rPr>
+          <w:rFonts w:ascii="Times New Roman" w:hAnsi="Times New Roman"/>
+          <w:b w:val="0"/>
+          <w:i w:val="0"/>
+          <w:sz w:val="24"/>
+        </w:rPr>
+        <w:t>A. True</w:t>
+      </w:r>
+    </w:p>
+    <w:p>
+      <w:pPr>
+        <w:spacing w:line="360" w:lineRule="auto" w:after="0"/>
+        <w:ind w:left="720" w:hanging="360"/>
+      </w:pPr>
+      <w:r>
+        <w:rPr>
+          <w:rFonts w:ascii="Times New Roman" w:hAnsi="Times New Roman"/>
+          <w:b w:val="0"/>
+          <w:i w:val="0"/>
+          <w:sz w:val="24"/>
+        </w:rPr>
+        <w:t xml:space="preserve">•  </w:t>
+      </w:r>
+      <w:r>
+        <w:rPr>
+          <w:rFonts w:ascii="Times New Roman" w:hAnsi="Times New Roman"/>
+          <w:b w:val="0"/>
+          <w:i w:val="0"/>
+          <w:sz w:val="24"/>
+        </w:rPr>
+        <w:t>B. False</w:t>
+      </w:r>
+    </w:p>
+    <w:p>
+      <w:pPr>
+        <w:spacing w:line="360" w:lineRule="auto" w:after="200"/>
+      </w:pPr>
+      <w:r>
+        <w:rPr>
+          <w:rFonts w:ascii="Times New Roman" w:hAnsi="Times New Roman"/>
+          <w:b/>
+          <w:i w:val="0"/>
+          <w:sz w:val="24"/>
+        </w:rPr>
+        <w:t>75.</w:t>
+      </w:r>
+      <w:r>
+        <w:rPr>
+          <w:rFonts w:ascii="Times New Roman" w:hAnsi="Times New Roman"/>
+          <w:b w:val="0"/>
+          <w:i w:val="0"/>
+          <w:sz w:val="24"/>
+        </w:rPr>
+        <w:t xml:space="preserve"> The angle of elevation to the top of a 20 m tree is 60°. About how far is the observer from the tree?</w:t>
+      </w:r>
+    </w:p>
+    <w:p>
+      <w:pPr>
+        <w:spacing w:line="360" w:lineRule="auto" w:after="0"/>
+        <w:ind w:left="720" w:hanging="360"/>
+      </w:pPr>
+      <w:r>
+        <w:rPr>
+          <w:rFonts w:ascii="Times New Roman" w:hAnsi="Times New Roman"/>
+          <w:b w:val="0"/>
+          <w:i w:val="0"/>
+          <w:sz w:val="24"/>
+        </w:rPr>
+        <w:t xml:space="preserve">•  </w:t>
+      </w:r>
+      <w:r>
+        <w:rPr>
+          <w:rFonts w:ascii="Times New Roman" w:hAnsi="Times New Roman"/>
+          <w:b w:val="0"/>
+          <w:i w:val="0"/>
+          <w:sz w:val="24"/>
+        </w:rPr>
+        <w:t>A. 34.6 meters</w:t>
+      </w:r>
+    </w:p>
+    <w:p>
+      <w:pPr>
+        <w:spacing w:line="360" w:lineRule="auto" w:after="0"/>
+        <w:ind w:left="720" w:hanging="360"/>
+      </w:pPr>
+      <w:r>
+        <w:rPr>
+          <w:rFonts w:ascii="Times New Roman" w:hAnsi="Times New Roman"/>
+          <w:b w:val="0"/>
+          <w:i w:val="0"/>
+          <w:sz w:val="24"/>
+        </w:rPr>
+        <w:t xml:space="preserve">•  </w:t>
+      </w:r>
+      <w:r>
+        <w:rPr>
+          <w:rFonts w:ascii="Times New Roman" w:hAnsi="Times New Roman"/>
+          <w:b w:val="0"/>
+          <w:i w:val="0"/>
+          <w:sz w:val="24"/>
+        </w:rPr>
+        <w:t>B. 20 meters</w:t>
+      </w:r>
+    </w:p>
+    <w:p>
+      <w:pPr>
+        <w:spacing w:line="360" w:lineRule="auto" w:after="0"/>
+        <w:ind w:left="720" w:hanging="360"/>
+      </w:pPr>
+      <w:r>
+        <w:rPr>
+          <w:rFonts w:ascii="Times New Roman" w:hAnsi="Times New Roman"/>
+          <w:b w:val="0"/>
+          <w:i w:val="0"/>
+          <w:sz w:val="24"/>
+        </w:rPr>
+        <w:t xml:space="preserve">•  </w:t>
+      </w:r>
+      <w:r>
+        <w:rPr>
+          <w:rFonts w:ascii="Times New Roman" w:hAnsi="Times New Roman"/>
+          <w:b w:val="0"/>
+          <w:i w:val="0"/>
+          <w:sz w:val="24"/>
+        </w:rPr>
+        <w:t>C. 11.54 meters</w:t>
+      </w:r>
+    </w:p>
+    <w:p>
+      <w:pPr>
+        <w:spacing w:line="360" w:lineRule="auto" w:after="0"/>
+        <w:ind w:left="720" w:hanging="360"/>
+      </w:pPr>
+      <w:r>
+        <w:rPr>
+          <w:rFonts w:ascii="Times New Roman" w:hAnsi="Times New Roman"/>
+          <w:b w:val="0"/>
+          <w:i w:val="0"/>
+          <w:sz w:val="24"/>
+        </w:rPr>
+        <w:t xml:space="preserve">•  </w:t>
+      </w:r>
+      <w:r>
+        <w:rPr>
+          <w:rFonts w:ascii="Times New Roman" w:hAnsi="Times New Roman"/>
+          <w:b w:val="0"/>
+          <w:i w:val="0"/>
+          <w:sz w:val="24"/>
+        </w:rPr>
+        <w:t>D. 40 meters</w:t>
+      </w:r>
+    </w:p>
+    <w:p>
+      <w:pPr>
+        <w:spacing w:line="360" w:lineRule="auto" w:after="200"/>
+      </w:pPr>
+      <w:r>
+        <w:rPr>
+          <w:rFonts w:ascii="Times New Roman" w:hAnsi="Times New Roman"/>
+          <w:b/>
+          <w:i w:val="0"/>
+          <w:sz w:val="24"/>
+        </w:rPr>
+        <w:t>76.</w:t>
+      </w:r>
+      <w:r>
+        <w:rPr>
+          <w:rFonts w:ascii="Times New Roman" w:hAnsi="Times New Roman"/>
+          <w:b w:val="0"/>
+          <w:i w:val="0"/>
+          <w:sz w:val="24"/>
+        </w:rPr>
+        <w:t xml:space="preserve"> How can the unit circle be used to find trigonometric values for any angle?</w:t>
+      </w:r>
+    </w:p>
+    <w:p>
+      <w:pPr>
+        <w:spacing w:line="360" w:lineRule="auto" w:after="0"/>
+        <w:ind w:left="720" w:hanging="360"/>
+      </w:pPr>
+      <w:r>
+        <w:rPr>
+          <w:rFonts w:ascii="Times New Roman" w:hAnsi="Times New Roman"/>
+          <w:b w:val="0"/>
+          <w:i w:val="0"/>
+          <w:sz w:val="24"/>
+        </w:rPr>
+        <w:t xml:space="preserve">•  </w:t>
+      </w:r>
+      <w:r>
+        <w:rPr>
+          <w:rFonts w:ascii="Times New Roman" w:hAnsi="Times New Roman"/>
+          <w:b w:val="0"/>
+          <w:i w:val="0"/>
+          <w:sz w:val="24"/>
+        </w:rPr>
+        <w:t>A. By drawing a right triangle in the circle</w:t>
+      </w:r>
+    </w:p>
+    <w:p>
+      <w:pPr>
+        <w:spacing w:line="360" w:lineRule="auto" w:after="0"/>
+        <w:ind w:left="720" w:hanging="360"/>
+      </w:pPr>
+      <w:r>
+        <w:rPr>
+          <w:rFonts w:ascii="Times New Roman" w:hAnsi="Times New Roman"/>
+          <w:b w:val="0"/>
+          <w:i w:val="0"/>
+          <w:sz w:val="24"/>
+        </w:rPr>
+        <w:t xml:space="preserve">•  </w:t>
+      </w:r>
+      <w:r>
+        <w:rPr>
+          <w:rFonts w:ascii="Times New Roman" w:hAnsi="Times New Roman"/>
+          <w:b w:val="0"/>
+          <w:i w:val="0"/>
+          <w:sz w:val="24"/>
+        </w:rPr>
+        <w:t>B. By using a calculator or table of values</w:t>
+      </w:r>
+    </w:p>
+    <w:p>
+      <w:pPr>
+        <w:spacing w:line="360" w:lineRule="auto" w:after="0"/>
+        <w:ind w:left="720" w:hanging="360"/>
+      </w:pPr>
+      <w:r>
+        <w:rPr>
+          <w:rFonts w:ascii="Times New Roman" w:hAnsi="Times New Roman"/>
+          <w:b w:val="0"/>
+          <w:i w:val="0"/>
+          <w:sz w:val="24"/>
+        </w:rPr>
+        <w:t xml:space="preserve">•  </w:t>
+      </w:r>
+      <w:r>
+        <w:rPr>
+          <w:rFonts w:ascii="Times New Roman" w:hAnsi="Times New Roman"/>
+          <w:b w:val="0"/>
+          <w:i w:val="0"/>
+          <w:sz w:val="24"/>
+        </w:rPr>
+        <w:t>C. By memorizing the values</w:t>
+      </w:r>
+    </w:p>
+    <w:p>
+      <w:pPr>
+        <w:spacing w:line="360" w:lineRule="auto" w:after="0"/>
+        <w:ind w:left="720" w:hanging="360"/>
+      </w:pPr>
+      <w:r>
+        <w:rPr>
+          <w:rFonts w:ascii="Times New Roman" w:hAnsi="Times New Roman"/>
+          <w:b w:val="0"/>
+          <w:i w:val="0"/>
+          <w:sz w:val="24"/>
+        </w:rPr>
+        <w:t xml:space="preserve">•  </w:t>
+      </w:r>
+      <w:r>
+        <w:rPr>
+          <w:rFonts w:ascii="Times New Roman" w:hAnsi="Times New Roman"/>
+          <w:b w:val="0"/>
+          <w:i w:val="0"/>
+          <w:sz w:val="24"/>
+        </w:rPr>
+        <w:t>D. By measuring the angle in degrees</w:t>
+      </w:r>
+    </w:p>
+    <w:p>
+      <w:pPr>
+        <w:spacing w:line="360" w:lineRule="auto" w:after="200"/>
+      </w:pPr>
+      <w:r>
+        <w:rPr>
+          <w:rFonts w:ascii="Times New Roman" w:hAnsi="Times New Roman"/>
+          <w:b/>
+          <w:i w:val="0"/>
+          <w:sz w:val="24"/>
+        </w:rPr>
+        <w:t>77.</w:t>
+      </w:r>
+      <w:r>
+        <w:rPr>
+          <w:rFonts w:ascii="Times New Roman" w:hAnsi="Times New Roman"/>
+          <w:b w:val="0"/>
+          <w:i w:val="0"/>
+          <w:sz w:val="24"/>
+        </w:rPr>
+        <w:t xml:space="preserve"> Horizontal asymptotes of f(x) = (5x³ - 10)/(10x² - 12x + 20)?</w:t>
+      </w:r>
+    </w:p>
+    <w:p>
+      <w:pPr>
+        <w:spacing w:line="360" w:lineRule="auto" w:after="0"/>
+        <w:ind w:left="720" w:hanging="360"/>
+      </w:pPr>
+      <w:r>
+        <w:rPr>
+          <w:rFonts w:ascii="Times New Roman" w:hAnsi="Times New Roman"/>
+          <w:b w:val="0"/>
+          <w:i w:val="0"/>
+          <w:sz w:val="24"/>
+        </w:rPr>
+        <w:t xml:space="preserve">•  </w:t>
+      </w:r>
+      <w:r>
+        <w:rPr>
+          <w:rFonts w:ascii="Times New Roman" w:hAnsi="Times New Roman"/>
+          <w:b w:val="0"/>
+          <w:i w:val="0"/>
+          <w:sz w:val="24"/>
+        </w:rPr>
+        <w:t>A. y = 1/2</w:t>
+      </w:r>
+    </w:p>
+    <w:p>
+      <w:pPr>
+        <w:spacing w:line="360" w:lineRule="auto" w:after="0"/>
+        <w:ind w:left="720" w:hanging="360"/>
+      </w:pPr>
+      <w:r>
+        <w:rPr>
+          <w:rFonts w:ascii="Times New Roman" w:hAnsi="Times New Roman"/>
+          <w:b w:val="0"/>
+          <w:i w:val="0"/>
+          <w:sz w:val="24"/>
+        </w:rPr>
+        <w:t xml:space="preserve">•  </w:t>
+      </w:r>
+      <w:r>
+        <w:rPr>
+          <w:rFonts w:ascii="Times New Roman" w:hAnsi="Times New Roman"/>
+          <w:b w:val="0"/>
+          <w:i w:val="0"/>
+          <w:sz w:val="24"/>
+        </w:rPr>
+        <w:t>B. x = 5</w:t>
+      </w:r>
+    </w:p>
+    <w:p>
+      <w:pPr>
+        <w:spacing w:line="360" w:lineRule="auto" w:after="0"/>
+        <w:ind w:left="720" w:hanging="360"/>
+      </w:pPr>
+      <w:r>
+        <w:rPr>
+          <w:rFonts w:ascii="Times New Roman" w:hAnsi="Times New Roman"/>
+          <w:b w:val="0"/>
+          <w:i w:val="0"/>
+          <w:sz w:val="24"/>
+        </w:rPr>
+        <w:t xml:space="preserve">•  </w:t>
+      </w:r>
+      <w:r>
+        <w:rPr>
+          <w:rFonts w:ascii="Times New Roman" w:hAnsi="Times New Roman"/>
+          <w:b w:val="0"/>
+          <w:i w:val="0"/>
+          <w:sz w:val="24"/>
+        </w:rPr>
+        <w:t>C. Do not exist</w:t>
+      </w:r>
+    </w:p>
+    <w:p>
+      <w:pPr>
+        <w:spacing w:line="360" w:lineRule="auto" w:after="0"/>
+        <w:ind w:left="720" w:hanging="360"/>
+      </w:pPr>
+      <w:r>
+        <w:rPr>
+          <w:rFonts w:ascii="Times New Roman" w:hAnsi="Times New Roman"/>
+          <w:b w:val="0"/>
+          <w:i w:val="0"/>
+          <w:sz w:val="24"/>
+        </w:rPr>
+        <w:t xml:space="preserve">•  </w:t>
+      </w:r>
+      <w:r>
+        <w:rPr>
+          <w:rFonts w:ascii="Times New Roman" w:hAnsi="Times New Roman"/>
+          <w:b w:val="0"/>
+          <w:i w:val="0"/>
+          <w:sz w:val="24"/>
+        </w:rPr>
+        <w:t>D. x = 2</w:t>
+      </w:r>
+    </w:p>
+    <w:p>
+      <w:pPr>
+        <w:spacing w:line="360" w:lineRule="auto" w:after="200"/>
+      </w:pPr>
+      <w:r>
+        <w:rPr>
+          <w:rFonts w:ascii="Times New Roman" w:hAnsi="Times New Roman"/>
+          <w:b/>
+          <w:i w:val="0"/>
+          <w:sz w:val="24"/>
+        </w:rPr>
+        <w:t>78.</w:t>
+      </w:r>
+      <w:r>
+        <w:rPr>
+          <w:rFonts w:ascii="Times New Roman" w:hAnsi="Times New Roman"/>
+          <w:b w:val="0"/>
+          <w:i w:val="0"/>
+          <w:sz w:val="24"/>
+        </w:rPr>
+        <w:t xml:space="preserve"> What is 1560° equal to (as a coterminal angle in radians)?</w:t>
+      </w:r>
+    </w:p>
+    <w:p>
+      <w:pPr>
+        <w:spacing w:line="360" w:lineRule="auto" w:after="0"/>
+        <w:ind w:left="720" w:hanging="360"/>
+      </w:pPr>
+      <w:r>
+        <w:rPr>
+          <w:rFonts w:ascii="Times New Roman" w:hAnsi="Times New Roman"/>
+          <w:b w:val="0"/>
+          <w:i w:val="0"/>
+          <w:sz w:val="24"/>
+        </w:rPr>
+        <w:t xml:space="preserve">•  </w:t>
+      </w:r>
+      <w:r>
+        <w:rPr>
+          <w:rFonts w:ascii="Times New Roman" w:hAnsi="Times New Roman"/>
+          <w:b w:val="0"/>
+          <w:i w:val="0"/>
+          <w:sz w:val="24"/>
+        </w:rPr>
+        <w:t>A. 4π/3</w:t>
+      </w:r>
+    </w:p>
+    <w:p>
+      <w:pPr>
+        <w:spacing w:line="360" w:lineRule="auto" w:after="0"/>
+        <w:ind w:left="720" w:hanging="360"/>
+      </w:pPr>
+      <w:r>
+        <w:rPr>
+          <w:rFonts w:ascii="Times New Roman" w:hAnsi="Times New Roman"/>
+          <w:b w:val="0"/>
+          <w:i w:val="0"/>
+          <w:sz w:val="24"/>
+        </w:rPr>
+        <w:t xml:space="preserve">•  </w:t>
+      </w:r>
+      <w:r>
+        <w:rPr>
+          <w:rFonts w:ascii="Times New Roman" w:hAnsi="Times New Roman"/>
+          <w:b w:val="0"/>
+          <w:i w:val="0"/>
+          <w:sz w:val="24"/>
+        </w:rPr>
+        <w:t>B. π</w:t>
+      </w:r>
+    </w:p>
+    <w:p>
+      <w:pPr>
+        <w:spacing w:line="360" w:lineRule="auto" w:after="0"/>
+        <w:ind w:left="720" w:hanging="360"/>
+      </w:pPr>
+      <w:r>
+        <w:rPr>
+          <w:rFonts w:ascii="Times New Roman" w:hAnsi="Times New Roman"/>
+          <w:b w:val="0"/>
+          <w:i w:val="0"/>
+          <w:sz w:val="24"/>
+        </w:rPr>
+        <w:t xml:space="preserve">•  </w:t>
+      </w:r>
+      <w:r>
+        <w:rPr>
+          <w:rFonts w:ascii="Times New Roman" w:hAnsi="Times New Roman"/>
+          <w:b w:val="0"/>
+          <w:i w:val="0"/>
+          <w:sz w:val="24"/>
+        </w:rPr>
+        <w:t>C. 2π/3</w:t>
+      </w:r>
+    </w:p>
+    <w:p>
+      <w:pPr>
+        <w:spacing w:line="360" w:lineRule="auto" w:after="0"/>
+        <w:ind w:left="720" w:hanging="360"/>
+      </w:pPr>
+      <w:r>
+        <w:rPr>
+          <w:rFonts w:ascii="Times New Roman" w:hAnsi="Times New Roman"/>
+          <w:b w:val="0"/>
+          <w:i w:val="0"/>
+          <w:sz w:val="24"/>
+        </w:rPr>
+        <w:t xml:space="preserve">•  </w:t>
+      </w:r>
+      <w:r>
+        <w:rPr>
+          <w:rFonts w:ascii="Times New Roman" w:hAnsi="Times New Roman"/>
+          <w:b w:val="0"/>
+          <w:i w:val="0"/>
+          <w:sz w:val="24"/>
+        </w:rPr>
+        <w:t>D. 2π</w:t>
+      </w:r>
+    </w:p>
+    <w:p>
+      <w:pPr>
         <w:pStyle w:val="Heading1"/>
         <w:jc w:val="left"/>
       </w:pPr>
@@ -12944,6 +14648,351 @@
           <w:sz w:val="24"/>
         </w:rPr>
         <w:t xml:space="preserve"> (y = x² + 2x + 1). Quadratic in x means the highest power of x is 2, with y as the output: y = x² + 2x + 1.</w:t>
+      </w:r>
+    </w:p>
+    <w:p>
+      <w:pPr>
+        <w:spacing w:line="360" w:lineRule="auto" w:after="200"/>
+      </w:pPr>
+      <w:r>
+        <w:rPr>
+          <w:rFonts w:ascii="Times New Roman" w:hAnsi="Times New Roman"/>
+          <w:b/>
+          <w:i w:val="0"/>
+          <w:sz w:val="24"/>
+        </w:rPr>
+        <w:t>64. B</w:t>
+      </w:r>
+      <w:r>
+        <w:rPr>
+          <w:rFonts w:ascii="Times New Roman" w:hAnsi="Times New Roman"/>
+          <w:b w:val="0"/>
+          <w:i w:val="0"/>
+          <w:sz w:val="24"/>
+        </w:rPr>
+        <w:t xml:space="preserve"> (f(x) = 3x² - 5x + 2). A polynomial uses only whole-number powers of x. 1/x = x⁻¹, √x = x^(1/2), and eˣ has x in the exponent.</w:t>
+      </w:r>
+    </w:p>
+    <w:p>
+      <w:pPr>
+        <w:spacing w:line="360" w:lineRule="auto" w:after="200"/>
+      </w:pPr>
+      <w:r>
+        <w:rPr>
+          <w:rFonts w:ascii="Times New Roman" w:hAnsi="Times New Roman"/>
+          <w:b/>
+          <w:i w:val="0"/>
+          <w:sz w:val="24"/>
+        </w:rPr>
+        <w:t>65. A</w:t>
+      </w:r>
+      <w:r>
+        <w:rPr>
+          <w:rFonts w:ascii="Times New Roman" w:hAnsi="Times New Roman"/>
+          <w:b w:val="0"/>
+          <w:i w:val="0"/>
+          <w:sz w:val="24"/>
+        </w:rPr>
+        <w:t xml:space="preserve"> (-3/7). Factor B out: 7x + 3 = 7(x + 3/7). The graph moves 3/7 to the LEFT, a phase shift of -3/7 (set 7x + 3 = 0, x = -3/7).</w:t>
+      </w:r>
+    </w:p>
+    <w:p>
+      <w:pPr>
+        <w:spacing w:line="360" w:lineRule="auto" w:after="200"/>
+      </w:pPr>
+      <w:r>
+        <w:rPr>
+          <w:rFonts w:ascii="Times New Roman" w:hAnsi="Times New Roman"/>
+          <w:b/>
+          <w:i w:val="0"/>
+          <w:sz w:val="24"/>
+        </w:rPr>
+        <w:t>66. A</w:t>
+      </w:r>
+      <w:r>
+        <w:rPr>
+          <w:rFonts w:ascii="Times New Roman" w:hAnsi="Times New Roman"/>
+          <w:b w:val="0"/>
+          <w:i w:val="0"/>
+          <w:sz w:val="24"/>
+        </w:rPr>
+        <w:t xml:space="preserve"> (401°). Multiply by 180/π: 7 × 180/π ≈ 401.07°. (7 × 360 = 2520 is the trap.)</w:t>
+      </w:r>
+    </w:p>
+    <w:p>
+      <w:pPr>
+        <w:spacing w:line="360" w:lineRule="auto" w:after="200"/>
+      </w:pPr>
+      <w:r>
+        <w:rPr>
+          <w:rFonts w:ascii="Times New Roman" w:hAnsi="Times New Roman"/>
+          <w:b/>
+          <w:i w:val="0"/>
+          <w:sz w:val="24"/>
+        </w:rPr>
+        <w:t>67. A</w:t>
+      </w:r>
+      <w:r>
+        <w:rPr>
+          <w:rFonts w:ascii="Times New Roman" w:hAnsi="Times New Roman"/>
+          <w:b w:val="0"/>
+          <w:i w:val="0"/>
+          <w:sz w:val="24"/>
+        </w:rPr>
+        <w:t xml:space="preserve"> ($31492.8). A = P(1 + r)ᵗ = 25000(1.08)³ = 25000 × 1.259712 = $31,492.80.</w:t>
+      </w:r>
+    </w:p>
+    <w:p>
+      <w:pPr>
+        <w:spacing w:line="360" w:lineRule="auto" w:after="200"/>
+      </w:pPr>
+      <w:r>
+        <w:rPr>
+          <w:rFonts w:ascii="Times New Roman" w:hAnsi="Times New Roman"/>
+          <w:b/>
+          <w:i w:val="0"/>
+          <w:sz w:val="24"/>
+        </w:rPr>
+        <w:t>68. D</w:t>
+      </w:r>
+      <w:r>
+        <w:rPr>
+          <w:rFonts w:ascii="Times New Roman" w:hAnsi="Times New Roman"/>
+          <w:b w:val="0"/>
+          <w:i w:val="0"/>
+          <w:sz w:val="24"/>
+        </w:rPr>
+        <w:t xml:space="preserve"> (10, 9). Degree 10: at most 10 x-intercepts and at most 10 - 1 = 9 turning points.</w:t>
+      </w:r>
+    </w:p>
+    <w:p>
+      <w:pPr>
+        <w:spacing w:line="360" w:lineRule="auto" w:after="200"/>
+      </w:pPr>
+      <w:r>
+        <w:rPr>
+          <w:rFonts w:ascii="Times New Roman" w:hAnsi="Times New Roman"/>
+          <w:b/>
+          <w:i w:val="0"/>
+          <w:sz w:val="24"/>
+        </w:rPr>
+        <w:t>69. C</w:t>
+      </w:r>
+      <w:r>
+        <w:rPr>
+          <w:rFonts w:ascii="Times New Roman" w:hAnsi="Times New Roman"/>
+          <w:b w:val="0"/>
+          <w:i w:val="0"/>
+          <w:sz w:val="24"/>
+        </w:rPr>
+        <w:t xml:space="preserve"> ((-5/4, ∞), (-∞, ∞)). 4x + 5 &gt; 0 gives x &gt; -5/4. Every log takes all real values, so the range is (-∞, ∞).</w:t>
+      </w:r>
+    </w:p>
+    <w:p>
+      <w:pPr>
+        <w:spacing w:line="360" w:lineRule="auto" w:after="200"/>
+      </w:pPr>
+      <w:r>
+        <w:rPr>
+          <w:rFonts w:ascii="Times New Roman" w:hAnsi="Times New Roman"/>
+          <w:b/>
+          <w:i w:val="0"/>
+          <w:sz w:val="24"/>
+        </w:rPr>
+        <w:t>70. B</w:t>
+      </w:r>
+      <w:r>
+        <w:rPr>
+          <w:rFonts w:ascii="Times New Roman" w:hAnsi="Times New Roman"/>
+          <w:b w:val="0"/>
+          <w:i w:val="0"/>
+          <w:sz w:val="24"/>
+        </w:rPr>
+        <w:t xml:space="preserve"> (False). YOU MISSED THIS ONE. The key is False. A polynomial's graph is ONE smooth, unbroken curve that passes the vertical line test and continues forever to the left and right. This picture has two separate graphs (a vertical line would cross both the line and the U-curve), and the U-curve is cut off, so as drawn it is not the graph of a single polynomial. Lesson: before calling a graph a polynomial, check it is one smooth curve, passes the vertical line test, and has no breaks, corners, or flat pieces.</w:t>
+      </w:r>
+    </w:p>
+    <w:p>
+      <w:pPr>
+        <w:spacing w:line="360" w:lineRule="auto" w:after="200"/>
+      </w:pPr>
+      <w:r>
+        <w:rPr>
+          <w:rFonts w:ascii="Times New Roman" w:hAnsi="Times New Roman"/>
+          <w:b/>
+          <w:i w:val="0"/>
+          <w:sz w:val="24"/>
+        </w:rPr>
+        <w:t>71. C</w:t>
+      </w:r>
+      <w:r>
+        <w:rPr>
+          <w:rFonts w:ascii="Times New Roman" w:hAnsi="Times New Roman"/>
+          <w:b w:val="0"/>
+          <w:i w:val="0"/>
+          <w:sz w:val="24"/>
+        </w:rPr>
+        <w:t xml:space="preserve"> (rate of growth or decay). In a·bˣ, b is the growth factor. The 20 is the starting value (the y-intercept).</w:t>
+      </w:r>
+    </w:p>
+    <w:p>
+      <w:pPr>
+        <w:spacing w:line="360" w:lineRule="auto" w:after="200"/>
+      </w:pPr>
+      <w:r>
+        <w:rPr>
+          <w:rFonts w:ascii="Times New Roman" w:hAnsi="Times New Roman"/>
+          <w:b/>
+          <w:i w:val="0"/>
+          <w:sz w:val="24"/>
+        </w:rPr>
+        <w:t>72. C</w:t>
+      </w:r>
+      <w:r>
+        <w:rPr>
+          <w:rFonts w:ascii="Times New Roman" w:hAnsi="Times New Roman"/>
+          <w:b w:val="0"/>
+          <w:i w:val="0"/>
+          <w:sz w:val="24"/>
+        </w:rPr>
+        <w:t xml:space="preserve"> ($6,720). Work backwards: P = 8000 / 1.06³ = 8000 / 1.191016 ≈ $6,716.95, closest to $6,720.</w:t>
+      </w:r>
+    </w:p>
+    <w:p>
+      <w:pPr>
+        <w:spacing w:line="360" w:lineRule="auto" w:after="200"/>
+      </w:pPr>
+      <w:r>
+        <w:rPr>
+          <w:rFonts w:ascii="Times New Roman" w:hAnsi="Times New Roman"/>
+          <w:b/>
+          <w:i w:val="0"/>
+          <w:sz w:val="24"/>
+        </w:rPr>
+        <w:t>73. A</w:t>
+      </w:r>
+      <w:r>
+        <w:rPr>
+          <w:rFonts w:ascii="Times New Roman" w:hAnsi="Times New Roman"/>
+          <w:b w:val="0"/>
+          <w:i w:val="0"/>
+          <w:sz w:val="24"/>
+        </w:rPr>
+        <w:t xml:space="preserve"> (-2.5849). Subtract 4: 1 = 6(2ˣ). Divide by 6: 2ˣ = 1/6. Take logs: x = log(1/6)/log 2 ≈ -2.5849 (negative because 1/6 &lt; 1).</w:t>
+      </w:r>
+    </w:p>
+    <w:p>
+      <w:pPr>
+        <w:spacing w:line="360" w:lineRule="auto" w:after="200"/>
+      </w:pPr>
+      <w:r>
+        <w:rPr>
+          <w:rFonts w:ascii="Times New Roman" w:hAnsi="Times New Roman"/>
+          <w:b/>
+          <w:i w:val="0"/>
+          <w:sz w:val="24"/>
+        </w:rPr>
+        <w:t>74. B</w:t>
+      </w:r>
+      <w:r>
+        <w:rPr>
+          <w:rFonts w:ascii="Times New Roman" w:hAnsi="Times New Roman"/>
+          <w:b w:val="0"/>
+          <w:i w:val="0"/>
+          <w:sz w:val="24"/>
+        </w:rPr>
+        <w:t xml:space="preserve"> (False). False. Multiplying by 25 is a vertical STRETCH by 25 (the + 25 shifts it up). A compression needs a factor between 0 and 1.</w:t>
+      </w:r>
+    </w:p>
+    <w:p>
+      <w:pPr>
+        <w:spacing w:line="360" w:lineRule="auto" w:after="200"/>
+      </w:pPr>
+      <w:r>
+        <w:rPr>
+          <w:rFonts w:ascii="Times New Roman" w:hAnsi="Times New Roman"/>
+          <w:b/>
+          <w:i w:val="0"/>
+          <w:sz w:val="24"/>
+        </w:rPr>
+        <w:t>75. C</w:t>
+      </w:r>
+      <w:r>
+        <w:rPr>
+          <w:rFonts w:ascii="Times New Roman" w:hAnsi="Times New Roman"/>
+          <w:b w:val="0"/>
+          <w:i w:val="0"/>
+          <w:sz w:val="24"/>
+        </w:rPr>
+        <w:t xml:space="preserve"> (11.54 meters). tan 60° = opposite/adjacent = 20/d, so d = 20/tan 60° = 20/√3 ≈ 11.54 m. (34.6 = 20 × √3 is the trap.)</w:t>
+      </w:r>
+    </w:p>
+    <w:p>
+      <w:pPr>
+        <w:spacing w:line="360" w:lineRule="auto" w:after="200"/>
+      </w:pPr>
+      <w:r>
+        <w:rPr>
+          <w:rFonts w:ascii="Times New Roman" w:hAnsi="Times New Roman"/>
+          <w:b/>
+          <w:i w:val="0"/>
+          <w:sz w:val="24"/>
+        </w:rPr>
+        <w:t>76. A</w:t>
+      </w:r>
+      <w:r>
+        <w:rPr>
+          <w:rFonts w:ascii="Times New Roman" w:hAnsi="Times New Roman"/>
+          <w:b w:val="0"/>
+          <w:i w:val="0"/>
+          <w:sz w:val="24"/>
+        </w:rPr>
+        <w:t xml:space="preserve"> (By drawing a right triangle in the circle). A right triangle drawn from the point (x, y) to the x-axis, with hypotenuse 1, gives cos θ = x and sin θ = y.</w:t>
+      </w:r>
+    </w:p>
+    <w:p>
+      <w:pPr>
+        <w:spacing w:line="360" w:lineRule="auto" w:after="200"/>
+      </w:pPr>
+      <w:r>
+        <w:rPr>
+          <w:rFonts w:ascii="Times New Roman" w:hAnsi="Times New Roman"/>
+          <w:b/>
+          <w:i w:val="0"/>
+          <w:sz w:val="24"/>
+        </w:rPr>
+        <w:t>77. C</w:t>
+      </w:r>
+      <w:r>
+        <w:rPr>
+          <w:rFonts w:ascii="Times New Roman" w:hAnsi="Times New Roman"/>
+          <w:b w:val="0"/>
+          <w:i w:val="0"/>
+          <w:sz w:val="24"/>
+        </w:rPr>
+        <w:t xml:space="preserve"> (Do not exist). Top degree 3 is greater than bottom degree 2, so there is no horizontal asymptote (there is a slant one). Horizontal asymptotes are written y = ..., never x = ....</w:t>
+      </w:r>
+    </w:p>
+    <w:p>
+      <w:pPr>
+        <w:spacing w:line="360" w:lineRule="auto" w:after="200"/>
+      </w:pPr>
+      <w:r>
+        <w:rPr>
+          <w:rFonts w:ascii="Times New Roman" w:hAnsi="Times New Roman"/>
+          <w:b/>
+          <w:i w:val="0"/>
+          <w:sz w:val="24"/>
+        </w:rPr>
+        <w:t>78. C</w:t>
+      </w:r>
+      <w:r>
+        <w:rPr>
+          <w:rFonts w:ascii="Times New Roman" w:hAnsi="Times New Roman"/>
+          <w:b w:val="0"/>
+          <w:i w:val="0"/>
+          <w:sz w:val="24"/>
+        </w:rPr>
+        <w:t xml:space="preserve"> (2π/3). Remove full turns: 1560° - 4 × 360° = 120°. Then 120 × π/180 = 2π/3.</w:t>
       </w:r>
     </w:p>
     <w:p>

</xml_diff>

<commit_message>
MATH1201 exam prep: add Unit 1-3 self-quiz questions (93 total), focus-area note on composition and inverses
Co-Authored-By: Claude Opus 5.5 <noreply@anthropic.com>
</commit_message>
<xml_diff>
--- a/MATH1201_College_Algebra/Unit9_Final_Exam/Final_Exam_Study_Guide.docx
+++ b/MATH1201_College_Algebra/Unit9_Final_Exam/Final_Exam_Study_Guide.docx
@@ -3929,7 +3929,7 @@
           <w:color w:val="000000"/>
           <w:sz w:val="24"/>
         </w:rPr>
-        <w:t>Part 3: Practice Exam (48 Questions) and Graded Quiz Review</w:t>
+        <w:t>Part 3: Practice Exam (48 Questions) and Real Quiz Review</w:t>
       </w:r>
     </w:p>
     <w:p>
@@ -13188,6 +13188,2142 @@
     </w:p>
     <w:p>
       <w:pPr>
+        <w:pStyle w:val="Heading2"/>
+        <w:jc w:val="left"/>
+      </w:pPr>
+      <w:r>
+        <w:rPr>
+          <w:rFonts w:ascii="Times New Roman" w:hAnsi="Times New Roman"/>
+          <w:b/>
+          <w:color w:val="000000"/>
+          <w:sz w:val="24"/>
+        </w:rPr>
+        <w:t>Self-Quizzes Units 1 to 3 (real questions)</w:t>
+      </w:r>
+    </w:p>
+    <w:p>
+      <w:pPr>
+        <w:spacing w:line="360" w:lineRule="auto" w:after="200"/>
+      </w:pPr>
+      <w:r>
+        <w:rPr>
+          <w:rFonts w:ascii="Times New Roman" w:hAnsi="Times New Roman"/>
+          <w:b/>
+          <w:i w:val="0"/>
+          <w:sz w:val="24"/>
+        </w:rPr>
+        <w:t>79.</w:t>
+      </w:r>
+      <w:r>
+        <w:rPr>
+          <w:rFonts w:ascii="Times New Roman" w:hAnsi="Times New Roman"/>
+          <w:b w:val="0"/>
+          <w:i w:val="0"/>
+          <w:sz w:val="24"/>
+        </w:rPr>
+        <w:t xml:space="preserve"> Unit 1: If f(x) = 3x + 2 and g(x) = x - 4, what is (f/g)(4)?</w:t>
+      </w:r>
+    </w:p>
+    <w:p>
+      <w:pPr>
+        <w:spacing w:line="360" w:lineRule="auto" w:after="0"/>
+        <w:ind w:left="720" w:hanging="360"/>
+      </w:pPr>
+      <w:r>
+        <w:rPr>
+          <w:rFonts w:ascii="Times New Roman" w:hAnsi="Times New Roman"/>
+          <w:b w:val="0"/>
+          <w:i w:val="0"/>
+          <w:sz w:val="24"/>
+        </w:rPr>
+        <w:t xml:space="preserve">•  </w:t>
+      </w:r>
+      <w:r>
+        <w:rPr>
+          <w:rFonts w:ascii="Times New Roman" w:hAnsi="Times New Roman"/>
+          <w:b w:val="0"/>
+          <w:i w:val="0"/>
+          <w:sz w:val="24"/>
+        </w:rPr>
+        <w:t>A. (3, 2, 4)</w:t>
+      </w:r>
+    </w:p>
+    <w:p>
+      <w:pPr>
+        <w:spacing w:line="360" w:lineRule="auto" w:after="0"/>
+        <w:ind w:left="720" w:hanging="360"/>
+      </w:pPr>
+      <w:r>
+        <w:rPr>
+          <w:rFonts w:ascii="Times New Roman" w:hAnsi="Times New Roman"/>
+          <w:b w:val="0"/>
+          <w:i w:val="0"/>
+          <w:sz w:val="24"/>
+        </w:rPr>
+        <w:t xml:space="preserve">•  </w:t>
+      </w:r>
+      <w:r>
+        <w:rPr>
+          <w:rFonts w:ascii="Times New Roman" w:hAnsi="Times New Roman"/>
+          <w:b w:val="0"/>
+          <w:i w:val="0"/>
+          <w:sz w:val="24"/>
+        </w:rPr>
+        <w:t>B. undefined</w:t>
+      </w:r>
+    </w:p>
+    <w:p>
+      <w:pPr>
+        <w:spacing w:line="360" w:lineRule="auto" w:after="0"/>
+        <w:ind w:left="720" w:hanging="360"/>
+      </w:pPr>
+      <w:r>
+        <w:rPr>
+          <w:rFonts w:ascii="Times New Roman" w:hAnsi="Times New Roman"/>
+          <w:b w:val="0"/>
+          <w:i w:val="0"/>
+          <w:sz w:val="24"/>
+        </w:rPr>
+        <w:t xml:space="preserve">•  </w:t>
+      </w:r>
+      <w:r>
+        <w:rPr>
+          <w:rFonts w:ascii="Times New Roman" w:hAnsi="Times New Roman"/>
+          <w:b w:val="0"/>
+          <w:i w:val="0"/>
+          <w:sz w:val="24"/>
+        </w:rPr>
+        <w:t>C. none of these</w:t>
+      </w:r>
+    </w:p>
+    <w:p>
+      <w:pPr>
+        <w:spacing w:line="360" w:lineRule="auto" w:after="0"/>
+        <w:ind w:left="720" w:hanging="360"/>
+      </w:pPr>
+      <w:r>
+        <w:rPr>
+          <w:rFonts w:ascii="Times New Roman" w:hAnsi="Times New Roman"/>
+          <w:b w:val="0"/>
+          <w:i w:val="0"/>
+          <w:sz w:val="24"/>
+        </w:rPr>
+        <w:t xml:space="preserve">•  </w:t>
+      </w:r>
+      <w:r>
+        <w:rPr>
+          <w:rFonts w:ascii="Times New Roman" w:hAnsi="Times New Roman"/>
+          <w:b w:val="0"/>
+          <w:i w:val="0"/>
+          <w:sz w:val="24"/>
+        </w:rPr>
+        <w:t>D. 0</w:t>
+      </w:r>
+    </w:p>
+    <w:p>
+      <w:pPr>
+        <w:spacing w:line="360" w:lineRule="auto" w:after="0"/>
+        <w:ind w:left="720" w:hanging="360"/>
+      </w:pPr>
+      <w:r>
+        <w:rPr>
+          <w:rFonts w:ascii="Times New Roman" w:hAnsi="Times New Roman"/>
+          <w:b w:val="0"/>
+          <w:i w:val="0"/>
+          <w:sz w:val="24"/>
+        </w:rPr>
+        <w:t xml:space="preserve">•  </w:t>
+      </w:r>
+      <w:r>
+        <w:rPr>
+          <w:rFonts w:ascii="Times New Roman" w:hAnsi="Times New Roman"/>
+          <w:b w:val="0"/>
+          <w:i w:val="0"/>
+          <w:sz w:val="24"/>
+        </w:rPr>
+        <w:t>E. 14</w:t>
+      </w:r>
+    </w:p>
+    <w:p>
+      <w:pPr>
+        <w:spacing w:line="360" w:lineRule="auto" w:after="200"/>
+      </w:pPr>
+      <w:r>
+        <w:rPr>
+          <w:rFonts w:ascii="Times New Roman" w:hAnsi="Times New Roman"/>
+          <w:b/>
+          <w:i w:val="0"/>
+          <w:sz w:val="24"/>
+        </w:rPr>
+        <w:t>80.</w:t>
+      </w:r>
+      <w:r>
+        <w:rPr>
+          <w:rFonts w:ascii="Times New Roman" w:hAnsi="Times New Roman"/>
+          <w:b w:val="0"/>
+          <w:i w:val="0"/>
+          <w:sz w:val="24"/>
+        </w:rPr>
+        <w:t xml:space="preserve"> Unit 1: Find the range of f(x) = 2 - √(2 - x).</w:t>
+      </w:r>
+    </w:p>
+    <w:p>
+      <w:pPr>
+        <w:spacing w:line="360" w:lineRule="auto" w:after="0"/>
+        <w:ind w:left="720" w:hanging="360"/>
+      </w:pPr>
+      <w:r>
+        <w:rPr>
+          <w:rFonts w:ascii="Times New Roman" w:hAnsi="Times New Roman"/>
+          <w:b w:val="0"/>
+          <w:i w:val="0"/>
+          <w:sz w:val="24"/>
+        </w:rPr>
+        <w:t xml:space="preserve">•  </w:t>
+      </w:r>
+      <w:r>
+        <w:rPr>
+          <w:rFonts w:ascii="Times New Roman" w:hAnsi="Times New Roman"/>
+          <w:b w:val="0"/>
+          <w:i w:val="0"/>
+          <w:sz w:val="24"/>
+        </w:rPr>
+        <w:t>A. the empty set</w:t>
+      </w:r>
+    </w:p>
+    <w:p>
+      <w:pPr>
+        <w:spacing w:line="360" w:lineRule="auto" w:after="0"/>
+        <w:ind w:left="720" w:hanging="360"/>
+      </w:pPr>
+      <w:r>
+        <w:rPr>
+          <w:rFonts w:ascii="Times New Roman" w:hAnsi="Times New Roman"/>
+          <w:b w:val="0"/>
+          <w:i w:val="0"/>
+          <w:sz w:val="24"/>
+        </w:rPr>
+        <w:t xml:space="preserve">•  </w:t>
+      </w:r>
+      <w:r>
+        <w:rPr>
+          <w:rFonts w:ascii="Times New Roman" w:hAnsi="Times New Roman"/>
+          <w:b w:val="0"/>
+          <w:i w:val="0"/>
+          <w:sz w:val="24"/>
+        </w:rPr>
+        <w:t>B. [-2, ∞)</w:t>
+      </w:r>
+    </w:p>
+    <w:p>
+      <w:pPr>
+        <w:spacing w:line="360" w:lineRule="auto" w:after="0"/>
+        <w:ind w:left="720" w:hanging="360"/>
+      </w:pPr>
+      <w:r>
+        <w:rPr>
+          <w:rFonts w:ascii="Times New Roman" w:hAnsi="Times New Roman"/>
+          <w:b w:val="0"/>
+          <w:i w:val="0"/>
+          <w:sz w:val="24"/>
+        </w:rPr>
+        <w:t xml:space="preserve">•  </w:t>
+      </w:r>
+      <w:r>
+        <w:rPr>
+          <w:rFonts w:ascii="Times New Roman" w:hAnsi="Times New Roman"/>
+          <w:b w:val="0"/>
+          <w:i w:val="0"/>
+          <w:sz w:val="24"/>
+        </w:rPr>
+        <w:t>C. (-∞, 2]</w:t>
+      </w:r>
+    </w:p>
+    <w:p>
+      <w:pPr>
+        <w:spacing w:line="360" w:lineRule="auto" w:after="0"/>
+        <w:ind w:left="720" w:hanging="360"/>
+      </w:pPr>
+      <w:r>
+        <w:rPr>
+          <w:rFonts w:ascii="Times New Roman" w:hAnsi="Times New Roman"/>
+          <w:b w:val="0"/>
+          <w:i w:val="0"/>
+          <w:sz w:val="24"/>
+        </w:rPr>
+        <w:t xml:space="preserve">•  </w:t>
+      </w:r>
+      <w:r>
+        <w:rPr>
+          <w:rFonts w:ascii="Times New Roman" w:hAnsi="Times New Roman"/>
+          <w:b w:val="0"/>
+          <w:i w:val="0"/>
+          <w:sz w:val="24"/>
+        </w:rPr>
+        <w:t>D. [2, ∞)</w:t>
+      </w:r>
+    </w:p>
+    <w:p>
+      <w:pPr>
+        <w:spacing w:line="360" w:lineRule="auto" w:after="200"/>
+      </w:pPr>
+      <w:r>
+        <w:rPr>
+          <w:rFonts w:ascii="Times New Roman" w:hAnsi="Times New Roman"/>
+          <w:b/>
+          <w:i w:val="0"/>
+          <w:sz w:val="24"/>
+        </w:rPr>
+        <w:t>81.</w:t>
+      </w:r>
+      <w:r>
+        <w:rPr>
+          <w:rFonts w:ascii="Times New Roman" w:hAnsi="Times New Roman"/>
+          <w:b w:val="0"/>
+          <w:i w:val="0"/>
+          <w:sz w:val="24"/>
+        </w:rPr>
+        <w:t xml:space="preserve"> Unit 1: g(x) = (x - 1)². Find the average rate of change on [-1, 2].</w:t>
+      </w:r>
+    </w:p>
+    <w:p>
+      <w:pPr>
+        <w:spacing w:line="360" w:lineRule="auto" w:after="0"/>
+        <w:ind w:left="720" w:hanging="360"/>
+      </w:pPr>
+      <w:r>
+        <w:rPr>
+          <w:rFonts w:ascii="Times New Roman" w:hAnsi="Times New Roman"/>
+          <w:b w:val="0"/>
+          <w:i w:val="0"/>
+          <w:sz w:val="24"/>
+        </w:rPr>
+        <w:t xml:space="preserve">•  </w:t>
+      </w:r>
+      <w:r>
+        <w:rPr>
+          <w:rFonts w:ascii="Times New Roman" w:hAnsi="Times New Roman"/>
+          <w:b w:val="0"/>
+          <w:i w:val="0"/>
+          <w:sz w:val="24"/>
+        </w:rPr>
+        <w:t>A. -2</w:t>
+      </w:r>
+    </w:p>
+    <w:p>
+      <w:pPr>
+        <w:spacing w:line="360" w:lineRule="auto" w:after="0"/>
+        <w:ind w:left="720" w:hanging="360"/>
+      </w:pPr>
+      <w:r>
+        <w:rPr>
+          <w:rFonts w:ascii="Times New Roman" w:hAnsi="Times New Roman"/>
+          <w:b w:val="0"/>
+          <w:i w:val="0"/>
+          <w:sz w:val="24"/>
+        </w:rPr>
+        <w:t xml:space="preserve">•  </w:t>
+      </w:r>
+      <w:r>
+        <w:rPr>
+          <w:rFonts w:ascii="Times New Roman" w:hAnsi="Times New Roman"/>
+          <w:b w:val="0"/>
+          <w:i w:val="0"/>
+          <w:sz w:val="24"/>
+        </w:rPr>
+        <w:t>B. -1</w:t>
+      </w:r>
+    </w:p>
+    <w:p>
+      <w:pPr>
+        <w:spacing w:line="360" w:lineRule="auto" w:after="0"/>
+        <w:ind w:left="720" w:hanging="360"/>
+      </w:pPr>
+      <w:r>
+        <w:rPr>
+          <w:rFonts w:ascii="Times New Roman" w:hAnsi="Times New Roman"/>
+          <w:b w:val="0"/>
+          <w:i w:val="0"/>
+          <w:sz w:val="24"/>
+        </w:rPr>
+        <w:t xml:space="preserve">•  </w:t>
+      </w:r>
+      <w:r>
+        <w:rPr>
+          <w:rFonts w:ascii="Times New Roman" w:hAnsi="Times New Roman"/>
+          <w:b w:val="0"/>
+          <w:i w:val="0"/>
+          <w:sz w:val="24"/>
+        </w:rPr>
+        <w:t>C. 1</w:t>
+      </w:r>
+    </w:p>
+    <w:p>
+      <w:pPr>
+        <w:spacing w:line="360" w:lineRule="auto" w:after="0"/>
+        <w:ind w:left="720" w:hanging="360"/>
+      </w:pPr>
+      <w:r>
+        <w:rPr>
+          <w:rFonts w:ascii="Times New Roman" w:hAnsi="Times New Roman"/>
+          <w:b w:val="0"/>
+          <w:i w:val="0"/>
+          <w:sz w:val="24"/>
+        </w:rPr>
+        <w:t xml:space="preserve">•  </w:t>
+      </w:r>
+      <w:r>
+        <w:rPr>
+          <w:rFonts w:ascii="Times New Roman" w:hAnsi="Times New Roman"/>
+          <w:b w:val="0"/>
+          <w:i w:val="0"/>
+          <w:sz w:val="24"/>
+        </w:rPr>
+        <w:t>D. 2</w:t>
+      </w:r>
+    </w:p>
+    <w:p>
+      <w:pPr>
+        <w:spacing w:line="360" w:lineRule="auto" w:after="0"/>
+        <w:ind w:left="720" w:hanging="360"/>
+      </w:pPr>
+      <w:r>
+        <w:rPr>
+          <w:rFonts w:ascii="Times New Roman" w:hAnsi="Times New Roman"/>
+          <w:b w:val="0"/>
+          <w:i w:val="0"/>
+          <w:sz w:val="24"/>
+        </w:rPr>
+        <w:t xml:space="preserve">•  </w:t>
+      </w:r>
+      <w:r>
+        <w:rPr>
+          <w:rFonts w:ascii="Times New Roman" w:hAnsi="Times New Roman"/>
+          <w:b w:val="0"/>
+          <w:i w:val="0"/>
+          <w:sz w:val="24"/>
+        </w:rPr>
+        <w:t>E. None of the above</w:t>
+      </w:r>
+    </w:p>
+    <w:p>
+      <w:pPr>
+        <w:spacing w:line="360" w:lineRule="auto" w:after="200"/>
+      </w:pPr>
+      <w:r>
+        <w:rPr>
+          <w:rFonts w:ascii="Times New Roman" w:hAnsi="Times New Roman"/>
+          <w:b/>
+          <w:i w:val="0"/>
+          <w:sz w:val="24"/>
+        </w:rPr>
+        <w:t>82.</w:t>
+      </w:r>
+      <w:r>
+        <w:rPr>
+          <w:rFonts w:ascii="Times New Roman" w:hAnsi="Times New Roman"/>
+          <w:b w:val="0"/>
+          <w:i w:val="0"/>
+          <w:sz w:val="24"/>
+        </w:rPr>
+        <w:t xml:space="preserve"> Unit 1: If f(x) = 2x + 1, what is the domain?</w:t>
+      </w:r>
+    </w:p>
+    <w:p>
+      <w:pPr>
+        <w:spacing w:line="360" w:lineRule="auto" w:after="0"/>
+        <w:ind w:left="720" w:hanging="360"/>
+      </w:pPr>
+      <w:r>
+        <w:rPr>
+          <w:rFonts w:ascii="Times New Roman" w:hAnsi="Times New Roman"/>
+          <w:b w:val="0"/>
+          <w:i w:val="0"/>
+          <w:sz w:val="24"/>
+        </w:rPr>
+        <w:t xml:space="preserve">•  </w:t>
+      </w:r>
+      <w:r>
+        <w:rPr>
+          <w:rFonts w:ascii="Times New Roman" w:hAnsi="Times New Roman"/>
+          <w:b w:val="0"/>
+          <w:i w:val="0"/>
+          <w:sz w:val="24"/>
+        </w:rPr>
+        <w:t>A. (2, 1]</w:t>
+      </w:r>
+    </w:p>
+    <w:p>
+      <w:pPr>
+        <w:spacing w:line="360" w:lineRule="auto" w:after="0"/>
+        <w:ind w:left="720" w:hanging="360"/>
+      </w:pPr>
+      <w:r>
+        <w:rPr>
+          <w:rFonts w:ascii="Times New Roman" w:hAnsi="Times New Roman"/>
+          <w:b w:val="0"/>
+          <w:i w:val="0"/>
+          <w:sz w:val="24"/>
+        </w:rPr>
+        <w:t xml:space="preserve">•  </w:t>
+      </w:r>
+      <w:r>
+        <w:rPr>
+          <w:rFonts w:ascii="Times New Roman" w:hAnsi="Times New Roman"/>
+          <w:b w:val="0"/>
+          <w:i w:val="0"/>
+          <w:sz w:val="24"/>
+        </w:rPr>
+        <w:t>B. [-∞, ∞]</w:t>
+      </w:r>
+    </w:p>
+    <w:p>
+      <w:pPr>
+        <w:spacing w:line="360" w:lineRule="auto" w:after="0"/>
+        <w:ind w:left="720" w:hanging="360"/>
+      </w:pPr>
+      <w:r>
+        <w:rPr>
+          <w:rFonts w:ascii="Times New Roman" w:hAnsi="Times New Roman"/>
+          <w:b w:val="0"/>
+          <w:i w:val="0"/>
+          <w:sz w:val="24"/>
+        </w:rPr>
+        <w:t xml:space="preserve">•  </w:t>
+      </w:r>
+      <w:r>
+        <w:rPr>
+          <w:rFonts w:ascii="Times New Roman" w:hAnsi="Times New Roman"/>
+          <w:b w:val="0"/>
+          <w:i w:val="0"/>
+          <w:sz w:val="24"/>
+        </w:rPr>
+        <w:t>C. (1, 2)</w:t>
+      </w:r>
+    </w:p>
+    <w:p>
+      <w:pPr>
+        <w:spacing w:line="360" w:lineRule="auto" w:after="0"/>
+        <w:ind w:left="720" w:hanging="360"/>
+      </w:pPr>
+      <w:r>
+        <w:rPr>
+          <w:rFonts w:ascii="Times New Roman" w:hAnsi="Times New Roman"/>
+          <w:b w:val="0"/>
+          <w:i w:val="0"/>
+          <w:sz w:val="24"/>
+        </w:rPr>
+        <w:t xml:space="preserve">•  </w:t>
+      </w:r>
+      <w:r>
+        <w:rPr>
+          <w:rFonts w:ascii="Times New Roman" w:hAnsi="Times New Roman"/>
+          <w:b w:val="0"/>
+          <w:i w:val="0"/>
+          <w:sz w:val="24"/>
+        </w:rPr>
+        <w:t>D. (∞, -∞)</w:t>
+      </w:r>
+    </w:p>
+    <w:p>
+      <w:pPr>
+        <w:spacing w:line="360" w:lineRule="auto" w:after="0"/>
+        <w:ind w:left="720" w:hanging="360"/>
+      </w:pPr>
+      <w:r>
+        <w:rPr>
+          <w:rFonts w:ascii="Times New Roman" w:hAnsi="Times New Roman"/>
+          <w:b w:val="0"/>
+          <w:i w:val="0"/>
+          <w:sz w:val="24"/>
+        </w:rPr>
+        <w:t xml:space="preserve">•  </w:t>
+      </w:r>
+      <w:r>
+        <w:rPr>
+          <w:rFonts w:ascii="Times New Roman" w:hAnsi="Times New Roman"/>
+          <w:b w:val="0"/>
+          <w:i w:val="0"/>
+          <w:sz w:val="24"/>
+        </w:rPr>
+        <w:t>E. (-∞, ∞)</w:t>
+      </w:r>
+    </w:p>
+    <w:p>
+      <w:pPr>
+        <w:spacing w:line="360" w:lineRule="auto" w:after="200"/>
+      </w:pPr>
+      <w:r>
+        <w:rPr>
+          <w:rFonts w:ascii="Times New Roman" w:hAnsi="Times New Roman"/>
+          <w:b/>
+          <w:i w:val="0"/>
+          <w:sz w:val="24"/>
+        </w:rPr>
+        <w:t>83.</w:t>
+      </w:r>
+      <w:r>
+        <w:rPr>
+          <w:rFonts w:ascii="Times New Roman" w:hAnsi="Times New Roman"/>
+          <w:b w:val="0"/>
+          <w:i w:val="0"/>
+          <w:sz w:val="24"/>
+        </w:rPr>
+        <w:t xml:space="preserve"> Unit 1: Find the range of f(x) = -√(2 - x).</w:t>
+      </w:r>
+    </w:p>
+    <w:p>
+      <w:pPr>
+        <w:spacing w:line="360" w:lineRule="auto" w:after="0"/>
+        <w:ind w:left="720" w:hanging="360"/>
+      </w:pPr>
+      <w:r>
+        <w:rPr>
+          <w:rFonts w:ascii="Times New Roman" w:hAnsi="Times New Roman"/>
+          <w:b w:val="0"/>
+          <w:i w:val="0"/>
+          <w:sz w:val="24"/>
+        </w:rPr>
+        <w:t xml:space="preserve">•  </w:t>
+      </w:r>
+      <w:r>
+        <w:rPr>
+          <w:rFonts w:ascii="Times New Roman" w:hAnsi="Times New Roman"/>
+          <w:b w:val="0"/>
+          <w:i w:val="0"/>
+          <w:sz w:val="24"/>
+        </w:rPr>
+        <w:t>A. [2, ∞)</w:t>
+      </w:r>
+    </w:p>
+    <w:p>
+      <w:pPr>
+        <w:spacing w:line="360" w:lineRule="auto" w:after="0"/>
+        <w:ind w:left="720" w:hanging="360"/>
+      </w:pPr>
+      <w:r>
+        <w:rPr>
+          <w:rFonts w:ascii="Times New Roman" w:hAnsi="Times New Roman"/>
+          <w:b w:val="0"/>
+          <w:i w:val="0"/>
+          <w:sz w:val="24"/>
+        </w:rPr>
+        <w:t xml:space="preserve">•  </w:t>
+      </w:r>
+      <w:r>
+        <w:rPr>
+          <w:rFonts w:ascii="Times New Roman" w:hAnsi="Times New Roman"/>
+          <w:b w:val="0"/>
+          <w:i w:val="0"/>
+          <w:sz w:val="24"/>
+        </w:rPr>
+        <w:t>B. (-∞, 0]</w:t>
+      </w:r>
+    </w:p>
+    <w:p>
+      <w:pPr>
+        <w:spacing w:line="360" w:lineRule="auto" w:after="0"/>
+        <w:ind w:left="720" w:hanging="360"/>
+      </w:pPr>
+      <w:r>
+        <w:rPr>
+          <w:rFonts w:ascii="Times New Roman" w:hAnsi="Times New Roman"/>
+          <w:b w:val="0"/>
+          <w:i w:val="0"/>
+          <w:sz w:val="24"/>
+        </w:rPr>
+        <w:t xml:space="preserve">•  </w:t>
+      </w:r>
+      <w:r>
+        <w:rPr>
+          <w:rFonts w:ascii="Times New Roman" w:hAnsi="Times New Roman"/>
+          <w:b w:val="0"/>
+          <w:i w:val="0"/>
+          <w:sz w:val="24"/>
+        </w:rPr>
+        <w:t>C. [0, ∞)</w:t>
+      </w:r>
+    </w:p>
+    <w:p>
+      <w:pPr>
+        <w:spacing w:line="360" w:lineRule="auto" w:after="0"/>
+        <w:ind w:left="720" w:hanging="360"/>
+      </w:pPr>
+      <w:r>
+        <w:rPr>
+          <w:rFonts w:ascii="Times New Roman" w:hAnsi="Times New Roman"/>
+          <w:b w:val="0"/>
+          <w:i w:val="0"/>
+          <w:sz w:val="24"/>
+        </w:rPr>
+        <w:t xml:space="preserve">•  </w:t>
+      </w:r>
+      <w:r>
+        <w:rPr>
+          <w:rFonts w:ascii="Times New Roman" w:hAnsi="Times New Roman"/>
+          <w:b w:val="0"/>
+          <w:i w:val="0"/>
+          <w:sz w:val="24"/>
+        </w:rPr>
+        <w:t>D. [-2, ∞)</w:t>
+      </w:r>
+    </w:p>
+    <w:p>
+      <w:pPr>
+        <w:spacing w:line="360" w:lineRule="auto" w:after="0"/>
+        <w:ind w:left="720" w:hanging="360"/>
+      </w:pPr>
+      <w:r>
+        <w:rPr>
+          <w:rFonts w:ascii="Times New Roman" w:hAnsi="Times New Roman"/>
+          <w:b w:val="0"/>
+          <w:i w:val="0"/>
+          <w:sz w:val="24"/>
+        </w:rPr>
+        <w:t xml:space="preserve">•  </w:t>
+      </w:r>
+      <w:r>
+        <w:rPr>
+          <w:rFonts w:ascii="Times New Roman" w:hAnsi="Times New Roman"/>
+          <w:b w:val="0"/>
+          <w:i w:val="0"/>
+          <w:sz w:val="24"/>
+        </w:rPr>
+        <w:t>E. the empty set</w:t>
+      </w:r>
+    </w:p>
+    <w:p>
+      <w:pPr>
+        <w:spacing w:line="360" w:lineRule="auto" w:after="200"/>
+      </w:pPr>
+      <w:r>
+        <w:rPr>
+          <w:rFonts w:ascii="Times New Roman" w:hAnsi="Times New Roman"/>
+          <w:b/>
+          <w:i w:val="0"/>
+          <w:sz w:val="24"/>
+        </w:rPr>
+        <w:t>84.</w:t>
+      </w:r>
+      <w:r>
+        <w:rPr>
+          <w:rFonts w:ascii="Times New Roman" w:hAnsi="Times New Roman"/>
+          <w:b w:val="0"/>
+          <w:i w:val="0"/>
+          <w:sz w:val="24"/>
+        </w:rPr>
+        <w:t xml:space="preserve"> Unit 2: Let f(x) = x² - 4 for x &lt; 0. What is f⁻¹?</w:t>
+      </w:r>
+    </w:p>
+    <w:p>
+      <w:pPr>
+        <w:spacing w:line="360" w:lineRule="auto" w:after="0"/>
+        <w:ind w:left="720" w:hanging="360"/>
+      </w:pPr>
+      <w:r>
+        <w:rPr>
+          <w:rFonts w:ascii="Times New Roman" w:hAnsi="Times New Roman"/>
+          <w:b w:val="0"/>
+          <w:i w:val="0"/>
+          <w:sz w:val="24"/>
+        </w:rPr>
+        <w:t xml:space="preserve">•  </w:t>
+      </w:r>
+      <w:r>
+        <w:rPr>
+          <w:rFonts w:ascii="Times New Roman" w:hAnsi="Times New Roman"/>
+          <w:b w:val="0"/>
+          <w:i w:val="0"/>
+          <w:sz w:val="24"/>
+        </w:rPr>
+        <w:t>A. -√(x - 4), x &gt; 4</w:t>
+      </w:r>
+    </w:p>
+    <w:p>
+      <w:pPr>
+        <w:spacing w:line="360" w:lineRule="auto" w:after="0"/>
+        <w:ind w:left="720" w:hanging="360"/>
+      </w:pPr>
+      <w:r>
+        <w:rPr>
+          <w:rFonts w:ascii="Times New Roman" w:hAnsi="Times New Roman"/>
+          <w:b w:val="0"/>
+          <w:i w:val="0"/>
+          <w:sz w:val="24"/>
+        </w:rPr>
+        <w:t xml:space="preserve">•  </w:t>
+      </w:r>
+      <w:r>
+        <w:rPr>
+          <w:rFonts w:ascii="Times New Roman" w:hAnsi="Times New Roman"/>
+          <w:b w:val="0"/>
+          <w:i w:val="0"/>
+          <w:sz w:val="24"/>
+        </w:rPr>
+        <w:t>B. -√(x - 4)</w:t>
+      </w:r>
+    </w:p>
+    <w:p>
+      <w:pPr>
+        <w:spacing w:line="360" w:lineRule="auto" w:after="0"/>
+        <w:ind w:left="720" w:hanging="360"/>
+      </w:pPr>
+      <w:r>
+        <w:rPr>
+          <w:rFonts w:ascii="Times New Roman" w:hAnsi="Times New Roman"/>
+          <w:b w:val="0"/>
+          <w:i w:val="0"/>
+          <w:sz w:val="24"/>
+        </w:rPr>
+        <w:t xml:space="preserve">•  </w:t>
+      </w:r>
+      <w:r>
+        <w:rPr>
+          <w:rFonts w:ascii="Times New Roman" w:hAnsi="Times New Roman"/>
+          <w:b w:val="0"/>
+          <w:i w:val="0"/>
+          <w:sz w:val="24"/>
+        </w:rPr>
+        <w:t>C. -√(x + 4)</w:t>
+      </w:r>
+    </w:p>
+    <w:p>
+      <w:pPr>
+        <w:spacing w:line="360" w:lineRule="auto" w:after="0"/>
+        <w:ind w:left="720" w:hanging="360"/>
+      </w:pPr>
+      <w:r>
+        <w:rPr>
+          <w:rFonts w:ascii="Times New Roman" w:hAnsi="Times New Roman"/>
+          <w:b w:val="0"/>
+          <w:i w:val="0"/>
+          <w:sz w:val="24"/>
+        </w:rPr>
+        <w:t xml:space="preserve">•  </w:t>
+      </w:r>
+      <w:r>
+        <w:rPr>
+          <w:rFonts w:ascii="Times New Roman" w:hAnsi="Times New Roman"/>
+          <w:b w:val="0"/>
+          <w:i w:val="0"/>
+          <w:sz w:val="24"/>
+        </w:rPr>
+        <w:t>D. -√(x + 4), x &gt; -4</w:t>
+      </w:r>
+    </w:p>
+    <w:p>
+      <w:pPr>
+        <w:spacing w:line="360" w:lineRule="auto" w:after="0"/>
+        <w:ind w:left="720" w:hanging="360"/>
+      </w:pPr>
+      <w:r>
+        <w:rPr>
+          <w:rFonts w:ascii="Times New Roman" w:hAnsi="Times New Roman"/>
+          <w:b w:val="0"/>
+          <w:i w:val="0"/>
+          <w:sz w:val="24"/>
+        </w:rPr>
+        <w:t xml:space="preserve">•  </w:t>
+      </w:r>
+      <w:r>
+        <w:rPr>
+          <w:rFonts w:ascii="Times New Roman" w:hAnsi="Times New Roman"/>
+          <w:b w:val="0"/>
+          <w:i w:val="0"/>
+          <w:sz w:val="24"/>
+        </w:rPr>
+        <w:t>E. None of these</w:t>
+      </w:r>
+    </w:p>
+    <w:p>
+      <w:pPr>
+        <w:spacing w:line="360" w:lineRule="auto" w:after="200"/>
+      </w:pPr>
+      <w:r>
+        <w:rPr>
+          <w:rFonts w:ascii="Times New Roman" w:hAnsi="Times New Roman"/>
+          <w:b/>
+          <w:i w:val="0"/>
+          <w:sz w:val="24"/>
+        </w:rPr>
+        <w:t>85.</w:t>
+      </w:r>
+      <w:r>
+        <w:rPr>
+          <w:rFonts w:ascii="Times New Roman" w:hAnsi="Times New Roman"/>
+          <w:b w:val="0"/>
+          <w:i w:val="0"/>
+          <w:sz w:val="24"/>
+        </w:rPr>
+        <w:t xml:space="preserve"> Unit 2: If f(x) = 2x + 3 and g(x) = x - 5, what is g ∘ f?</w:t>
+      </w:r>
+    </w:p>
+    <w:p>
+      <w:pPr>
+        <w:spacing w:line="360" w:lineRule="auto" w:after="0"/>
+        <w:ind w:left="720" w:hanging="360"/>
+      </w:pPr>
+      <w:r>
+        <w:rPr>
+          <w:rFonts w:ascii="Times New Roman" w:hAnsi="Times New Roman"/>
+          <w:b w:val="0"/>
+          <w:i w:val="0"/>
+          <w:sz w:val="24"/>
+        </w:rPr>
+        <w:t xml:space="preserve">•  </w:t>
+      </w:r>
+      <w:r>
+        <w:rPr>
+          <w:rFonts w:ascii="Times New Roman" w:hAnsi="Times New Roman"/>
+          <w:b w:val="0"/>
+          <w:i w:val="0"/>
+          <w:sz w:val="24"/>
+        </w:rPr>
+        <w:t>A. 2x - 1</w:t>
+      </w:r>
+    </w:p>
+    <w:p>
+      <w:pPr>
+        <w:spacing w:line="360" w:lineRule="auto" w:after="0"/>
+        <w:ind w:left="720" w:hanging="360"/>
+      </w:pPr>
+      <w:r>
+        <w:rPr>
+          <w:rFonts w:ascii="Times New Roman" w:hAnsi="Times New Roman"/>
+          <w:b w:val="0"/>
+          <w:i w:val="0"/>
+          <w:sz w:val="24"/>
+        </w:rPr>
+        <w:t xml:space="preserve">•  </w:t>
+      </w:r>
+      <w:r>
+        <w:rPr>
+          <w:rFonts w:ascii="Times New Roman" w:hAnsi="Times New Roman"/>
+          <w:b w:val="0"/>
+          <w:i w:val="0"/>
+          <w:sz w:val="24"/>
+        </w:rPr>
+        <w:t>B. 2x + 2</w:t>
+      </w:r>
+    </w:p>
+    <w:p>
+      <w:pPr>
+        <w:spacing w:line="360" w:lineRule="auto" w:after="0"/>
+        <w:ind w:left="720" w:hanging="360"/>
+      </w:pPr>
+      <w:r>
+        <w:rPr>
+          <w:rFonts w:ascii="Times New Roman" w:hAnsi="Times New Roman"/>
+          <w:b w:val="0"/>
+          <w:i w:val="0"/>
+          <w:sz w:val="24"/>
+        </w:rPr>
+        <w:t xml:space="preserve">•  </w:t>
+      </w:r>
+      <w:r>
+        <w:rPr>
+          <w:rFonts w:ascii="Times New Roman" w:hAnsi="Times New Roman"/>
+          <w:b w:val="0"/>
+          <w:i w:val="0"/>
+          <w:sz w:val="24"/>
+        </w:rPr>
+        <w:t>C. 2x - 2</w:t>
+      </w:r>
+    </w:p>
+    <w:p>
+      <w:pPr>
+        <w:spacing w:line="360" w:lineRule="auto" w:after="0"/>
+        <w:ind w:left="720" w:hanging="360"/>
+      </w:pPr>
+      <w:r>
+        <w:rPr>
+          <w:rFonts w:ascii="Times New Roman" w:hAnsi="Times New Roman"/>
+          <w:b w:val="0"/>
+          <w:i w:val="0"/>
+          <w:sz w:val="24"/>
+        </w:rPr>
+        <w:t xml:space="preserve">•  </w:t>
+      </w:r>
+      <w:r>
+        <w:rPr>
+          <w:rFonts w:ascii="Times New Roman" w:hAnsi="Times New Roman"/>
+          <w:b w:val="0"/>
+          <w:i w:val="0"/>
+          <w:sz w:val="24"/>
+        </w:rPr>
+        <w:t>D. None of these</w:t>
+      </w:r>
+    </w:p>
+    <w:p>
+      <w:pPr>
+        <w:spacing w:line="360" w:lineRule="auto" w:after="0"/>
+        <w:ind w:left="720" w:hanging="360"/>
+      </w:pPr>
+      <w:r>
+        <w:rPr>
+          <w:rFonts w:ascii="Times New Roman" w:hAnsi="Times New Roman"/>
+          <w:b w:val="0"/>
+          <w:i w:val="0"/>
+          <w:sz w:val="24"/>
+        </w:rPr>
+        <w:t xml:space="preserve">•  </w:t>
+      </w:r>
+      <w:r>
+        <w:rPr>
+          <w:rFonts w:ascii="Times New Roman" w:hAnsi="Times New Roman"/>
+          <w:b w:val="0"/>
+          <w:i w:val="0"/>
+          <w:sz w:val="24"/>
+        </w:rPr>
+        <w:t>E. 2x + 1</w:t>
+      </w:r>
+    </w:p>
+    <w:p>
+      <w:pPr>
+        <w:spacing w:line="360" w:lineRule="auto" w:after="200"/>
+      </w:pPr>
+      <w:r>
+        <w:rPr>
+          <w:rFonts w:ascii="Times New Roman" w:hAnsi="Times New Roman"/>
+          <w:b/>
+          <w:i w:val="0"/>
+          <w:sz w:val="24"/>
+        </w:rPr>
+        <w:t>86.</w:t>
+      </w:r>
+      <w:r>
+        <w:rPr>
+          <w:rFonts w:ascii="Times New Roman" w:hAnsi="Times New Roman"/>
+          <w:b w:val="0"/>
+          <w:i w:val="0"/>
+          <w:sz w:val="24"/>
+        </w:rPr>
+        <w:t xml:space="preserve"> Unit 2: For f(x) = √(x + 5) + 2, what is the domain of f⁻¹?</w:t>
+      </w:r>
+    </w:p>
+    <w:p>
+      <w:pPr>
+        <w:spacing w:line="360" w:lineRule="auto" w:after="0"/>
+        <w:ind w:left="720" w:hanging="360"/>
+      </w:pPr>
+      <w:r>
+        <w:rPr>
+          <w:rFonts w:ascii="Times New Roman" w:hAnsi="Times New Roman"/>
+          <w:b w:val="0"/>
+          <w:i w:val="0"/>
+          <w:sz w:val="24"/>
+        </w:rPr>
+        <w:t xml:space="preserve">•  </w:t>
+      </w:r>
+      <w:r>
+        <w:rPr>
+          <w:rFonts w:ascii="Times New Roman" w:hAnsi="Times New Roman"/>
+          <w:b w:val="0"/>
+          <w:i w:val="0"/>
+          <w:sz w:val="24"/>
+        </w:rPr>
+        <w:t>A. (-∞, ∞)</w:t>
+      </w:r>
+    </w:p>
+    <w:p>
+      <w:pPr>
+        <w:spacing w:line="360" w:lineRule="auto" w:after="0"/>
+        <w:ind w:left="720" w:hanging="360"/>
+      </w:pPr>
+      <w:r>
+        <w:rPr>
+          <w:rFonts w:ascii="Times New Roman" w:hAnsi="Times New Roman"/>
+          <w:b w:val="0"/>
+          <w:i w:val="0"/>
+          <w:sz w:val="24"/>
+        </w:rPr>
+        <w:t xml:space="preserve">•  </w:t>
+      </w:r>
+      <w:r>
+        <w:rPr>
+          <w:rFonts w:ascii="Times New Roman" w:hAnsi="Times New Roman"/>
+          <w:b w:val="0"/>
+          <w:i w:val="0"/>
+          <w:sz w:val="24"/>
+        </w:rPr>
+        <w:t>B. (0, ∞)</w:t>
+      </w:r>
+    </w:p>
+    <w:p>
+      <w:pPr>
+        <w:spacing w:line="360" w:lineRule="auto" w:after="0"/>
+        <w:ind w:left="720" w:hanging="360"/>
+      </w:pPr>
+      <w:r>
+        <w:rPr>
+          <w:rFonts w:ascii="Times New Roman" w:hAnsi="Times New Roman"/>
+          <w:b w:val="0"/>
+          <w:i w:val="0"/>
+          <w:sz w:val="24"/>
+        </w:rPr>
+        <w:t xml:space="preserve">•  </w:t>
+      </w:r>
+      <w:r>
+        <w:rPr>
+          <w:rFonts w:ascii="Times New Roman" w:hAnsi="Times New Roman"/>
+          <w:b w:val="0"/>
+          <w:i w:val="0"/>
+          <w:sz w:val="24"/>
+        </w:rPr>
+        <w:t>C. (-∞, 0)</w:t>
+      </w:r>
+    </w:p>
+    <w:p>
+      <w:pPr>
+        <w:spacing w:line="360" w:lineRule="auto" w:after="0"/>
+        <w:ind w:left="720" w:hanging="360"/>
+      </w:pPr>
+      <w:r>
+        <w:rPr>
+          <w:rFonts w:ascii="Times New Roman" w:hAnsi="Times New Roman"/>
+          <w:b w:val="0"/>
+          <w:i w:val="0"/>
+          <w:sz w:val="24"/>
+        </w:rPr>
+        <w:t xml:space="preserve">•  </w:t>
+      </w:r>
+      <w:r>
+        <w:rPr>
+          <w:rFonts w:ascii="Times New Roman" w:hAnsi="Times New Roman"/>
+          <w:b w:val="0"/>
+          <w:i w:val="0"/>
+          <w:sz w:val="24"/>
+        </w:rPr>
+        <w:t>D. None of these</w:t>
+      </w:r>
+    </w:p>
+    <w:p>
+      <w:pPr>
+        <w:spacing w:line="360" w:lineRule="auto" w:after="0"/>
+        <w:ind w:left="720" w:hanging="360"/>
+      </w:pPr>
+      <w:r>
+        <w:rPr>
+          <w:rFonts w:ascii="Times New Roman" w:hAnsi="Times New Roman"/>
+          <w:b w:val="0"/>
+          <w:i w:val="0"/>
+          <w:sz w:val="24"/>
+        </w:rPr>
+        <w:t xml:space="preserve">•  </w:t>
+      </w:r>
+      <w:r>
+        <w:rPr>
+          <w:rFonts w:ascii="Times New Roman" w:hAnsi="Times New Roman"/>
+          <w:b w:val="0"/>
+          <w:i w:val="0"/>
+          <w:sz w:val="24"/>
+        </w:rPr>
+        <w:t>E. [2, ∞)</w:t>
+      </w:r>
+    </w:p>
+    <w:p>
+      <w:pPr>
+        <w:spacing w:line="360" w:lineRule="auto" w:after="200"/>
+      </w:pPr>
+      <w:r>
+        <w:rPr>
+          <w:rFonts w:ascii="Times New Roman" w:hAnsi="Times New Roman"/>
+          <w:b/>
+          <w:i w:val="0"/>
+          <w:sz w:val="24"/>
+        </w:rPr>
+        <w:t>87.</w:t>
+      </w:r>
+      <w:r>
+        <w:rPr>
+          <w:rFonts w:ascii="Times New Roman" w:hAnsi="Times New Roman"/>
+          <w:b w:val="0"/>
+          <w:i w:val="0"/>
+          <w:sz w:val="24"/>
+        </w:rPr>
+        <w:t xml:space="preserve"> Unit 2: If f(x) = 2x + 3 and g(x) = x² + x, what is g ∘ f?</w:t>
+      </w:r>
+    </w:p>
+    <w:p>
+      <w:pPr>
+        <w:spacing w:line="360" w:lineRule="auto" w:after="0"/>
+        <w:ind w:left="720" w:hanging="360"/>
+      </w:pPr>
+      <w:r>
+        <w:rPr>
+          <w:rFonts w:ascii="Times New Roman" w:hAnsi="Times New Roman"/>
+          <w:b w:val="0"/>
+          <w:i w:val="0"/>
+          <w:sz w:val="24"/>
+        </w:rPr>
+        <w:t xml:space="preserve">•  </w:t>
+      </w:r>
+      <w:r>
+        <w:rPr>
+          <w:rFonts w:ascii="Times New Roman" w:hAnsi="Times New Roman"/>
+          <w:b w:val="0"/>
+          <w:i w:val="0"/>
+          <w:sz w:val="24"/>
+        </w:rPr>
+        <w:t>A. 2x² + 2x + 3</w:t>
+      </w:r>
+    </w:p>
+    <w:p>
+      <w:pPr>
+        <w:spacing w:line="360" w:lineRule="auto" w:after="0"/>
+        <w:ind w:left="720" w:hanging="360"/>
+      </w:pPr>
+      <w:r>
+        <w:rPr>
+          <w:rFonts w:ascii="Times New Roman" w:hAnsi="Times New Roman"/>
+          <w:b w:val="0"/>
+          <w:i w:val="0"/>
+          <w:sz w:val="24"/>
+        </w:rPr>
+        <w:t xml:space="preserve">•  </w:t>
+      </w:r>
+      <w:r>
+        <w:rPr>
+          <w:rFonts w:ascii="Times New Roman" w:hAnsi="Times New Roman"/>
+          <w:b w:val="0"/>
+          <w:i w:val="0"/>
+          <w:sz w:val="24"/>
+        </w:rPr>
+        <w:t>B. 4x² + 14x + 12</w:t>
+      </w:r>
+    </w:p>
+    <w:p>
+      <w:pPr>
+        <w:spacing w:line="360" w:lineRule="auto" w:after="0"/>
+        <w:ind w:left="720" w:hanging="360"/>
+      </w:pPr>
+      <w:r>
+        <w:rPr>
+          <w:rFonts w:ascii="Times New Roman" w:hAnsi="Times New Roman"/>
+          <w:b w:val="0"/>
+          <w:i w:val="0"/>
+          <w:sz w:val="24"/>
+        </w:rPr>
+        <w:t xml:space="preserve">•  </w:t>
+      </w:r>
+      <w:r>
+        <w:rPr>
+          <w:rFonts w:ascii="Times New Roman" w:hAnsi="Times New Roman"/>
+          <w:b w:val="0"/>
+          <w:i w:val="0"/>
+          <w:sz w:val="24"/>
+        </w:rPr>
+        <w:t>C. None of these</w:t>
+      </w:r>
+    </w:p>
+    <w:p>
+      <w:pPr>
+        <w:spacing w:line="360" w:lineRule="auto" w:after="0"/>
+        <w:ind w:left="720" w:hanging="360"/>
+      </w:pPr>
+      <w:r>
+        <w:rPr>
+          <w:rFonts w:ascii="Times New Roman" w:hAnsi="Times New Roman"/>
+          <w:b w:val="0"/>
+          <w:i w:val="0"/>
+          <w:sz w:val="24"/>
+        </w:rPr>
+        <w:t xml:space="preserve">•  </w:t>
+      </w:r>
+      <w:r>
+        <w:rPr>
+          <w:rFonts w:ascii="Times New Roman" w:hAnsi="Times New Roman"/>
+          <w:b w:val="0"/>
+          <w:i w:val="0"/>
+          <w:sz w:val="24"/>
+        </w:rPr>
+        <w:t>D. x² + 3x + 3</w:t>
+      </w:r>
+    </w:p>
+    <w:p>
+      <w:pPr>
+        <w:spacing w:line="360" w:lineRule="auto" w:after="0"/>
+        <w:ind w:left="720" w:hanging="360"/>
+      </w:pPr>
+      <w:r>
+        <w:rPr>
+          <w:rFonts w:ascii="Times New Roman" w:hAnsi="Times New Roman"/>
+          <w:b w:val="0"/>
+          <w:i w:val="0"/>
+          <w:sz w:val="24"/>
+        </w:rPr>
+        <w:t xml:space="preserve">•  </w:t>
+      </w:r>
+      <w:r>
+        <w:rPr>
+          <w:rFonts w:ascii="Times New Roman" w:hAnsi="Times New Roman"/>
+          <w:b w:val="0"/>
+          <w:i w:val="0"/>
+          <w:sz w:val="24"/>
+        </w:rPr>
+        <w:t>E. 4x² + 12x + 9</w:t>
+      </w:r>
+    </w:p>
+    <w:p>
+      <w:pPr>
+        <w:spacing w:line="360" w:lineRule="auto" w:after="200"/>
+      </w:pPr>
+      <w:r>
+        <w:rPr>
+          <w:rFonts w:ascii="Times New Roman" w:hAnsi="Times New Roman"/>
+          <w:b/>
+          <w:i w:val="0"/>
+          <w:sz w:val="24"/>
+        </w:rPr>
+        <w:t>88.</w:t>
+      </w:r>
+      <w:r>
+        <w:rPr>
+          <w:rFonts w:ascii="Times New Roman" w:hAnsi="Times New Roman"/>
+          <w:b w:val="0"/>
+          <w:i w:val="0"/>
+          <w:sz w:val="24"/>
+        </w:rPr>
+        <w:t xml:space="preserve"> Unit 2: If f(x) = 2x + 3 and g(x) = x - 5, what is f ∘ g?</w:t>
+      </w:r>
+    </w:p>
+    <w:p>
+      <w:pPr>
+        <w:spacing w:line="360" w:lineRule="auto" w:after="0"/>
+        <w:ind w:left="720" w:hanging="360"/>
+      </w:pPr>
+      <w:r>
+        <w:rPr>
+          <w:rFonts w:ascii="Times New Roman" w:hAnsi="Times New Roman"/>
+          <w:b w:val="0"/>
+          <w:i w:val="0"/>
+          <w:sz w:val="24"/>
+        </w:rPr>
+        <w:t xml:space="preserve">•  </w:t>
+      </w:r>
+      <w:r>
+        <w:rPr>
+          <w:rFonts w:ascii="Times New Roman" w:hAnsi="Times New Roman"/>
+          <w:b w:val="0"/>
+          <w:i w:val="0"/>
+          <w:sz w:val="24"/>
+        </w:rPr>
+        <w:t>A. 2x - 10</w:t>
+      </w:r>
+    </w:p>
+    <w:p>
+      <w:pPr>
+        <w:spacing w:line="360" w:lineRule="auto" w:after="0"/>
+        <w:ind w:left="720" w:hanging="360"/>
+      </w:pPr>
+      <w:r>
+        <w:rPr>
+          <w:rFonts w:ascii="Times New Roman" w:hAnsi="Times New Roman"/>
+          <w:b w:val="0"/>
+          <w:i w:val="0"/>
+          <w:sz w:val="24"/>
+        </w:rPr>
+        <w:t xml:space="preserve">•  </w:t>
+      </w:r>
+      <w:r>
+        <w:rPr>
+          <w:rFonts w:ascii="Times New Roman" w:hAnsi="Times New Roman"/>
+          <w:b w:val="0"/>
+          <w:i w:val="0"/>
+          <w:sz w:val="24"/>
+        </w:rPr>
+        <w:t>B. 2x - 7</w:t>
+      </w:r>
+    </w:p>
+    <w:p>
+      <w:pPr>
+        <w:spacing w:line="360" w:lineRule="auto" w:after="0"/>
+        <w:ind w:left="720" w:hanging="360"/>
+      </w:pPr>
+      <w:r>
+        <w:rPr>
+          <w:rFonts w:ascii="Times New Roman" w:hAnsi="Times New Roman"/>
+          <w:b w:val="0"/>
+          <w:i w:val="0"/>
+          <w:sz w:val="24"/>
+        </w:rPr>
+        <w:t xml:space="preserve">•  </w:t>
+      </w:r>
+      <w:r>
+        <w:rPr>
+          <w:rFonts w:ascii="Times New Roman" w:hAnsi="Times New Roman"/>
+          <w:b w:val="0"/>
+          <w:i w:val="0"/>
+          <w:sz w:val="24"/>
+        </w:rPr>
+        <w:t>C. 2x - 15</w:t>
+      </w:r>
+    </w:p>
+    <w:p>
+      <w:pPr>
+        <w:spacing w:line="360" w:lineRule="auto" w:after="0"/>
+        <w:ind w:left="720" w:hanging="360"/>
+      </w:pPr>
+      <w:r>
+        <w:rPr>
+          <w:rFonts w:ascii="Times New Roman" w:hAnsi="Times New Roman"/>
+          <w:b w:val="0"/>
+          <w:i w:val="0"/>
+          <w:sz w:val="24"/>
+        </w:rPr>
+        <w:t xml:space="preserve">•  </w:t>
+      </w:r>
+      <w:r>
+        <w:rPr>
+          <w:rFonts w:ascii="Times New Roman" w:hAnsi="Times New Roman"/>
+          <w:b w:val="0"/>
+          <w:i w:val="0"/>
+          <w:sz w:val="24"/>
+        </w:rPr>
+        <w:t>D. None of these</w:t>
+      </w:r>
+    </w:p>
+    <w:p>
+      <w:pPr>
+        <w:spacing w:line="360" w:lineRule="auto" w:after="0"/>
+        <w:ind w:left="720" w:hanging="360"/>
+      </w:pPr>
+      <w:r>
+        <w:rPr>
+          <w:rFonts w:ascii="Times New Roman" w:hAnsi="Times New Roman"/>
+          <w:b w:val="0"/>
+          <w:i w:val="0"/>
+          <w:sz w:val="24"/>
+        </w:rPr>
+        <w:t xml:space="preserve">•  </w:t>
+      </w:r>
+      <w:r>
+        <w:rPr>
+          <w:rFonts w:ascii="Times New Roman" w:hAnsi="Times New Roman"/>
+          <w:b w:val="0"/>
+          <w:i w:val="0"/>
+          <w:sz w:val="24"/>
+        </w:rPr>
+        <w:t>E. 2x - 5</w:t>
+      </w:r>
+    </w:p>
+    <w:p>
+      <w:pPr>
+        <w:spacing w:line="360" w:lineRule="auto" w:after="200"/>
+      </w:pPr>
+      <w:r>
+        <w:rPr>
+          <w:rFonts w:ascii="Times New Roman" w:hAnsi="Times New Roman"/>
+          <w:b/>
+          <w:i w:val="0"/>
+          <w:sz w:val="24"/>
+        </w:rPr>
+        <w:t>89.</w:t>
+      </w:r>
+      <w:r>
+        <w:rPr>
+          <w:rFonts w:ascii="Times New Roman" w:hAnsi="Times New Roman"/>
+          <w:b w:val="0"/>
+          <w:i w:val="0"/>
+          <w:sz w:val="24"/>
+        </w:rPr>
+        <w:t xml:space="preserve"> Unit 3: What are the x-intercepts of f(x) = x² - 6?</w:t>
+      </w:r>
+    </w:p>
+    <w:p>
+      <w:pPr>
+        <w:spacing w:line="360" w:lineRule="auto" w:after="0"/>
+        <w:ind w:left="720" w:hanging="360"/>
+      </w:pPr>
+      <w:r>
+        <w:rPr>
+          <w:rFonts w:ascii="Times New Roman" w:hAnsi="Times New Roman"/>
+          <w:b w:val="0"/>
+          <w:i w:val="0"/>
+          <w:sz w:val="24"/>
+        </w:rPr>
+        <w:t xml:space="preserve">•  </w:t>
+      </w:r>
+      <w:r>
+        <w:rPr>
+          <w:rFonts w:ascii="Times New Roman" w:hAnsi="Times New Roman"/>
+          <w:b w:val="0"/>
+          <w:i w:val="0"/>
+          <w:sz w:val="24"/>
+        </w:rPr>
+        <w:t>A. (0, -6)</w:t>
+      </w:r>
+    </w:p>
+    <w:p>
+      <w:pPr>
+        <w:spacing w:line="360" w:lineRule="auto" w:after="0"/>
+        <w:ind w:left="720" w:hanging="360"/>
+      </w:pPr>
+      <w:r>
+        <w:rPr>
+          <w:rFonts w:ascii="Times New Roman" w:hAnsi="Times New Roman"/>
+          <w:b w:val="0"/>
+          <w:i w:val="0"/>
+          <w:sz w:val="24"/>
+        </w:rPr>
+        <w:t xml:space="preserve">•  </w:t>
+      </w:r>
+      <w:r>
+        <w:rPr>
+          <w:rFonts w:ascii="Times New Roman" w:hAnsi="Times New Roman"/>
+          <w:b w:val="0"/>
+          <w:i w:val="0"/>
+          <w:sz w:val="24"/>
+        </w:rPr>
+        <w:t>B. {6, -6}</w:t>
+      </w:r>
+    </w:p>
+    <w:p>
+      <w:pPr>
+        <w:spacing w:line="360" w:lineRule="auto" w:after="0"/>
+        <w:ind w:left="720" w:hanging="360"/>
+      </w:pPr>
+      <w:r>
+        <w:rPr>
+          <w:rFonts w:ascii="Times New Roman" w:hAnsi="Times New Roman"/>
+          <w:b w:val="0"/>
+          <w:i w:val="0"/>
+          <w:sz w:val="24"/>
+        </w:rPr>
+        <w:t xml:space="preserve">•  </w:t>
+      </w:r>
+      <w:r>
+        <w:rPr>
+          <w:rFonts w:ascii="Times New Roman" w:hAnsi="Times New Roman"/>
+          <w:b w:val="0"/>
+          <w:i w:val="0"/>
+          <w:sz w:val="24"/>
+        </w:rPr>
+        <w:t>C. (√6, 0) and (-√6, 0)</w:t>
+      </w:r>
+    </w:p>
+    <w:p>
+      <w:pPr>
+        <w:spacing w:line="360" w:lineRule="auto" w:after="0"/>
+        <w:ind w:left="720" w:hanging="360"/>
+      </w:pPr>
+      <w:r>
+        <w:rPr>
+          <w:rFonts w:ascii="Times New Roman" w:hAnsi="Times New Roman"/>
+          <w:b w:val="0"/>
+          <w:i w:val="0"/>
+          <w:sz w:val="24"/>
+        </w:rPr>
+        <w:t xml:space="preserve">•  </w:t>
+      </w:r>
+      <w:r>
+        <w:rPr>
+          <w:rFonts w:ascii="Times New Roman" w:hAnsi="Times New Roman"/>
+          <w:b w:val="0"/>
+          <w:i w:val="0"/>
+          <w:sz w:val="24"/>
+        </w:rPr>
+        <w:t>D. There are no intercepts</w:t>
+      </w:r>
+    </w:p>
+    <w:p>
+      <w:pPr>
+        <w:spacing w:line="360" w:lineRule="auto" w:after="0"/>
+        <w:ind w:left="720" w:hanging="360"/>
+      </w:pPr>
+      <w:r>
+        <w:rPr>
+          <w:rFonts w:ascii="Times New Roman" w:hAnsi="Times New Roman"/>
+          <w:b w:val="0"/>
+          <w:i w:val="0"/>
+          <w:sz w:val="24"/>
+        </w:rPr>
+        <w:t xml:space="preserve">•  </w:t>
+      </w:r>
+      <w:r>
+        <w:rPr>
+          <w:rFonts w:ascii="Times New Roman" w:hAnsi="Times New Roman"/>
+          <w:b w:val="0"/>
+          <w:i w:val="0"/>
+          <w:sz w:val="24"/>
+        </w:rPr>
+        <w:t>E. (6, 0) and (-6, 0)</w:t>
+      </w:r>
+    </w:p>
+    <w:p>
+      <w:pPr>
+        <w:spacing w:line="360" w:lineRule="auto" w:after="200"/>
+      </w:pPr>
+      <w:r>
+        <w:rPr>
+          <w:rFonts w:ascii="Times New Roman" w:hAnsi="Times New Roman"/>
+          <w:b/>
+          <w:i w:val="0"/>
+          <w:sz w:val="24"/>
+        </w:rPr>
+        <w:t>90.</w:t>
+      </w:r>
+      <w:r>
+        <w:rPr>
+          <w:rFonts w:ascii="Times New Roman" w:hAnsi="Times New Roman"/>
+          <w:b w:val="0"/>
+          <w:i w:val="0"/>
+          <w:sz w:val="24"/>
+        </w:rPr>
+        <w:t xml:space="preserve"> Unit 3: Where does the line y = 6 meet the parabola y = x² + x for x &gt; 0?</w:t>
+      </w:r>
+    </w:p>
+    <w:p>
+      <w:pPr>
+        <w:spacing w:line="360" w:lineRule="auto" w:after="0"/>
+        <w:ind w:left="720" w:hanging="360"/>
+      </w:pPr>
+      <w:r>
+        <w:rPr>
+          <w:rFonts w:ascii="Times New Roman" w:hAnsi="Times New Roman"/>
+          <w:b w:val="0"/>
+          <w:i w:val="0"/>
+          <w:sz w:val="24"/>
+        </w:rPr>
+        <w:t xml:space="preserve">•  </w:t>
+      </w:r>
+      <w:r>
+        <w:rPr>
+          <w:rFonts w:ascii="Times New Roman" w:hAnsi="Times New Roman"/>
+          <w:b w:val="0"/>
+          <w:i w:val="0"/>
+          <w:sz w:val="24"/>
+        </w:rPr>
+        <w:t>A. (-2, 6)</w:t>
+      </w:r>
+    </w:p>
+    <w:p>
+      <w:pPr>
+        <w:spacing w:line="360" w:lineRule="auto" w:after="0"/>
+        <w:ind w:left="720" w:hanging="360"/>
+      </w:pPr>
+      <w:r>
+        <w:rPr>
+          <w:rFonts w:ascii="Times New Roman" w:hAnsi="Times New Roman"/>
+          <w:b w:val="0"/>
+          <w:i w:val="0"/>
+          <w:sz w:val="24"/>
+        </w:rPr>
+        <w:t xml:space="preserve">•  </w:t>
+      </w:r>
+      <w:r>
+        <w:rPr>
+          <w:rFonts w:ascii="Times New Roman" w:hAnsi="Times New Roman"/>
+          <w:b w:val="0"/>
+          <w:i w:val="0"/>
+          <w:sz w:val="24"/>
+        </w:rPr>
+        <w:t>B. (-1, 6)</w:t>
+      </w:r>
+    </w:p>
+    <w:p>
+      <w:pPr>
+        <w:spacing w:line="360" w:lineRule="auto" w:after="0"/>
+        <w:ind w:left="720" w:hanging="360"/>
+      </w:pPr>
+      <w:r>
+        <w:rPr>
+          <w:rFonts w:ascii="Times New Roman" w:hAnsi="Times New Roman"/>
+          <w:b w:val="0"/>
+          <w:i w:val="0"/>
+          <w:sz w:val="24"/>
+        </w:rPr>
+        <w:t xml:space="preserve">•  </w:t>
+      </w:r>
+      <w:r>
+        <w:rPr>
+          <w:rFonts w:ascii="Times New Roman" w:hAnsi="Times New Roman"/>
+          <w:b w:val="0"/>
+          <w:i w:val="0"/>
+          <w:sz w:val="24"/>
+        </w:rPr>
+        <w:t>C. (1, 6)</w:t>
+      </w:r>
+    </w:p>
+    <w:p>
+      <w:pPr>
+        <w:spacing w:line="360" w:lineRule="auto" w:after="0"/>
+        <w:ind w:left="720" w:hanging="360"/>
+      </w:pPr>
+      <w:r>
+        <w:rPr>
+          <w:rFonts w:ascii="Times New Roman" w:hAnsi="Times New Roman"/>
+          <w:b w:val="0"/>
+          <w:i w:val="0"/>
+          <w:sz w:val="24"/>
+        </w:rPr>
+        <w:t xml:space="preserve">•  </w:t>
+      </w:r>
+      <w:r>
+        <w:rPr>
+          <w:rFonts w:ascii="Times New Roman" w:hAnsi="Times New Roman"/>
+          <w:b w:val="0"/>
+          <w:i w:val="0"/>
+          <w:sz w:val="24"/>
+        </w:rPr>
+        <w:t>D. (2, 6)</w:t>
+      </w:r>
+    </w:p>
+    <w:p>
+      <w:pPr>
+        <w:spacing w:line="360" w:lineRule="auto" w:after="0"/>
+        <w:ind w:left="720" w:hanging="360"/>
+      </w:pPr>
+      <w:r>
+        <w:rPr>
+          <w:rFonts w:ascii="Times New Roman" w:hAnsi="Times New Roman"/>
+          <w:b w:val="0"/>
+          <w:i w:val="0"/>
+          <w:sz w:val="24"/>
+        </w:rPr>
+        <w:t xml:space="preserve">•  </w:t>
+      </w:r>
+      <w:r>
+        <w:rPr>
+          <w:rFonts w:ascii="Times New Roman" w:hAnsi="Times New Roman"/>
+          <w:b w:val="0"/>
+          <w:i w:val="0"/>
+          <w:sz w:val="24"/>
+        </w:rPr>
+        <w:t>E. None of these</w:t>
+      </w:r>
+    </w:p>
+    <w:p>
+      <w:pPr>
+        <w:spacing w:line="360" w:lineRule="auto" w:after="200"/>
+      </w:pPr>
+      <w:r>
+        <w:rPr>
+          <w:rFonts w:ascii="Times New Roman" w:hAnsi="Times New Roman"/>
+          <w:b/>
+          <w:i w:val="0"/>
+          <w:sz w:val="24"/>
+        </w:rPr>
+        <w:t>91.</w:t>
+      </w:r>
+      <w:r>
+        <w:rPr>
+          <w:rFonts w:ascii="Times New Roman" w:hAnsi="Times New Roman"/>
+          <w:b w:val="0"/>
+          <w:i w:val="0"/>
+          <w:sz w:val="24"/>
+        </w:rPr>
+        <w:t xml:space="preserve"> Unit 3: What is the equation of the line through (-1, 4) and (-2, 7)?</w:t>
+      </w:r>
+    </w:p>
+    <w:p>
+      <w:pPr>
+        <w:spacing w:line="360" w:lineRule="auto" w:after="0"/>
+        <w:ind w:left="720" w:hanging="360"/>
+      </w:pPr>
+      <w:r>
+        <w:rPr>
+          <w:rFonts w:ascii="Times New Roman" w:hAnsi="Times New Roman"/>
+          <w:b w:val="0"/>
+          <w:i w:val="0"/>
+          <w:sz w:val="24"/>
+        </w:rPr>
+        <w:t xml:space="preserve">•  </w:t>
+      </w:r>
+      <w:r>
+        <w:rPr>
+          <w:rFonts w:ascii="Times New Roman" w:hAnsi="Times New Roman"/>
+          <w:b w:val="0"/>
+          <w:i w:val="0"/>
+          <w:sz w:val="24"/>
+        </w:rPr>
+        <w:t>A. y = 3x + 1</w:t>
+      </w:r>
+    </w:p>
+    <w:p>
+      <w:pPr>
+        <w:spacing w:line="360" w:lineRule="auto" w:after="0"/>
+        <w:ind w:left="720" w:hanging="360"/>
+      </w:pPr>
+      <w:r>
+        <w:rPr>
+          <w:rFonts w:ascii="Times New Roman" w:hAnsi="Times New Roman"/>
+          <w:b w:val="0"/>
+          <w:i w:val="0"/>
+          <w:sz w:val="24"/>
+        </w:rPr>
+        <w:t xml:space="preserve">•  </w:t>
+      </w:r>
+      <w:r>
+        <w:rPr>
+          <w:rFonts w:ascii="Times New Roman" w:hAnsi="Times New Roman"/>
+          <w:b w:val="0"/>
+          <w:i w:val="0"/>
+          <w:sz w:val="24"/>
+        </w:rPr>
+        <w:t>B. y = -3x + 1</w:t>
+      </w:r>
+    </w:p>
+    <w:p>
+      <w:pPr>
+        <w:spacing w:line="360" w:lineRule="auto" w:after="0"/>
+        <w:ind w:left="720" w:hanging="360"/>
+      </w:pPr>
+      <w:r>
+        <w:rPr>
+          <w:rFonts w:ascii="Times New Roman" w:hAnsi="Times New Roman"/>
+          <w:b w:val="0"/>
+          <w:i w:val="0"/>
+          <w:sz w:val="24"/>
+        </w:rPr>
+        <w:t xml:space="preserve">•  </w:t>
+      </w:r>
+      <w:r>
+        <w:rPr>
+          <w:rFonts w:ascii="Times New Roman" w:hAnsi="Times New Roman"/>
+          <w:b w:val="0"/>
+          <w:i w:val="0"/>
+          <w:sz w:val="24"/>
+        </w:rPr>
+        <w:t>C. y = -3x + 7</w:t>
+      </w:r>
+    </w:p>
+    <w:p>
+      <w:pPr>
+        <w:spacing w:line="360" w:lineRule="auto" w:after="0"/>
+        <w:ind w:left="720" w:hanging="360"/>
+      </w:pPr>
+      <w:r>
+        <w:rPr>
+          <w:rFonts w:ascii="Times New Roman" w:hAnsi="Times New Roman"/>
+          <w:b w:val="0"/>
+          <w:i w:val="0"/>
+          <w:sz w:val="24"/>
+        </w:rPr>
+        <w:t xml:space="preserve">•  </w:t>
+      </w:r>
+      <w:r>
+        <w:rPr>
+          <w:rFonts w:ascii="Times New Roman" w:hAnsi="Times New Roman"/>
+          <w:b w:val="0"/>
+          <w:i w:val="0"/>
+          <w:sz w:val="24"/>
+        </w:rPr>
+        <w:t>D. y = 3x + 7</w:t>
+      </w:r>
+    </w:p>
+    <w:p>
+      <w:pPr>
+        <w:spacing w:line="360" w:lineRule="auto" w:after="0"/>
+        <w:ind w:left="720" w:hanging="360"/>
+      </w:pPr>
+      <w:r>
+        <w:rPr>
+          <w:rFonts w:ascii="Times New Roman" w:hAnsi="Times New Roman"/>
+          <w:b w:val="0"/>
+          <w:i w:val="0"/>
+          <w:sz w:val="24"/>
+        </w:rPr>
+        <w:t xml:space="preserve">•  </w:t>
+      </w:r>
+      <w:r>
+        <w:rPr>
+          <w:rFonts w:ascii="Times New Roman" w:hAnsi="Times New Roman"/>
+          <w:b w:val="0"/>
+          <w:i w:val="0"/>
+          <w:sz w:val="24"/>
+        </w:rPr>
+        <w:t>E. None of these</w:t>
+      </w:r>
+    </w:p>
+    <w:p>
+      <w:pPr>
+        <w:spacing w:line="360" w:lineRule="auto" w:after="200"/>
+      </w:pPr>
+      <w:r>
+        <w:rPr>
+          <w:rFonts w:ascii="Times New Roman" w:hAnsi="Times New Roman"/>
+          <w:b/>
+          <w:i w:val="0"/>
+          <w:sz w:val="24"/>
+        </w:rPr>
+        <w:t>92.</w:t>
+      </w:r>
+      <w:r>
+        <w:rPr>
+          <w:rFonts w:ascii="Times New Roman" w:hAnsi="Times New Roman"/>
+          <w:b w:val="0"/>
+          <w:i w:val="0"/>
+          <w:sz w:val="24"/>
+        </w:rPr>
+        <w:t xml:space="preserve"> Unit 3: A frog's jump is modelled by f(x) = -x² + 2x and it lands after 2 seconds. Maximum height?</w:t>
+      </w:r>
+    </w:p>
+    <w:p>
+      <w:pPr>
+        <w:spacing w:line="360" w:lineRule="auto" w:after="0"/>
+        <w:ind w:left="720" w:hanging="360"/>
+      </w:pPr>
+      <w:r>
+        <w:rPr>
+          <w:rFonts w:ascii="Times New Roman" w:hAnsi="Times New Roman"/>
+          <w:b w:val="0"/>
+          <w:i w:val="0"/>
+          <w:sz w:val="24"/>
+        </w:rPr>
+        <w:t xml:space="preserve">•  </w:t>
+      </w:r>
+      <w:r>
+        <w:rPr>
+          <w:rFonts w:ascii="Times New Roman" w:hAnsi="Times New Roman"/>
+          <w:b w:val="0"/>
+          <w:i w:val="0"/>
+          <w:sz w:val="24"/>
+        </w:rPr>
+        <w:t>A. 2</w:t>
+      </w:r>
+    </w:p>
+    <w:p>
+      <w:pPr>
+        <w:spacing w:line="360" w:lineRule="auto" w:after="0"/>
+        <w:ind w:left="720" w:hanging="360"/>
+      </w:pPr>
+      <w:r>
+        <w:rPr>
+          <w:rFonts w:ascii="Times New Roman" w:hAnsi="Times New Roman"/>
+          <w:b w:val="0"/>
+          <w:i w:val="0"/>
+          <w:sz w:val="24"/>
+        </w:rPr>
+        <w:t xml:space="preserve">•  </w:t>
+      </w:r>
+      <w:r>
+        <w:rPr>
+          <w:rFonts w:ascii="Times New Roman" w:hAnsi="Times New Roman"/>
+          <w:b w:val="0"/>
+          <w:i w:val="0"/>
+          <w:sz w:val="24"/>
+        </w:rPr>
+        <w:t>B. 0</w:t>
+      </w:r>
+    </w:p>
+    <w:p>
+      <w:pPr>
+        <w:spacing w:line="360" w:lineRule="auto" w:after="0"/>
+        <w:ind w:left="720" w:hanging="360"/>
+      </w:pPr>
+      <w:r>
+        <w:rPr>
+          <w:rFonts w:ascii="Times New Roman" w:hAnsi="Times New Roman"/>
+          <w:b w:val="0"/>
+          <w:i w:val="0"/>
+          <w:sz w:val="24"/>
+        </w:rPr>
+        <w:t xml:space="preserve">•  </w:t>
+      </w:r>
+      <w:r>
+        <w:rPr>
+          <w:rFonts w:ascii="Times New Roman" w:hAnsi="Times New Roman"/>
+          <w:b w:val="0"/>
+          <w:i w:val="0"/>
+          <w:sz w:val="24"/>
+        </w:rPr>
+        <w:t>C. 1</w:t>
+      </w:r>
+    </w:p>
+    <w:p>
+      <w:pPr>
+        <w:spacing w:line="360" w:lineRule="auto" w:after="0"/>
+        <w:ind w:left="720" w:hanging="360"/>
+      </w:pPr>
+      <w:r>
+        <w:rPr>
+          <w:rFonts w:ascii="Times New Roman" w:hAnsi="Times New Roman"/>
+          <w:b w:val="0"/>
+          <w:i w:val="0"/>
+          <w:sz w:val="24"/>
+        </w:rPr>
+        <w:t xml:space="preserve">•  </w:t>
+      </w:r>
+      <w:r>
+        <w:rPr>
+          <w:rFonts w:ascii="Times New Roman" w:hAnsi="Times New Roman"/>
+          <w:b w:val="0"/>
+          <w:i w:val="0"/>
+          <w:sz w:val="24"/>
+        </w:rPr>
+        <w:t>D. None of these.</w:t>
+      </w:r>
+    </w:p>
+    <w:p>
+      <w:pPr>
+        <w:spacing w:line="360" w:lineRule="auto" w:after="0"/>
+        <w:ind w:left="720" w:hanging="360"/>
+      </w:pPr>
+      <w:r>
+        <w:rPr>
+          <w:rFonts w:ascii="Times New Roman" w:hAnsi="Times New Roman"/>
+          <w:b w:val="0"/>
+          <w:i w:val="0"/>
+          <w:sz w:val="24"/>
+        </w:rPr>
+        <w:t xml:space="preserve">•  </w:t>
+      </w:r>
+      <w:r>
+        <w:rPr>
+          <w:rFonts w:ascii="Times New Roman" w:hAnsi="Times New Roman"/>
+          <w:b w:val="0"/>
+          <w:i w:val="0"/>
+          <w:sz w:val="24"/>
+        </w:rPr>
+        <w:t>E. The frog jumps into outer space.</w:t>
+      </w:r>
+    </w:p>
+    <w:p>
+      <w:pPr>
+        <w:spacing w:line="360" w:lineRule="auto" w:after="200"/>
+      </w:pPr>
+      <w:r>
+        <w:rPr>
+          <w:rFonts w:ascii="Times New Roman" w:hAnsi="Times New Roman"/>
+          <w:b/>
+          <w:i w:val="0"/>
+          <w:sz w:val="24"/>
+        </w:rPr>
+        <w:t>93.</w:t>
+      </w:r>
+      <w:r>
+        <w:rPr>
+          <w:rFonts w:ascii="Times New Roman" w:hAnsi="Times New Roman"/>
+          <w:b w:val="0"/>
+          <w:i w:val="0"/>
+          <w:sz w:val="24"/>
+        </w:rPr>
+        <w:t xml:space="preserve"> Unit 3: f(x) is a quadratic with vertex (1, -2) that opens up. Which is f?</w:t>
+      </w:r>
+    </w:p>
+    <w:p>
+      <w:pPr>
+        <w:spacing w:line="360" w:lineRule="auto" w:after="0"/>
+        <w:ind w:left="720" w:hanging="360"/>
+      </w:pPr>
+      <w:r>
+        <w:rPr>
+          <w:rFonts w:ascii="Times New Roman" w:hAnsi="Times New Roman"/>
+          <w:b w:val="0"/>
+          <w:i w:val="0"/>
+          <w:sz w:val="24"/>
+        </w:rPr>
+        <w:t xml:space="preserve">•  </w:t>
+      </w:r>
+      <w:r>
+        <w:rPr>
+          <w:rFonts w:ascii="Times New Roman" w:hAnsi="Times New Roman"/>
+          <w:b w:val="0"/>
+          <w:i w:val="0"/>
+          <w:sz w:val="24"/>
+        </w:rPr>
+        <w:t>A. x² - 2x - 1</w:t>
+      </w:r>
+    </w:p>
+    <w:p>
+      <w:pPr>
+        <w:spacing w:line="360" w:lineRule="auto" w:after="0"/>
+        <w:ind w:left="720" w:hanging="360"/>
+      </w:pPr>
+      <w:r>
+        <w:rPr>
+          <w:rFonts w:ascii="Times New Roman" w:hAnsi="Times New Roman"/>
+          <w:b w:val="0"/>
+          <w:i w:val="0"/>
+          <w:sz w:val="24"/>
+        </w:rPr>
+        <w:t xml:space="preserve">•  </w:t>
+      </w:r>
+      <w:r>
+        <w:rPr>
+          <w:rFonts w:ascii="Times New Roman" w:hAnsi="Times New Roman"/>
+          <w:b w:val="0"/>
+          <w:i w:val="0"/>
+          <w:sz w:val="24"/>
+        </w:rPr>
+        <w:t>B. x² - 2x + 1</w:t>
+      </w:r>
+    </w:p>
+    <w:p>
+      <w:pPr>
+        <w:spacing w:line="360" w:lineRule="auto" w:after="0"/>
+        <w:ind w:left="720" w:hanging="360"/>
+      </w:pPr>
+      <w:r>
+        <w:rPr>
+          <w:rFonts w:ascii="Times New Roman" w:hAnsi="Times New Roman"/>
+          <w:b w:val="0"/>
+          <w:i w:val="0"/>
+          <w:sz w:val="24"/>
+        </w:rPr>
+        <w:t xml:space="preserve">•  </w:t>
+      </w:r>
+      <w:r>
+        <w:rPr>
+          <w:rFonts w:ascii="Times New Roman" w:hAnsi="Times New Roman"/>
+          <w:b w:val="0"/>
+          <w:i w:val="0"/>
+          <w:sz w:val="24"/>
+        </w:rPr>
+        <w:t>C. x² + 2x - 1</w:t>
+      </w:r>
+    </w:p>
+    <w:p>
+      <w:pPr>
+        <w:spacing w:line="360" w:lineRule="auto" w:after="0"/>
+        <w:ind w:left="720" w:hanging="360"/>
+      </w:pPr>
+      <w:r>
+        <w:rPr>
+          <w:rFonts w:ascii="Times New Roman" w:hAnsi="Times New Roman"/>
+          <w:b w:val="0"/>
+          <w:i w:val="0"/>
+          <w:sz w:val="24"/>
+        </w:rPr>
+        <w:t xml:space="preserve">•  </w:t>
+      </w:r>
+      <w:r>
+        <w:rPr>
+          <w:rFonts w:ascii="Times New Roman" w:hAnsi="Times New Roman"/>
+          <w:b w:val="0"/>
+          <w:i w:val="0"/>
+          <w:sz w:val="24"/>
+        </w:rPr>
+        <w:t>D. x² + 2x + 1</w:t>
+      </w:r>
+    </w:p>
+    <w:p>
+      <w:pPr>
+        <w:spacing w:line="360" w:lineRule="auto" w:after="0"/>
+        <w:ind w:left="720" w:hanging="360"/>
+      </w:pPr>
+      <w:r>
+        <w:rPr>
+          <w:rFonts w:ascii="Times New Roman" w:hAnsi="Times New Roman"/>
+          <w:b w:val="0"/>
+          <w:i w:val="0"/>
+          <w:sz w:val="24"/>
+        </w:rPr>
+        <w:t xml:space="preserve">•  </w:t>
+      </w:r>
+      <w:r>
+        <w:rPr>
+          <w:rFonts w:ascii="Times New Roman" w:hAnsi="Times New Roman"/>
+          <w:b w:val="0"/>
+          <w:i w:val="0"/>
+          <w:sz w:val="24"/>
+        </w:rPr>
+        <w:t>E. None of these</w:t>
+      </w:r>
+    </w:p>
+    <w:p>
+      <w:pPr>
         <w:pStyle w:val="Heading1"/>
         <w:jc w:val="left"/>
       </w:pPr>
@@ -14997,6 +17133,351 @@
     </w:p>
     <w:p>
       <w:pPr>
+        <w:spacing w:line="360" w:lineRule="auto" w:after="200"/>
+      </w:pPr>
+      <w:r>
+        <w:rPr>
+          <w:rFonts w:ascii="Times New Roman" w:hAnsi="Times New Roman"/>
+          <w:b/>
+          <w:i w:val="0"/>
+          <w:sz w:val="24"/>
+        </w:rPr>
+        <w:t>79. B</w:t>
+      </w:r>
+      <w:r>
+        <w:rPr>
+          <w:rFonts w:ascii="Times New Roman" w:hAnsi="Times New Roman"/>
+          <w:b w:val="0"/>
+          <w:i w:val="0"/>
+          <w:sz w:val="24"/>
+        </w:rPr>
+        <w:t xml:space="preserve"> (undefined). (f/g)(4) = f(4)/g(4) = 14/0. Division by zero is undefined, so 4 is not in the domain of f/g.</w:t>
+      </w:r>
+    </w:p>
+    <w:p>
+      <w:pPr>
+        <w:spacing w:line="360" w:lineRule="auto" w:after="200"/>
+      </w:pPr>
+      <w:r>
+        <w:rPr>
+          <w:rFonts w:ascii="Times New Roman" w:hAnsi="Times New Roman"/>
+          <w:b/>
+          <w:i w:val="0"/>
+          <w:sz w:val="24"/>
+        </w:rPr>
+        <w:t>80. C</w:t>
+      </w:r>
+      <w:r>
+        <w:rPr>
+          <w:rFonts w:ascii="Times New Roman" w:hAnsi="Times New Roman"/>
+          <w:b w:val="0"/>
+          <w:i w:val="0"/>
+          <w:sz w:val="24"/>
+        </w:rPr>
+        <w:t xml:space="preserve"> ((-∞, 2]). √(2 - x) takes every value from 0 upward, so 2 minus it takes every value from 2 downward: (-∞, 2].</w:t>
+      </w:r>
+    </w:p>
+    <w:p>
+      <w:pPr>
+        <w:spacing w:line="360" w:lineRule="auto" w:after="200"/>
+      </w:pPr>
+      <w:r>
+        <w:rPr>
+          <w:rFonts w:ascii="Times New Roman" w:hAnsi="Times New Roman"/>
+          <w:b/>
+          <w:i w:val="0"/>
+          <w:sz w:val="24"/>
+        </w:rPr>
+        <w:t>81. B</w:t>
+      </w:r>
+      <w:r>
+        <w:rPr>
+          <w:rFonts w:ascii="Times New Roman" w:hAnsi="Times New Roman"/>
+          <w:b w:val="0"/>
+          <w:i w:val="0"/>
+          <w:sz w:val="24"/>
+        </w:rPr>
+        <w:t xml:space="preserve"> (-1). [g(2) - g(-1)] / (2 - (-1)) = (1 - 4) / 3 = -1.</w:t>
+      </w:r>
+    </w:p>
+    <w:p>
+      <w:pPr>
+        <w:spacing w:line="360" w:lineRule="auto" w:after="200"/>
+      </w:pPr>
+      <w:r>
+        <w:rPr>
+          <w:rFonts w:ascii="Times New Roman" w:hAnsi="Times New Roman"/>
+          <w:b/>
+          <w:i w:val="0"/>
+          <w:sz w:val="24"/>
+        </w:rPr>
+        <w:t>82. E</w:t>
+      </w:r>
+      <w:r>
+        <w:rPr>
+          <w:rFonts w:ascii="Times New Roman" w:hAnsi="Times New Roman"/>
+          <w:b w:val="0"/>
+          <w:i w:val="0"/>
+          <w:sz w:val="24"/>
+        </w:rPr>
+        <w:t xml:space="preserve"> ((-∞, ∞)). A line accepts every real number: (-∞, ∞). Infinity always takes a ROUND bracket, so [-∞, ∞] is wrong.</w:t>
+      </w:r>
+    </w:p>
+    <w:p>
+      <w:pPr>
+        <w:spacing w:line="360" w:lineRule="auto" w:after="200"/>
+      </w:pPr>
+      <w:r>
+        <w:rPr>
+          <w:rFonts w:ascii="Times New Roman" w:hAnsi="Times New Roman"/>
+          <w:b/>
+          <w:i w:val="0"/>
+          <w:sz w:val="24"/>
+        </w:rPr>
+        <w:t>83. B</w:t>
+      </w:r>
+      <w:r>
+        <w:rPr>
+          <w:rFonts w:ascii="Times New Roman" w:hAnsi="Times New Roman"/>
+          <w:b w:val="0"/>
+          <w:i w:val="0"/>
+          <w:sz w:val="24"/>
+        </w:rPr>
+        <w:t xml:space="preserve"> ((-∞, 0]). √(2 - x) ≥ 0, and the minus sign flips it to ≤ 0: (-∞, 0].</w:t>
+      </w:r>
+    </w:p>
+    <w:p>
+      <w:pPr>
+        <w:spacing w:line="360" w:lineRule="auto" w:after="200"/>
+      </w:pPr>
+      <w:r>
+        <w:rPr>
+          <w:rFonts w:ascii="Times New Roman" w:hAnsi="Times New Roman"/>
+          <w:b/>
+          <w:i w:val="0"/>
+          <w:sz w:val="24"/>
+        </w:rPr>
+        <w:t>84. D</w:t>
+      </w:r>
+      <w:r>
+        <w:rPr>
+          <w:rFonts w:ascii="Times New Roman" w:hAnsi="Times New Roman"/>
+          <w:b w:val="0"/>
+          <w:i w:val="0"/>
+          <w:sz w:val="24"/>
+        </w:rPr>
+        <w:t xml:space="preserve"> (-√(x + 4), x &gt; -4). Swap: x = y² - 4, so y² = x + 4 and y = ±√(x + 4). The original x-values were negative, so the inverse outputs must be negative: take the minus root. Its domain is the range of f, x &gt; -4.</w:t>
+      </w:r>
+    </w:p>
+    <w:p>
+      <w:pPr>
+        <w:spacing w:line="360" w:lineRule="auto" w:after="200"/>
+      </w:pPr>
+      <w:r>
+        <w:rPr>
+          <w:rFonts w:ascii="Times New Roman" w:hAnsi="Times New Roman"/>
+          <w:b/>
+          <w:i w:val="0"/>
+          <w:sz w:val="24"/>
+        </w:rPr>
+        <w:t>85. C</w:t>
+      </w:r>
+      <w:r>
+        <w:rPr>
+          <w:rFonts w:ascii="Times New Roman" w:hAnsi="Times New Roman"/>
+          <w:b w:val="0"/>
+          <w:i w:val="0"/>
+          <w:sz w:val="24"/>
+        </w:rPr>
+        <w:t xml:space="preserve"> (2x - 2). YOU MISSED THIS ONE. g ∘ f means g(f(x)): put the WHOLE f(x) into g. g(2x + 3) = (2x + 3) - 5 = 2x - 2. The answer 2x + 2 comes from adding instead of subtracting. Always write g(   ) first, then fill the brackets with f(x).</w:t>
+      </w:r>
+    </w:p>
+    <w:p>
+      <w:pPr>
+        <w:spacing w:line="360" w:lineRule="auto" w:after="200"/>
+      </w:pPr>
+      <w:r>
+        <w:rPr>
+          <w:rFonts w:ascii="Times New Roman" w:hAnsi="Times New Roman"/>
+          <w:b/>
+          <w:i w:val="0"/>
+          <w:sz w:val="24"/>
+        </w:rPr>
+        <w:t>86. E</w:t>
+      </w:r>
+      <w:r>
+        <w:rPr>
+          <w:rFonts w:ascii="Times New Roman" w:hAnsi="Times New Roman"/>
+          <w:b w:val="0"/>
+          <w:i w:val="0"/>
+          <w:sz w:val="24"/>
+        </w:rPr>
+        <w:t xml:space="preserve"> ([2, ∞)). Domain of f⁻¹ = range of f. √(x + 5) ≥ 0, so √(x + 5) + 2 ≥ 2: [2, ∞).</w:t>
+      </w:r>
+    </w:p>
+    <w:p>
+      <w:pPr>
+        <w:spacing w:line="360" w:lineRule="auto" w:after="200"/>
+      </w:pPr>
+      <w:r>
+        <w:rPr>
+          <w:rFonts w:ascii="Times New Roman" w:hAnsi="Times New Roman"/>
+          <w:b/>
+          <w:i w:val="0"/>
+          <w:sz w:val="24"/>
+        </w:rPr>
+        <w:t>87. B</w:t>
+      </w:r>
+      <w:r>
+        <w:rPr>
+          <w:rFonts w:ascii="Times New Roman" w:hAnsi="Times New Roman"/>
+          <w:b w:val="0"/>
+          <w:i w:val="0"/>
+          <w:sz w:val="24"/>
+        </w:rPr>
+        <w:t xml:space="preserve"> (4x² + 14x + 12). g(2x + 3) = (2x + 3)² + (2x + 3) = 4x² + 12x + 9 + 2x + 3 = 4x² + 14x + 12.</w:t>
+      </w:r>
+    </w:p>
+    <w:p>
+      <w:pPr>
+        <w:spacing w:line="360" w:lineRule="auto" w:after="200"/>
+      </w:pPr>
+      <w:r>
+        <w:rPr>
+          <w:rFonts w:ascii="Times New Roman" w:hAnsi="Times New Roman"/>
+          <w:b/>
+          <w:i w:val="0"/>
+          <w:sz w:val="24"/>
+        </w:rPr>
+        <w:t>88. B</w:t>
+      </w:r>
+      <w:r>
+        <w:rPr>
+          <w:rFonts w:ascii="Times New Roman" w:hAnsi="Times New Roman"/>
+          <w:b w:val="0"/>
+          <w:i w:val="0"/>
+          <w:sz w:val="24"/>
+        </w:rPr>
+        <w:t xml:space="preserve"> (2x - 7). f(g(x)) = f(x - 5) = 2(x - 5) + 3 = 2x - 10 + 3 = 2x - 7. Compare with g ∘ f = 2x - 2: the order matters.</w:t>
+      </w:r>
+    </w:p>
+    <w:p>
+      <w:pPr>
+        <w:spacing w:line="360" w:lineRule="auto" w:after="200"/>
+      </w:pPr>
+      <w:r>
+        <w:rPr>
+          <w:rFonts w:ascii="Times New Roman" w:hAnsi="Times New Roman"/>
+          <w:b/>
+          <w:i w:val="0"/>
+          <w:sz w:val="24"/>
+        </w:rPr>
+        <w:t>89. C</w:t>
+      </w:r>
+      <w:r>
+        <w:rPr>
+          <w:rFonts w:ascii="Times New Roman" w:hAnsi="Times New Roman"/>
+          <w:b w:val="0"/>
+          <w:i w:val="0"/>
+          <w:sz w:val="24"/>
+        </w:rPr>
+        <w:t xml:space="preserve"> ((√6, 0) and (-√6, 0)). Set f(x) = 0: x² = 6, x = ±√6. Intercepts are points with y = 0. (0, -6) is the y-intercept.</w:t>
+      </w:r>
+    </w:p>
+    <w:p>
+      <w:pPr>
+        <w:spacing w:line="360" w:lineRule="auto" w:after="200"/>
+      </w:pPr>
+      <w:r>
+        <w:rPr>
+          <w:rFonts w:ascii="Times New Roman" w:hAnsi="Times New Roman"/>
+          <w:b/>
+          <w:i w:val="0"/>
+          <w:sz w:val="24"/>
+        </w:rPr>
+        <w:t>90. D</w:t>
+      </w:r>
+      <w:r>
+        <w:rPr>
+          <w:rFonts w:ascii="Times New Roman" w:hAnsi="Times New Roman"/>
+          <w:b w:val="0"/>
+          <w:i w:val="0"/>
+          <w:sz w:val="24"/>
+        </w:rPr>
+        <w:t xml:space="preserve"> ((2, 6)). x² + x = 6, so x² + x - 6 = 0, (x + 3)(x - 2) = 0. With x &gt; 0, x = 2: the point (2, 6).</w:t>
+      </w:r>
+    </w:p>
+    <w:p>
+      <w:pPr>
+        <w:spacing w:line="360" w:lineRule="auto" w:after="200"/>
+      </w:pPr>
+      <w:r>
+        <w:rPr>
+          <w:rFonts w:ascii="Times New Roman" w:hAnsi="Times New Roman"/>
+          <w:b/>
+          <w:i w:val="0"/>
+          <w:sz w:val="24"/>
+        </w:rPr>
+        <w:t>91. B</w:t>
+      </w:r>
+      <w:r>
+        <w:rPr>
+          <w:rFonts w:ascii="Times New Roman" w:hAnsi="Times New Roman"/>
+          <w:b w:val="0"/>
+          <w:i w:val="0"/>
+          <w:sz w:val="24"/>
+        </w:rPr>
+        <w:t xml:space="preserve"> (y = -3x + 1). Slope = (7 - 4)/(-2 - (-1)) = 3/(-1) = -3. Point-slope: y - 4 = -3(x + 1), so y = -3x + 1.</w:t>
+      </w:r>
+    </w:p>
+    <w:p>
+      <w:pPr>
+        <w:spacing w:line="360" w:lineRule="auto" w:after="200"/>
+      </w:pPr>
+      <w:r>
+        <w:rPr>
+          <w:rFonts w:ascii="Times New Roman" w:hAnsi="Times New Roman"/>
+          <w:b/>
+          <w:i w:val="0"/>
+          <w:sz w:val="24"/>
+        </w:rPr>
+        <w:t>92. C</w:t>
+      </w:r>
+      <w:r>
+        <w:rPr>
+          <w:rFonts w:ascii="Times New Roman" w:hAnsi="Times New Roman"/>
+          <w:b w:val="0"/>
+          <w:i w:val="0"/>
+          <w:sz w:val="24"/>
+        </w:rPr>
+        <w:t xml:space="preserve"> (1). The vertex is halfway through the flight: x = -b/(2a) = -2/(-2) = 1, and f(1) = -1 + 2 = 1.</w:t>
+      </w:r>
+    </w:p>
+    <w:p>
+      <w:pPr>
+        <w:spacing w:line="360" w:lineRule="auto" w:after="200"/>
+      </w:pPr>
+      <w:r>
+        <w:rPr>
+          <w:rFonts w:ascii="Times New Roman" w:hAnsi="Times New Roman"/>
+          <w:b/>
+          <w:i w:val="0"/>
+          <w:sz w:val="24"/>
+        </w:rPr>
+        <w:t>93. A</w:t>
+      </w:r>
+      <w:r>
+        <w:rPr>
+          <w:rFonts w:ascii="Times New Roman" w:hAnsi="Times New Roman"/>
+          <w:b w:val="0"/>
+          <w:i w:val="0"/>
+          <w:sz w:val="24"/>
+        </w:rPr>
+        <w:t xml:space="preserve"> (x² - 2x - 1). Vertex form (x - 1)² - 2 = x² - 2x + 1 - 2 = x² - 2x - 1.</w:t>
+      </w:r>
+    </w:p>
+    <w:p>
+      <w:pPr>
         <w:pStyle w:val="Heading1"/>
         <w:jc w:val="left"/>
       </w:pPr>
@@ -15140,6 +17621,39 @@
           <w:sz w:val="24"/>
         </w:rPr>
         <w:t xml:space="preserve"> with multiple choice, you can test each option in the equation when solving directly is slow.</w:t>
+      </w:r>
+    </w:p>
+    <w:p>
+      <w:pPr>
+        <w:spacing w:line="360" w:lineRule="auto" w:after="0"/>
+        <w:ind w:left="720" w:hanging="360"/>
+      </w:pPr>
+      <w:r>
+        <w:rPr>
+          <w:rFonts w:ascii="Times New Roman" w:hAnsi="Times New Roman"/>
+          <w:b w:val="0"/>
+          <w:i w:val="0"/>
+          <w:sz w:val="24"/>
+        </w:rPr>
+        <w:t xml:space="preserve">•  </w:t>
+      </w:r>
+      <w:r>
+        <w:rPr>
+          <w:rFonts w:ascii="Times New Roman" w:hAnsi="Times New Roman"/>
+          <w:b/>
+          <w:i w:val="0"/>
+          <w:sz w:val="24"/>
+        </w:rPr>
+        <w:t>Your focus area:</w:t>
+      </w:r>
+      <w:r>
+        <w:rPr>
+          <w:rFonts w:ascii="Times New Roman" w:hAnsi="Times New Roman"/>
+          <w:b w:val="0"/>
+          <w:i w:val="0"/>
+          <w:sz w:val="24"/>
+        </w:rPr>
+        <w:t xml:space="preserve"> three of your four misses across all the quizzes were composition and inverses (Graded Quiz 3 Q3 and Q8, Self-Quiz 2 Q2). For g ∘ f, write g(   ) first and put the whole f(x) inside. For an inverse, swap x and y, then undo each step in reverse with the opposite operation. The domain of f⁻¹ is the range of f.</w:t>
       </w:r>
     </w:p>
     <w:p>

</xml_diff>